<commit_message>
Actualizar imagen corporativa de fisabio y del servicio de estadística
</commit_message>
<xml_diff>
--- a/inst/rmarkdown/templates/docx/resources/template_fisabio.docx
+++ b/inst/rmarkdown/templates/docx/resources/template_fisabio.docx
@@ -1,6 +1,6 @@
 
 <file path=word/document.xml><?xml version="1.0" encoding="utf-8"?>
-<w:document xmlns:o="urn:schemas-microsoft-com:office:office" xmlns:r="http://schemas.openxmlformats.org/officeDocument/2006/relationships" xmlns:v="urn:schemas-microsoft-com:vml" xmlns:w="http://schemas.openxmlformats.org/wordprocessingml/2006/main" xmlns:w10="urn:schemas-microsoft-com:office:word" xmlns:wp="http://schemas.openxmlformats.org/drawingml/2006/wordprocessingDrawing" xmlns:wps="http://schemas.microsoft.com/office/word/2010/wordprocessingShape" xmlns:wpg="http://schemas.microsoft.com/office/word/2010/wordprocessingGroup" xmlns:mc="http://schemas.openxmlformats.org/markup-compatibility/2006" xmlns:wp14="http://schemas.microsoft.com/office/word/2010/wordprocessingDrawing" xmlns:w14="http://schemas.microsoft.com/office/word/2010/wordml" xmlns:w15="http://schemas.microsoft.com/office/word/2012/wordml" mc:Ignorable="w14 wp14 w15">
+<w:document xmlns:o="urn:schemas-microsoft-com:office:office" xmlns:r="http://schemas.openxmlformats.org/officeDocument/2006/relationships" xmlns:v="urn:schemas-microsoft-com:vml" xmlns:w="http://schemas.openxmlformats.org/wordprocessingml/2006/main" xmlns:w10="urn:schemas-microsoft-com:office:word" xmlns:wp="http://schemas.openxmlformats.org/drawingml/2006/wordprocessingDrawing" xmlns:pic="http://schemas.openxmlformats.org/drawingml/2006/picture" xmlns:wps="http://schemas.microsoft.com/office/word/2010/wordprocessingShape" xmlns:wpg="http://schemas.microsoft.com/office/word/2010/wordprocessingGroup" xmlns:mc="http://schemas.openxmlformats.org/markup-compatibility/2006" xmlns:wp14="http://schemas.microsoft.com/office/word/2010/wordprocessingDrawing" xmlns:w14="http://schemas.microsoft.com/office/word/2010/wordml" xmlns:w15="http://schemas.microsoft.com/office/word/2012/wordml" mc:Ignorable="w14 wp14 w15">
   <w:body>
     <w:p>
       <w:pPr>
@@ -48,8 +48,7 @@
         <w:rPr/>
       </w:r>
       <w:bookmarkStart w:id="0" w:name="_GoBack"/>
-      <w:bookmarkStart w:id="1" w:name="_GoBack"/>
-      <w:bookmarkEnd w:id="1"/>
+      <w:bookmarkEnd w:id="0"/>
       <w:r>
         <w:br w:type="page"/>
       </w:r>
@@ -97,16 +96,16 @@
           <w:lang w:val="es-ES"/>
         </w:rPr>
       </w:pPr>
+      <w:bookmarkStart w:id="1" w:name="_Toc107315154"/>
       <w:bookmarkStart w:id="2" w:name="_Toc107316271"/>
-      <w:bookmarkStart w:id="3" w:name="_Toc107315154"/>
       <w:r>
         <w:rPr>
           <w:lang w:val="es-ES"/>
         </w:rPr>
         <w:t>Table of content</w:t>
       </w:r>
+      <w:bookmarkEnd w:id="1"/>
       <w:bookmarkEnd w:id="2"/>
-      <w:bookmarkEnd w:id="3"/>
     </w:p>
     <w:sdt>
       <w:sdtPr>
@@ -133,18 +132,18 @@
           </w:r>
           <w:r>
             <w:rPr>
+              <w:rStyle w:val="Enlacedelndice"/>
+              <w:vanish w:val="false"/>
               <w:webHidden/>
-              <w:rStyle w:val="IndexLink"/>
-              <w:vanish w:val="false"/>
               <w:lang w:val="es-ES"/>
             </w:rPr>
             <w:instrText xml:space="preserve"> TOC \z \o "1-3" \u \h</w:instrText>
           </w:r>
           <w:r>
             <w:rPr>
+              <w:rStyle w:val="Enlacedelndice"/>
+              <w:vanish w:val="false"/>
               <w:webHidden/>
-              <w:rStyle w:val="IndexLink"/>
-              <w:vanish w:val="false"/>
               <w:lang w:val="es-ES"/>
             </w:rPr>
             <w:fldChar w:fldCharType="separate"/>
@@ -152,16 +151,16 @@
           <w:hyperlink w:anchor="_Toc107315154">
             <w:r>
               <w:rPr>
+                <w:rStyle w:val="Enlacedelndice"/>
+                <w:vanish w:val="false"/>
                 <w:webHidden/>
-                <w:rStyle w:val="IndexLink"/>
-                <w:vanish w:val="false"/>
                 <w:lang w:val="es-ES"/>
               </w:rPr>
               <w:t>1.1.</w:t>
             </w:r>
             <w:r>
               <w:rPr>
-                <w:rStyle w:val="IndexLink"/>
+                <w:rStyle w:val="Enlacedelndice"/>
                 <w:vanish w:val="false"/>
                 <w:lang w:val="es-ES"/>
               </w:rPr>
@@ -189,8 +188,8 @@
             </w:r>
             <w:r>
               <w:rPr>
-                <w:rStyle w:val="IndexLink"/>
-                <w:vanish/>
+                <w:rStyle w:val="Enlacedelndice"/>
+                <w:vanish w:val="false"/>
                 <w:lang w:val="es-ES"/>
               </w:rPr>
               <w:t>2</w:t>
@@ -218,9 +217,9 @@
           <w:hyperlink w:anchor="_Toc107315155">
             <w:r>
               <w:rPr>
+                <w:rStyle w:val="Enlacedelndice"/>
+                <w:vanish w:val="false"/>
                 <w:webHidden/>
-                <w:rStyle w:val="IndexLink"/>
-                <w:vanish w:val="false"/>
                 <w:lang w:val="es-ES"/>
               </w:rPr>
               <w:t>1.2.</w:t>
@@ -248,8 +247,8 @@
             </w:r>
             <w:r>
               <w:rPr>
-                <w:rStyle w:val="IndexLink"/>
-                <w:vanish/>
+                <w:rStyle w:val="Enlacedelndice"/>
+                <w:vanish w:val="false"/>
                 <w:lang w:val="es-ES"/>
               </w:rPr>
               <w:t>2</w:t>
@@ -277,9 +276,9 @@
           <w:hyperlink w:anchor="_Toc107315156">
             <w:r>
               <w:rPr>
+                <w:rStyle w:val="Enlacedelndice"/>
+                <w:vanish w:val="false"/>
                 <w:webHidden/>
-                <w:rStyle w:val="IndexLink"/>
-                <w:vanish w:val="false"/>
                 <w:lang w:val="es-ES"/>
               </w:rPr>
               <w:t>1.3.</w:t>
@@ -307,8 +306,8 @@
             </w:r>
             <w:r>
               <w:rPr>
-                <w:rStyle w:val="IndexLink"/>
-                <w:vanish/>
+                <w:rStyle w:val="Enlacedelndice"/>
+                <w:vanish w:val="false"/>
                 <w:lang w:val="es-ES"/>
               </w:rPr>
               <w:t>2</w:t>
@@ -336,9 +335,9 @@
           <w:hyperlink w:anchor="_Toc107315157">
             <w:r>
               <w:rPr>
+                <w:rStyle w:val="Enlacedelndice"/>
+                <w:vanish w:val="false"/>
                 <w:webHidden/>
-                <w:rStyle w:val="IndexLink"/>
-                <w:vanish w:val="false"/>
                 <w:lang w:val="es-ES"/>
               </w:rPr>
               <w:t>1.4.</w:t>
@@ -366,8 +365,8 @@
             </w:r>
             <w:r>
               <w:rPr>
-                <w:rStyle w:val="IndexLink"/>
-                <w:vanish/>
+                <w:rStyle w:val="Enlacedelndice"/>
+                <w:vanish w:val="false"/>
                 <w:lang w:val="es-ES"/>
               </w:rPr>
               <w:t>3</w:t>
@@ -390,9 +389,9 @@
           <w:hyperlink w:anchor="_Toc107315158">
             <w:r>
               <w:rPr>
+                <w:rStyle w:val="Enlacedelndice"/>
+                <w:vanish w:val="false"/>
                 <w:webHidden/>
-                <w:rStyle w:val="IndexLink"/>
-                <w:vanish w:val="false"/>
                 <w:lang w:val="es-ES"/>
               </w:rPr>
               <w:t>1.4.1.</w:t>
@@ -420,8 +419,8 @@
             </w:r>
             <w:r>
               <w:rPr>
-                <w:rStyle w:val="IndexLink"/>
-                <w:vanish/>
+                <w:rStyle w:val="Enlacedelndice"/>
+                <w:vanish w:val="false"/>
                 <w:lang w:val="es-ES"/>
               </w:rPr>
               <w:t>3</w:t>
@@ -444,9 +443,9 @@
           <w:hyperlink w:anchor="_Toc107315159">
             <w:r>
               <w:rPr>
+                <w:rStyle w:val="Enlacedelndice"/>
+                <w:vanish w:val="false"/>
                 <w:webHidden/>
-                <w:rStyle w:val="IndexLink"/>
-                <w:vanish w:val="false"/>
                 <w:lang w:val="es-ES"/>
               </w:rPr>
               <w:t>1.4.2.</w:t>
@@ -474,8 +473,8 @@
             </w:r>
             <w:r>
               <w:rPr>
-                <w:rStyle w:val="IndexLink"/>
-                <w:vanish/>
+                <w:rStyle w:val="Enlacedelndice"/>
+                <w:vanish w:val="false"/>
                 <w:lang w:val="es-ES"/>
               </w:rPr>
               <w:t>3</w:t>
@@ -498,9 +497,9 @@
           <w:hyperlink w:anchor="_Toc107315160">
             <w:r>
               <w:rPr>
+                <w:rStyle w:val="Enlacedelndice"/>
+                <w:vanish w:val="false"/>
                 <w:webHidden/>
-                <w:rStyle w:val="IndexLink"/>
-                <w:vanish w:val="false"/>
                 <w:lang w:val="es-ES"/>
               </w:rPr>
               <w:t>1.4.3.</w:t>
@@ -528,8 +527,8 @@
             </w:r>
             <w:r>
               <w:rPr>
-                <w:rStyle w:val="IndexLink"/>
-                <w:vanish/>
+                <w:rStyle w:val="Enlacedelndice"/>
+                <w:vanish w:val="false"/>
                 <w:lang w:val="es-ES"/>
               </w:rPr>
               <w:t>5</w:t>
@@ -552,9 +551,9 @@
           <w:hyperlink w:anchor="_Toc107315161">
             <w:r>
               <w:rPr>
+                <w:rStyle w:val="Enlacedelndice"/>
+                <w:vanish w:val="false"/>
                 <w:webHidden/>
-                <w:rStyle w:val="IndexLink"/>
-                <w:vanish w:val="false"/>
                 <w:lang w:val="es-ES"/>
               </w:rPr>
               <w:t>1.4.4.</w:t>
@@ -582,8 +581,8 @@
             </w:r>
             <w:r>
               <w:rPr>
-                <w:rStyle w:val="IndexLink"/>
-                <w:vanish/>
+                <w:rStyle w:val="Enlacedelndice"/>
+                <w:vanish w:val="false"/>
                 <w:lang w:val="es-ES"/>
               </w:rPr>
               <w:t>6</w:t>
@@ -611,9 +610,9 @@
           <w:hyperlink w:anchor="_Toc107315162">
             <w:r>
               <w:rPr>
+                <w:rStyle w:val="Enlacedelndice"/>
+                <w:vanish w:val="false"/>
                 <w:webHidden/>
-                <w:rStyle w:val="IndexLink"/>
-                <w:vanish w:val="false"/>
                 <w:lang w:val="es-ES"/>
               </w:rPr>
               <w:t>1.5.</w:t>
@@ -641,8 +640,8 @@
             </w:r>
             <w:r>
               <w:rPr>
-                <w:rStyle w:val="IndexLink"/>
-                <w:vanish/>
+                <w:rStyle w:val="Enlacedelndice"/>
+                <w:vanish w:val="false"/>
                 <w:lang w:val="es-ES"/>
               </w:rPr>
               <w:t>7</w:t>
@@ -665,9 +664,9 @@
           <w:hyperlink w:anchor="_Toc107315163">
             <w:r>
               <w:rPr>
+                <w:rStyle w:val="Enlacedelndice"/>
+                <w:vanish w:val="false"/>
                 <w:webHidden/>
-                <w:rStyle w:val="IndexLink"/>
-                <w:vanish w:val="false"/>
                 <w:lang w:val="es-ES"/>
               </w:rPr>
               <w:t>1.5.1.</w:t>
@@ -695,8 +694,8 @@
             </w:r>
             <w:r>
               <w:rPr>
-                <w:rStyle w:val="IndexLink"/>
-                <w:vanish/>
+                <w:rStyle w:val="Enlacedelndice"/>
+                <w:vanish w:val="false"/>
                 <w:lang w:val="es-ES"/>
               </w:rPr>
               <w:t>7</w:t>
@@ -719,9 +718,9 @@
           <w:hyperlink w:anchor="_Toc107315164">
             <w:r>
               <w:rPr>
+                <w:rStyle w:val="Enlacedelndice"/>
+                <w:vanish w:val="false"/>
                 <w:webHidden/>
-                <w:rStyle w:val="IndexLink"/>
-                <w:vanish w:val="false"/>
                 <w:lang w:val="es-ES"/>
               </w:rPr>
               <w:t>1.5.2.</w:t>
@@ -749,8 +748,8 @@
             </w:r>
             <w:r>
               <w:rPr>
-                <w:rStyle w:val="IndexLink"/>
-                <w:vanish/>
+                <w:rStyle w:val="Enlacedelndice"/>
+                <w:vanish w:val="false"/>
                 <w:lang w:val="es-ES"/>
               </w:rPr>
               <w:t>7</w:t>
@@ -773,9 +772,9 @@
           <w:hyperlink w:anchor="_Toc107315165">
             <w:r>
               <w:rPr>
+                <w:rStyle w:val="Enlacedelndice"/>
+                <w:vanish w:val="false"/>
                 <w:webHidden/>
-                <w:rStyle w:val="IndexLink"/>
-                <w:vanish w:val="false"/>
                 <w:lang w:val="es-ES"/>
               </w:rPr>
               <w:t>1.5.3.</w:t>
@@ -803,8 +802,8 @@
             </w:r>
             <w:r>
               <w:rPr>
-                <w:rStyle w:val="IndexLink"/>
-                <w:vanish/>
+                <w:rStyle w:val="Enlacedelndice"/>
+                <w:vanish w:val="false"/>
                 <w:lang w:val="es-ES"/>
               </w:rPr>
               <w:t>7</w:t>
@@ -832,9 +831,9 @@
           <w:hyperlink w:anchor="_Toc107315166">
             <w:r>
               <w:rPr>
+                <w:rStyle w:val="Enlacedelndice"/>
+                <w:vanish w:val="false"/>
                 <w:webHidden/>
-                <w:rStyle w:val="IndexLink"/>
-                <w:vanish w:val="false"/>
                 <w:lang w:val="es-ES"/>
               </w:rPr>
               <w:t>1.6.</w:t>
@@ -862,8 +861,8 @@
             </w:r>
             <w:r>
               <w:rPr>
-                <w:rStyle w:val="IndexLink"/>
-                <w:vanish/>
+                <w:rStyle w:val="Enlacedelndice"/>
+                <w:vanish w:val="false"/>
                 <w:lang w:val="es-ES"/>
               </w:rPr>
               <w:t>8</w:t>
@@ -886,9 +885,9 @@
           <w:hyperlink w:anchor="_Toc107315167">
             <w:r>
               <w:rPr>
+                <w:rStyle w:val="Enlacedelndice"/>
+                <w:vanish w:val="false"/>
                 <w:webHidden/>
-                <w:rStyle w:val="IndexLink"/>
-                <w:vanish w:val="false"/>
                 <w:lang w:val="es-ES"/>
               </w:rPr>
               <w:t>1.6.1.</w:t>
@@ -916,8 +915,8 @@
             </w:r>
             <w:r>
               <w:rPr>
-                <w:rStyle w:val="IndexLink"/>
-                <w:vanish/>
+                <w:rStyle w:val="Enlacedelndice"/>
+                <w:vanish w:val="false"/>
                 <w:lang w:val="es-ES"/>
               </w:rPr>
               <w:t>8</w:t>
@@ -940,9 +939,9 @@
           <w:hyperlink w:anchor="_Toc107315168">
             <w:r>
               <w:rPr>
+                <w:rStyle w:val="Enlacedelndice"/>
+                <w:vanish w:val="false"/>
                 <w:webHidden/>
-                <w:rStyle w:val="IndexLink"/>
-                <w:vanish w:val="false"/>
                 <w:lang w:val="es-ES"/>
               </w:rPr>
               <w:t>1.6.2.</w:t>
@@ -970,8 +969,8 @@
             </w:r>
             <w:r>
               <w:rPr>
-                <w:rStyle w:val="IndexLink"/>
-                <w:vanish/>
+                <w:rStyle w:val="Enlacedelndice"/>
+                <w:vanish w:val="false"/>
                 <w:lang w:val="es-ES"/>
               </w:rPr>
               <w:t>8</w:t>
@@ -999,9 +998,9 @@
           <w:hyperlink w:anchor="_Toc107315169">
             <w:r>
               <w:rPr>
+                <w:rStyle w:val="Enlacedelndice"/>
+                <w:vanish w:val="false"/>
                 <w:webHidden/>
-                <w:rStyle w:val="IndexLink"/>
-                <w:vanish w:val="false"/>
                 <w:lang w:val="es-ES"/>
               </w:rPr>
               <w:t>1.7.</w:t>
@@ -1029,8 +1028,8 @@
             </w:r>
             <w:r>
               <w:rPr>
-                <w:rStyle w:val="IndexLink"/>
-                <w:vanish/>
+                <w:rStyle w:val="Enlacedelndice"/>
+                <w:vanish w:val="false"/>
                 <w:lang w:val="es-ES"/>
               </w:rPr>
               <w:t>9</w:t>
@@ -1058,9 +1057,9 @@
           <w:hyperlink w:anchor="_Toc107315170">
             <w:r>
               <w:rPr>
+                <w:rStyle w:val="Enlacedelndice"/>
+                <w:vanish w:val="false"/>
                 <w:webHidden/>
-                <w:rStyle w:val="IndexLink"/>
-                <w:vanish w:val="false"/>
                 <w:lang w:val="es-ES"/>
               </w:rPr>
               <w:t>1.8.</w:t>
@@ -1088,8 +1087,8 @@
             </w:r>
             <w:r>
               <w:rPr>
-                <w:rStyle w:val="IndexLink"/>
-                <w:vanish/>
+                <w:rStyle w:val="Enlacedelndice"/>
+                <w:vanish w:val="false"/>
                 <w:lang w:val="es-ES"/>
               </w:rPr>
               <w:t>10</w:t>
@@ -1117,9 +1116,9 @@
           <w:hyperlink w:anchor="_Toc107315171">
             <w:r>
               <w:rPr>
+                <w:rStyle w:val="Enlacedelndice"/>
+                <w:vanish w:val="false"/>
                 <w:webHidden/>
-                <w:rStyle w:val="IndexLink"/>
-                <w:vanish w:val="false"/>
                 <w:lang w:val="es-ES"/>
               </w:rPr>
               <w:t>1.9.</w:t>
@@ -1147,8 +1146,8 @@
             </w:r>
             <w:r>
               <w:rPr>
-                <w:rStyle w:val="IndexLink"/>
-                <w:vanish/>
+                <w:rStyle w:val="Enlacedelndice"/>
+                <w:vanish w:val="false"/>
                 <w:lang w:val="es-ES"/>
               </w:rPr>
               <w:t>10</w:t>
@@ -1176,9 +1175,9 @@
           <w:hyperlink w:anchor="_Toc107315172">
             <w:r>
               <w:rPr>
+                <w:rStyle w:val="Enlacedelndice"/>
+                <w:vanish w:val="false"/>
                 <w:webHidden/>
-                <w:rStyle w:val="IndexLink"/>
-                <w:vanish w:val="false"/>
                 <w:lang w:val="es-ES"/>
               </w:rPr>
               <w:t>2.</w:t>
@@ -1206,8 +1205,8 @@
             </w:r>
             <w:r>
               <w:rPr>
-                <w:rStyle w:val="IndexLink"/>
-                <w:vanish/>
+                <w:rStyle w:val="Enlacedelndice"/>
+                <w:vanish w:val="false"/>
                 <w:lang w:val="es-ES"/>
               </w:rPr>
               <w:t>10</w:t>
@@ -1221,8 +1220,8 @@
           </w:hyperlink>
           <w:r>
             <w:rPr>
-              <w:rStyle w:val="IndexLink"/>
-              <w:vanish/>
+              <w:rStyle w:val="Enlacedelndice"/>
+              <w:vanish w:val="false"/>
               <w:lang w:val="es-ES"/>
             </w:rPr>
             <w:fldChar w:fldCharType="end"/>
@@ -1251,18 +1250,18 @@
           <w:lang w:val="es-ES"/>
         </w:rPr>
       </w:pPr>
+      <w:bookmarkStart w:id="3" w:name="_Toc107315155"/>
       <w:bookmarkStart w:id="4" w:name="_Toc107316272"/>
-      <w:bookmarkStart w:id="5" w:name="_Toc107315155"/>
-      <w:bookmarkStart w:id="6" w:name="table-of-content"/>
-      <w:bookmarkEnd w:id="6"/>
+      <w:bookmarkStart w:id="5" w:name="table-of-content"/>
+      <w:bookmarkEnd w:id="5"/>
       <w:r>
         <w:rPr>
           <w:lang w:val="es-ES"/>
         </w:rPr>
         <w:t>List of figures</w:t>
       </w:r>
+      <w:bookmarkEnd w:id="3"/>
       <w:bookmarkEnd w:id="4"/>
-      <w:bookmarkEnd w:id="5"/>
     </w:p>
     <w:p>
       <w:pPr>
@@ -1280,7 +1279,7 @@
       </w:r>
       <w:r>
         <w:rPr>
-          <w:rStyle w:val="IndexLink"/>
+          <w:rStyle w:val="Enlacedelndice"/>
           <w:b/>
           <w:lang w:val="es-ES"/>
         </w:rPr>
@@ -1288,7 +1287,7 @@
       </w:r>
       <w:r>
         <w:rPr>
-          <w:rStyle w:val="IndexLink"/>
+          <w:rStyle w:val="Enlacedelndice"/>
           <w:b/>
           <w:lang w:val="es-ES"/>
         </w:rPr>
@@ -1297,7 +1296,7 @@
       <w:hyperlink w:anchor="_Toc107315173">
         <w:r>
           <w:rPr>
-            <w:rStyle w:val="IndexLink"/>
+            <w:rStyle w:val="Enlacedelndice"/>
             <w:b/>
             <w:lang w:val="es-ES"/>
           </w:rPr>
@@ -1305,18 +1304,11 @@
         </w:r>
         <w:r>
           <w:rPr>
-            <w:rStyle w:val="IndexLink"/>
+            <w:rStyle w:val="Enlacedelndice"/>
             <w:vanish w:val="false"/>
             <w:lang w:val="es-ES"/>
           </w:rPr>
           <w:t>: A boxplot</w:t>
-        </w:r>
-        <w:r>
-          <w:rPr>
-            <w:rStyle w:val="IndexLink"/>
-            <w:vanish/>
-            <w:lang w:val="es-ES"/>
-          </w:rPr>
           <w:tab/>
         </w:r>
         <w:r>
@@ -1339,7 +1331,8 @@
         </w:r>
         <w:r>
           <w:rPr>
-            <w:rStyle w:val="IndexLink"/>
+            <w:rStyle w:val="Enlacedelndice"/>
+            <w:vanish/>
             <w:lang w:val="es-ES"/>
           </w:rPr>
           <w:t>8</w:t>
@@ -1366,7 +1359,7 @@
       <w:hyperlink w:anchor="_Toc107315174">
         <w:r>
           <w:rPr>
-            <w:rStyle w:val="IndexLink"/>
+            <w:rStyle w:val="Enlacedelndice"/>
             <w:b/>
             <w:lang w:val="es-ES"/>
           </w:rPr>
@@ -1374,18 +1367,11 @@
         </w:r>
         <w:r>
           <w:rPr>
-            <w:rStyle w:val="IndexLink"/>
+            <w:rStyle w:val="Enlacedelndice"/>
             <w:vanish w:val="false"/>
             <w:lang w:val="es-ES"/>
           </w:rPr>
           <w:t>: What a barplot</w:t>
-        </w:r>
-        <w:r>
-          <w:rPr>
-            <w:rStyle w:val="IndexLink"/>
-            <w:vanish/>
-            <w:lang w:val="es-ES"/>
-          </w:rPr>
           <w:tab/>
         </w:r>
         <w:r>
@@ -1408,7 +1394,8 @@
         </w:r>
         <w:r>
           <w:rPr>
-            <w:rStyle w:val="IndexLink"/>
+            <w:rStyle w:val="Enlacedelndice"/>
+            <w:vanish/>
             <w:lang w:val="es-ES"/>
           </w:rPr>
           <w:t>9</w:t>
@@ -1422,7 +1409,8 @@
       </w:hyperlink>
       <w:r>
         <w:rPr>
-          <w:rStyle w:val="IndexLink"/>
+          <w:rStyle w:val="Enlacedelndice"/>
+          <w:vanish/>
           <w:lang w:val="es-ES"/>
         </w:rPr>
         <w:fldChar w:fldCharType="end"/>
@@ -1449,18 +1437,18 @@
           <w:lang w:val="es-ES"/>
         </w:rPr>
       </w:pPr>
+      <w:bookmarkStart w:id="6" w:name="_Toc107315156"/>
       <w:bookmarkStart w:id="7" w:name="_Toc107316273"/>
-      <w:bookmarkStart w:id="8" w:name="_Toc107315156"/>
-      <w:bookmarkStart w:id="9" w:name="list-of-figures"/>
-      <w:bookmarkEnd w:id="9"/>
+      <w:bookmarkStart w:id="8" w:name="list-of-figures"/>
+      <w:bookmarkEnd w:id="8"/>
       <w:r>
         <w:rPr>
           <w:lang w:val="es-ES"/>
         </w:rPr>
         <w:t>List of tables</w:t>
       </w:r>
+      <w:bookmarkEnd w:id="6"/>
       <w:bookmarkEnd w:id="7"/>
-      <w:bookmarkEnd w:id="8"/>
     </w:p>
     <w:p>
       <w:pPr>
@@ -1480,7 +1468,7 @@
       </w:r>
       <w:r>
         <w:rPr>
-          <w:rStyle w:val="IndexLink"/>
+          <w:rStyle w:val="Enlacedelndice"/>
           <w:b/>
           <w:lang w:val="es-ES"/>
         </w:rPr>
@@ -1488,7 +1476,7 @@
       </w:r>
       <w:r>
         <w:rPr>
-          <w:rStyle w:val="IndexLink"/>
+          <w:rStyle w:val="Enlacedelndice"/>
           <w:b/>
           <w:lang w:val="es-ES"/>
         </w:rPr>
@@ -1497,7 +1485,7 @@
       <w:hyperlink w:anchor="_Toc107315175">
         <w:r>
           <w:rPr>
-            <w:rStyle w:val="IndexLink"/>
+            <w:rStyle w:val="Enlacedelndice"/>
             <w:b/>
             <w:lang w:val="es-ES"/>
           </w:rPr>
@@ -1505,18 +1493,11 @@
         </w:r>
         <w:r>
           <w:rPr>
-            <w:rStyle w:val="IndexLink"/>
+            <w:rStyle w:val="Enlacedelndice"/>
             <w:vanish w:val="false"/>
             <w:lang w:val="es-ES"/>
           </w:rPr>
           <w:t>: caption 1</w:t>
-        </w:r>
-        <w:r>
-          <w:rPr>
-            <w:rStyle w:val="IndexLink"/>
-            <w:vanish/>
-            <w:lang w:val="es-ES"/>
-          </w:rPr>
           <w:tab/>
         </w:r>
         <w:r>
@@ -1539,7 +1520,8 @@
         </w:r>
         <w:r>
           <w:rPr>
-            <w:rStyle w:val="IndexLink"/>
+            <w:rStyle w:val="Enlacedelndice"/>
+            <w:vanish/>
             <w:lang w:val="es-ES"/>
           </w:rPr>
           <w:t>7</w:t>
@@ -1568,7 +1550,7 @@
       <w:hyperlink w:anchor="_Toc107315176">
         <w:r>
           <w:rPr>
-            <w:rStyle w:val="IndexLink"/>
+            <w:rStyle w:val="Enlacedelndice"/>
             <w:b/>
             <w:lang w:val="es-ES"/>
           </w:rPr>
@@ -1576,18 +1558,11 @@
         </w:r>
         <w:r>
           <w:rPr>
-            <w:rStyle w:val="IndexLink"/>
+            <w:rStyle w:val="Enlacedelndice"/>
             <w:vanish w:val="false"/>
             <w:lang w:val="es-ES"/>
           </w:rPr>
           <w:t>: iris</w:t>
-        </w:r>
-        <w:r>
-          <w:rPr>
-            <w:rStyle w:val="IndexLink"/>
-            <w:vanish/>
-            <w:lang w:val="es-ES"/>
-          </w:rPr>
           <w:tab/>
         </w:r>
         <w:r>
@@ -1610,7 +1585,8 @@
         </w:r>
         <w:r>
           <w:rPr>
-            <w:rStyle w:val="IndexLink"/>
+            <w:rStyle w:val="Enlacedelndice"/>
+            <w:vanish/>
             <w:lang w:val="es-ES"/>
           </w:rPr>
           <w:t>7</w:t>
@@ -1639,7 +1615,7 @@
       <w:hyperlink w:anchor="_Toc107315177">
         <w:r>
           <w:rPr>
-            <w:rStyle w:val="IndexLink"/>
+            <w:rStyle w:val="Enlacedelndice"/>
             <w:b/>
             <w:lang w:val="es-ES"/>
           </w:rPr>
@@ -1647,18 +1623,11 @@
         </w:r>
         <w:r>
           <w:rPr>
-            <w:rStyle w:val="IndexLink"/>
+            <w:rStyle w:val="Enlacedelndice"/>
             <w:vanish w:val="false"/>
             <w:lang w:val="es-ES"/>
           </w:rPr>
           <w:t>: cars</w:t>
-        </w:r>
-        <w:r>
-          <w:rPr>
-            <w:rStyle w:val="IndexLink"/>
-            <w:vanish/>
-            <w:lang w:val="es-ES"/>
-          </w:rPr>
           <w:tab/>
         </w:r>
         <w:r>
@@ -1681,7 +1650,8 @@
         </w:r>
         <w:r>
           <w:rPr>
-            <w:rStyle w:val="IndexLink"/>
+            <w:rStyle w:val="Enlacedelndice"/>
+            <w:vanish/>
             <w:lang w:val="es-ES"/>
           </w:rPr>
           <w:t>8</w:t>
@@ -1695,7 +1665,8 @@
       </w:hyperlink>
       <w:r>
         <w:rPr>
-          <w:rStyle w:val="IndexLink"/>
+          <w:rStyle w:val="Enlacedelndice"/>
+          <w:vanish/>
           <w:lang w:val="es-ES"/>
         </w:rPr>
         <w:fldChar w:fldCharType="end"/>
@@ -1739,18 +1710,18 @@
           <w:lang w:val="es-ES"/>
         </w:rPr>
       </w:pPr>
+      <w:bookmarkStart w:id="9" w:name="_Toc107315157"/>
       <w:bookmarkStart w:id="10" w:name="_Toc107316274"/>
-      <w:bookmarkStart w:id="11" w:name="_Toc107315157"/>
-      <w:bookmarkStart w:id="12" w:name="list-of-tables"/>
-      <w:bookmarkEnd w:id="12"/>
+      <w:bookmarkStart w:id="11" w:name="list-of-tables"/>
+      <w:bookmarkEnd w:id="11"/>
       <w:r>
         <w:rPr>
           <w:lang w:val="es-ES"/>
         </w:rPr>
         <w:t>Sections</w:t>
       </w:r>
+      <w:bookmarkEnd w:id="9"/>
       <w:bookmarkEnd w:id="10"/>
-      <w:bookmarkEnd w:id="11"/>
     </w:p>
     <w:p>
       <w:pPr>
@@ -1760,16 +1731,16 @@
           <w:lang w:val="es-ES"/>
         </w:rPr>
       </w:pPr>
+      <w:bookmarkStart w:id="12" w:name="_Toc107315158"/>
       <w:bookmarkStart w:id="13" w:name="_Toc107316275"/>
-      <w:bookmarkStart w:id="14" w:name="_Toc107315158"/>
       <w:r>
         <w:rPr>
           <w:lang w:val="es-ES"/>
         </w:rPr>
         <w:t>A two columns section</w:t>
       </w:r>
+      <w:bookmarkEnd w:id="12"/>
       <w:bookmarkEnd w:id="13"/>
-      <w:bookmarkEnd w:id="14"/>
     </w:p>
     <w:p>
       <w:pPr>
@@ -1867,18 +1838,18 @@
           <w:lang w:val="es-ES"/>
         </w:rPr>
       </w:pPr>
+      <w:bookmarkStart w:id="14" w:name="_Toc107315159"/>
       <w:bookmarkStart w:id="15" w:name="_Toc107316276"/>
-      <w:bookmarkStart w:id="16" w:name="_Toc107315159"/>
-      <w:bookmarkStart w:id="17" w:name="a-two-columns-section"/>
-      <w:bookmarkEnd w:id="17"/>
+      <w:bookmarkStart w:id="16" w:name="a-two-columns-section"/>
+      <w:bookmarkEnd w:id="16"/>
       <w:r>
         <w:rPr>
           <w:lang w:val="es-ES"/>
         </w:rPr>
         <w:t>End of two columns section</w:t>
       </w:r>
+      <w:bookmarkEnd w:id="14"/>
       <w:bookmarkEnd w:id="15"/>
-      <w:bookmarkEnd w:id="16"/>
     </w:p>
     <w:p>
       <w:pPr>
@@ -1903,6 +1874,7 @@
     <w:p>
       <w:pPr>
         <w:pStyle w:val="BodyText"/>
+        <w:spacing w:before="0" w:after="240"/>
         <w:rPr/>
       </w:pPr>
       <w:r>
@@ -1940,18 +1912,18 @@
           <w:lang w:val="es-ES"/>
         </w:rPr>
       </w:pPr>
+      <w:bookmarkStart w:id="17" w:name="_Toc107315160"/>
       <w:bookmarkStart w:id="18" w:name="_Toc107316277"/>
-      <w:bookmarkStart w:id="19" w:name="_Toc107315160"/>
-      <w:bookmarkStart w:id="20" w:name="end-of-two-columns-section"/>
-      <w:bookmarkEnd w:id="20"/>
+      <w:bookmarkStart w:id="19" w:name="end-of-two-columns-section"/>
+      <w:bookmarkEnd w:id="19"/>
       <w:r>
         <w:rPr>
           <w:lang w:val="es-ES"/>
         </w:rPr>
         <w:t>Landscape section</w:t>
       </w:r>
+      <w:bookmarkEnd w:id="17"/>
       <w:bookmarkEnd w:id="18"/>
-      <w:bookmarkEnd w:id="19"/>
     </w:p>
     <w:p>
       <w:pPr>
@@ -1983,6 +1955,10 @@
     </w:p>
     <w:p>
       <w:pPr>
+        <w:pStyle w:val="Figurauser"/>
+        <w:rPr>
+          <w:lang w:val="es-ES"/>
+        </w:rPr>
         <w:sectPr>
           <w:headerReference w:type="even" r:id="rId9"/>
           <w:headerReference w:type="default" r:id="rId10"/>
@@ -1999,10 +1975,6 @@
           <w:textDirection w:val="lrTb"/>
           <w:docGrid w:type="default" w:linePitch="100" w:charSpace="0"/>
         </w:sectPr>
-        <w:pStyle w:val="Figura"/>
-        <w:rPr>
-          <w:lang w:val="es-ES"/>
-        </w:rPr>
       </w:pPr>
       <w:r>
         <w:rPr/>
@@ -2010,7 +1982,7 @@
           <wp:inline distT="0" distB="0" distL="0" distR="0">
             <wp:extent cx="4572000" cy="3657600"/>
             <wp:effectExtent l="0" t="0" r="0" b="0"/>
-            <wp:docPr id="3" name="Imagen 1" descr=""/>
+            <wp:docPr id="3" name="Imagen 1"/>
             <wp:cNvGraphicFramePr>
               <a:graphicFrameLocks xmlns:a="http://schemas.openxmlformats.org/drawingml/2006/main" noChangeAspect="1"/>
             </wp:cNvGraphicFramePr>
@@ -2018,7 +1990,7 @@
               <a:graphicData uri="http://schemas.openxmlformats.org/drawingml/2006/picture">
                 <pic:pic xmlns:pic="http://schemas.openxmlformats.org/drawingml/2006/picture">
                   <pic:nvPicPr>
-                    <pic:cNvPr id="3" name="Imagen 1" descr=""/>
+                    <pic:cNvPr id="3" name="Imagen 1"/>
                     <pic:cNvPicPr>
                       <a:picLocks noChangeAspect="1" noChangeArrowheads="1"/>
                     </pic:cNvPicPr>
@@ -2037,6 +2009,7 @@
                     <a:prstGeom prst="rect">
                       <a:avLst/>
                     </a:prstGeom>
+                    <a:noFill/>
                   </pic:spPr>
                 </pic:pic>
               </a:graphicData>
@@ -2053,18 +2026,18 @@
           <w:lang w:val="es-ES"/>
         </w:rPr>
       </w:pPr>
+      <w:bookmarkStart w:id="20" w:name="_Toc107315161"/>
       <w:bookmarkStart w:id="21" w:name="_Toc107316278"/>
-      <w:bookmarkStart w:id="22" w:name="_Toc107315161"/>
-      <w:bookmarkStart w:id="23" w:name="landscape-section"/>
-      <w:bookmarkEnd w:id="23"/>
+      <w:bookmarkStart w:id="22" w:name="landscape-section"/>
+      <w:bookmarkEnd w:id="22"/>
       <w:r>
         <w:rPr>
           <w:lang w:val="es-ES"/>
         </w:rPr>
         <w:t>Normal section</w:t>
       </w:r>
+      <w:bookmarkEnd w:id="20"/>
       <w:bookmarkEnd w:id="21"/>
-      <w:bookmarkEnd w:id="22"/>
     </w:p>
     <w:p>
       <w:pPr>
@@ -3505,20 +3478,20 @@
           <w:lang w:val="es-ES"/>
         </w:rPr>
       </w:pPr>
+      <w:bookmarkStart w:id="23" w:name="_Toc107315162"/>
       <w:bookmarkStart w:id="24" w:name="_Toc107316279"/>
-      <w:bookmarkStart w:id="25" w:name="_Toc107315162"/>
+      <w:bookmarkStart w:id="25" w:name="normal-section"/>
       <w:bookmarkStart w:id="26" w:name="sections"/>
-      <w:bookmarkStart w:id="27" w:name="normal-section"/>
+      <w:bookmarkEnd w:id="25"/>
       <w:bookmarkEnd w:id="26"/>
-      <w:bookmarkEnd w:id="27"/>
       <w:r>
         <w:rPr>
           <w:lang w:val="es-ES"/>
         </w:rPr>
         <w:t>Tables</w:t>
       </w:r>
+      <w:bookmarkEnd w:id="23"/>
       <w:bookmarkEnd w:id="24"/>
-      <w:bookmarkEnd w:id="25"/>
     </w:p>
     <w:p>
       <w:pPr>
@@ -3528,16 +3501,16 @@
           <w:lang w:val="es-ES"/>
         </w:rPr>
       </w:pPr>
+      <w:bookmarkStart w:id="27" w:name="_Toc107315163"/>
       <w:bookmarkStart w:id="28" w:name="_Toc107316280"/>
-      <w:bookmarkStart w:id="29" w:name="_Toc107315163"/>
       <w:r>
         <w:rPr>
           <w:lang w:val="es-ES"/>
         </w:rPr>
         <w:t>Table 1</w:t>
       </w:r>
+      <w:bookmarkEnd w:id="27"/>
       <w:bookmarkEnd w:id="28"/>
-      <w:bookmarkEnd w:id="29"/>
     </w:p>
     <w:p>
       <w:pPr>
@@ -3568,7 +3541,7 @@
           <w:lang w:val="es-ES"/>
         </w:rPr>
       </w:pPr>
-      <w:bookmarkStart w:id="30" w:name="_Toc107315175"/>
+      <w:bookmarkStart w:id="29" w:name="_Toc107315175"/>
       <w:r>
         <w:rPr>
           <w:b/>
@@ -3576,7 +3549,7 @@
         </w:rPr>
         <w:t xml:space="preserve">Table </w:t>
       </w:r>
-      <w:bookmarkStart w:id="31" w:name="mtcars"/>
+      <w:bookmarkStart w:id="30" w:name="mtcars"/>
       <w:r>
         <w:rPr>
           <w:b/>
@@ -3612,14 +3585,14 @@
         </w:rPr>
         <w:fldChar w:fldCharType="end"/>
       </w:r>
-      <w:bookmarkEnd w:id="31"/>
+      <w:bookmarkEnd w:id="30"/>
       <w:r>
         <w:rPr>
           <w:lang w:val="es-ES"/>
         </w:rPr>
         <w:t>: caption 1</w:t>
       </w:r>
-      <w:bookmarkEnd w:id="30"/>
+      <w:bookmarkEnd w:id="29"/>
     </w:p>
     <w:tbl>
       <w:tblPr>
@@ -3634,7 +3607,7 @@
           <w:bottom w:w="0" w:type="dxa"/>
           <w:right w:w="108" w:type="dxa"/>
         </w:tblCellMar>
-        <w:tblLook w:val="0420" w:noHBand="0" w:noVBand="1" w:firstColumn="0" w:lastRow="0" w:lastColumn="0" w:firstRow="1"/>
+        <w:tblLook w:noHBand="0" w:noVBand="1" w:firstColumn="0" w:lastRow="0" w:lastColumn="0" w:firstRow="1" w:val="0420"/>
       </w:tblPr>
       <w:tblGrid>
         <w:gridCol w:w="655"/>
@@ -3647,7 +3620,7 @@
         <w:gridCol w:w="440"/>
         <w:gridCol w:w="526"/>
         <w:gridCol w:w="658"/>
-        <w:gridCol w:w="653"/>
+        <w:gridCol w:w="654"/>
       </w:tblGrid>
       <w:tr>
         <w:trPr>
@@ -3946,7 +3919,7 @@
         </w:tc>
         <w:tc>
           <w:tcPr>
-            <w:tcW w:w="653" w:type="dxa"/>
+            <w:tcW w:w="654" w:type="dxa"/>
             <w:tcBorders/>
             <w:shd w:color="auto" w:fill="auto" w:val="clear"/>
           </w:tcPr>
@@ -4280,7 +4253,7 @@
         </w:tc>
         <w:tc>
           <w:tcPr>
-            <w:tcW w:w="653" w:type="dxa"/>
+            <w:tcW w:w="654" w:type="dxa"/>
             <w:tcBorders>
               <w:bottom w:val="nil"/>
             </w:tcBorders>
@@ -4613,7 +4586,7 @@
         </w:tc>
         <w:tc>
           <w:tcPr>
-            <w:tcW w:w="653" w:type="dxa"/>
+            <w:tcW w:w="654" w:type="dxa"/>
             <w:tcBorders>
               <w:bottom w:val="nil"/>
             </w:tcBorders>
@@ -4948,7 +4921,7 @@
         </w:tc>
         <w:tc>
           <w:tcPr>
-            <w:tcW w:w="653" w:type="dxa"/>
+            <w:tcW w:w="654" w:type="dxa"/>
             <w:tcBorders>
               <w:bottom w:val="nil"/>
             </w:tcBorders>
@@ -5281,7 +5254,7 @@
         </w:tc>
         <w:tc>
           <w:tcPr>
-            <w:tcW w:w="653" w:type="dxa"/>
+            <w:tcW w:w="654" w:type="dxa"/>
             <w:tcBorders>
               <w:bottom w:val="nil"/>
             </w:tcBorders>
@@ -5616,7 +5589,7 @@
         </w:tc>
         <w:tc>
           <w:tcPr>
-            <w:tcW w:w="653" w:type="dxa"/>
+            <w:tcW w:w="654" w:type="dxa"/>
             <w:tcBorders>
               <w:bottom w:val="nil"/>
             </w:tcBorders>
@@ -5929,7 +5902,7 @@
         </w:tc>
         <w:tc>
           <w:tcPr>
-            <w:tcW w:w="653" w:type="dxa"/>
+            <w:tcW w:w="654" w:type="dxa"/>
             <w:tcBorders/>
             <w:shd w:color="auto" w:fill="auto" w:val="clear"/>
           </w:tcPr>
@@ -5965,18 +5938,18 @@
           <w:lang w:val="es-ES"/>
         </w:rPr>
       </w:pPr>
+      <w:bookmarkStart w:id="31" w:name="_Toc107315164"/>
       <w:bookmarkStart w:id="32" w:name="_Toc107316281"/>
-      <w:bookmarkStart w:id="33" w:name="_Toc107315164"/>
-      <w:bookmarkStart w:id="34" w:name="table-1"/>
-      <w:bookmarkEnd w:id="34"/>
+      <w:bookmarkStart w:id="33" w:name="table-1"/>
+      <w:bookmarkEnd w:id="33"/>
       <w:r>
         <w:rPr>
           <w:lang w:val="es-ES"/>
         </w:rPr>
         <w:t>Table 2</w:t>
       </w:r>
+      <w:bookmarkEnd w:id="31"/>
       <w:bookmarkEnd w:id="32"/>
-      <w:bookmarkEnd w:id="33"/>
     </w:p>
     <w:p>
       <w:pPr>
@@ -6007,7 +5980,7 @@
           <w:lang w:val="es-ES"/>
         </w:rPr>
       </w:pPr>
-      <w:bookmarkStart w:id="35" w:name="_Toc107315176"/>
+      <w:bookmarkStart w:id="34" w:name="_Toc107315176"/>
       <w:r>
         <w:rPr>
           <w:b/>
@@ -6056,7 +6029,7 @@
         </w:rPr>
         <w:t>: iris</w:t>
       </w:r>
-      <w:bookmarkEnd w:id="35"/>
+      <w:bookmarkEnd w:id="34"/>
     </w:p>
     <w:tbl>
       <w:tblPr>
@@ -6071,7 +6044,7 @@
           <w:bottom w:w="0" w:type="dxa"/>
           <w:right w:w="108" w:type="dxa"/>
         </w:tblCellMar>
-        <w:tblLook w:val="0420" w:noHBand="0" w:noVBand="1" w:firstColumn="0" w:lastRow="0" w:lastColumn="0" w:firstRow="1"/>
+        <w:tblLook w:noHBand="0" w:noVBand="1" w:firstColumn="0" w:lastRow="0" w:lastColumn="0" w:firstRow="1" w:val="0420"/>
       </w:tblPr>
       <w:tblGrid>
         <w:gridCol w:w="1518"/>
@@ -7154,16 +7127,16 @@
           <w:lang w:val="es-ES"/>
         </w:rPr>
       </w:pPr>
+      <w:bookmarkStart w:id="35" w:name="_Toc107315165"/>
       <w:bookmarkStart w:id="36" w:name="_Toc107316282"/>
-      <w:bookmarkStart w:id="37" w:name="_Toc107315165"/>
       <w:r>
         <w:rPr>
           <w:lang w:val="es-ES"/>
         </w:rPr>
         <w:t>Table 3</w:t>
       </w:r>
+      <w:bookmarkEnd w:id="35"/>
       <w:bookmarkEnd w:id="36"/>
-      <w:bookmarkEnd w:id="37"/>
     </w:p>
     <w:p>
       <w:pPr>
@@ -7194,7 +7167,7 @@
           <w:lang w:val="es-ES"/>
         </w:rPr>
       </w:pPr>
-      <w:bookmarkStart w:id="38" w:name="_Toc107315177"/>
+      <w:bookmarkStart w:id="37" w:name="_Toc107315177"/>
       <w:r>
         <w:rPr>
           <w:b/>
@@ -7202,7 +7175,7 @@
         </w:rPr>
         <w:t xml:space="preserve">Table </w:t>
       </w:r>
-      <w:bookmarkStart w:id="39" w:name="cars"/>
+      <w:bookmarkStart w:id="38" w:name="cars"/>
       <w:r>
         <w:rPr>
           <w:b/>
@@ -7238,14 +7211,14 @@
         </w:rPr>
         <w:fldChar w:fldCharType="end"/>
       </w:r>
-      <w:bookmarkEnd w:id="39"/>
+      <w:bookmarkEnd w:id="38"/>
       <w:r>
         <w:rPr>
           <w:lang w:val="es-ES"/>
         </w:rPr>
         <w:t>: cars</w:t>
       </w:r>
-      <w:bookmarkEnd w:id="38"/>
+      <w:bookmarkEnd w:id="37"/>
     </w:p>
     <w:tbl>
       <w:tblPr>
@@ -7260,11 +7233,11 @@
           <w:bottom w:w="0" w:type="dxa"/>
           <w:right w:w="108" w:type="dxa"/>
         </w:tblCellMar>
-        <w:tblLook w:val="0420" w:noHBand="0" w:noVBand="1" w:firstColumn="0" w:lastRow="0" w:lastColumn="0" w:firstRow="1"/>
+        <w:tblLook w:noHBand="0" w:noVBand="1" w:firstColumn="0" w:lastRow="0" w:lastColumn="0" w:firstRow="1" w:val="0420"/>
       </w:tblPr>
       <w:tblGrid>
         <w:gridCol w:w="814"/>
-        <w:gridCol w:w="586"/>
+        <w:gridCol w:w="587"/>
       </w:tblGrid>
       <w:tr>
         <w:trPr>
@@ -7302,7 +7275,7 @@
         </w:tc>
         <w:tc>
           <w:tcPr>
-            <w:tcW w:w="586" w:type="dxa"/>
+            <w:tcW w:w="587" w:type="dxa"/>
             <w:tcBorders/>
             <w:shd w:color="auto" w:fill="auto" w:val="clear"/>
           </w:tcPr>
@@ -7366,7 +7339,7 @@
         </w:tc>
         <w:tc>
           <w:tcPr>
-            <w:tcW w:w="586" w:type="dxa"/>
+            <w:tcW w:w="587" w:type="dxa"/>
             <w:tcBorders>
               <w:bottom w:val="nil"/>
             </w:tcBorders>
@@ -7429,7 +7402,7 @@
         </w:tc>
         <w:tc>
           <w:tcPr>
-            <w:tcW w:w="586" w:type="dxa"/>
+            <w:tcW w:w="587" w:type="dxa"/>
             <w:tcBorders>
               <w:bottom w:val="nil"/>
             </w:tcBorders>
@@ -7494,7 +7467,7 @@
         </w:tc>
         <w:tc>
           <w:tcPr>
-            <w:tcW w:w="586" w:type="dxa"/>
+            <w:tcW w:w="587" w:type="dxa"/>
             <w:tcBorders>
               <w:bottom w:val="nil"/>
             </w:tcBorders>
@@ -7557,7 +7530,7 @@
         </w:tc>
         <w:tc>
           <w:tcPr>
-            <w:tcW w:w="586" w:type="dxa"/>
+            <w:tcW w:w="587" w:type="dxa"/>
             <w:tcBorders>
               <w:bottom w:val="nil"/>
             </w:tcBorders>
@@ -7622,7 +7595,7 @@
         </w:tc>
         <w:tc>
           <w:tcPr>
-            <w:tcW w:w="586" w:type="dxa"/>
+            <w:tcW w:w="587" w:type="dxa"/>
             <w:tcBorders>
               <w:bottom w:val="nil"/>
             </w:tcBorders>
@@ -7683,7 +7656,7 @@
         </w:tc>
         <w:tc>
           <w:tcPr>
-            <w:tcW w:w="586" w:type="dxa"/>
+            <w:tcW w:w="587" w:type="dxa"/>
             <w:tcBorders/>
             <w:shd w:color="auto" w:fill="auto" w:val="clear"/>
           </w:tcPr>
@@ -7719,18 +7692,18 @@
           <w:lang w:val="es-ES"/>
         </w:rPr>
       </w:pPr>
+      <w:bookmarkStart w:id="39" w:name="_Toc107315166"/>
       <w:bookmarkStart w:id="40" w:name="_Toc107316283"/>
-      <w:bookmarkStart w:id="41" w:name="_Toc107315166"/>
-      <w:bookmarkStart w:id="42" w:name="tables"/>
-      <w:bookmarkEnd w:id="42"/>
+      <w:bookmarkStart w:id="41" w:name="tables"/>
+      <w:bookmarkEnd w:id="41"/>
       <w:r>
         <w:rPr>
           <w:lang w:val="es-ES"/>
         </w:rPr>
         <w:t>figures</w:t>
       </w:r>
+      <w:bookmarkEnd w:id="39"/>
       <w:bookmarkEnd w:id="40"/>
-      <w:bookmarkEnd w:id="41"/>
     </w:p>
     <w:p>
       <w:pPr>
@@ -7740,16 +7713,16 @@
           <w:lang w:val="es-ES"/>
         </w:rPr>
       </w:pPr>
+      <w:bookmarkStart w:id="42" w:name="_Toc107315167"/>
       <w:bookmarkStart w:id="43" w:name="_Toc107316284"/>
-      <w:bookmarkStart w:id="44" w:name="_Toc107315167"/>
       <w:r>
         <w:rPr>
           <w:lang w:val="es-ES"/>
         </w:rPr>
         <w:t>A boxplot</w:t>
       </w:r>
+      <w:bookmarkEnd w:id="42"/>
       <w:bookmarkEnd w:id="43"/>
-      <w:bookmarkEnd w:id="44"/>
     </w:p>
     <w:p>
       <w:pPr>
@@ -7803,7 +7776,7 @@
     </w:p>
     <w:p>
       <w:pPr>
-        <w:pStyle w:val="Figura"/>
+        <w:pStyle w:val="Figurauser"/>
         <w:rPr>
           <w:lang w:val="es-ES"/>
         </w:rPr>
@@ -7814,7 +7787,7 @@
           <wp:inline distT="0" distB="0" distL="0" distR="0">
             <wp:extent cx="4572000" cy="3657600"/>
             <wp:effectExtent l="0" t="0" r="0" b="0"/>
-            <wp:docPr id="7" name="Imagen 3" descr=""/>
+            <wp:docPr id="7" name="Imagen 3"/>
             <wp:cNvGraphicFramePr>
               <a:graphicFrameLocks xmlns:a="http://schemas.openxmlformats.org/drawingml/2006/main" noChangeAspect="1"/>
             </wp:cNvGraphicFramePr>
@@ -7822,7 +7795,7 @@
               <a:graphicData uri="http://schemas.openxmlformats.org/drawingml/2006/picture">
                 <pic:pic xmlns:pic="http://schemas.openxmlformats.org/drawingml/2006/picture">
                   <pic:nvPicPr>
-                    <pic:cNvPr id="7" name="Imagen 3" descr=""/>
+                    <pic:cNvPr id="7" name="Imagen 3"/>
                     <pic:cNvPicPr>
                       <a:picLocks noChangeAspect="1" noChangeArrowheads="1"/>
                     </pic:cNvPicPr>
@@ -7841,6 +7814,7 @@
                     <a:prstGeom prst="rect">
                       <a:avLst/>
                     </a:prstGeom>
+                    <a:noFill/>
                   </pic:spPr>
                 </pic:pic>
               </a:graphicData>
@@ -7856,7 +7830,7 @@
           <w:lang w:val="es-ES"/>
         </w:rPr>
       </w:pPr>
-      <w:bookmarkStart w:id="45" w:name="_Toc107315173"/>
+      <w:bookmarkStart w:id="44" w:name="_Toc107315173"/>
       <w:r>
         <w:rPr>
           <w:b/>
@@ -7864,7 +7838,7 @@
         </w:rPr>
         <w:t xml:space="preserve">Figure </w:t>
       </w:r>
-      <w:bookmarkStart w:id="46" w:name="boxplot"/>
+      <w:bookmarkStart w:id="45" w:name="boxplot"/>
       <w:r>
         <w:rPr>
           <w:b/>
@@ -7900,14 +7874,14 @@
         </w:rPr>
         <w:fldChar w:fldCharType="end"/>
       </w:r>
-      <w:bookmarkEnd w:id="46"/>
+      <w:bookmarkEnd w:id="45"/>
       <w:r>
         <w:rPr>
           <w:lang w:val="es-ES"/>
         </w:rPr>
         <w:t>: A boxplot</w:t>
       </w:r>
-      <w:bookmarkEnd w:id="45"/>
+      <w:bookmarkEnd w:id="44"/>
     </w:p>
     <w:p>
       <w:pPr>
@@ -7917,18 +7891,18 @@
           <w:lang w:val="es-ES"/>
         </w:rPr>
       </w:pPr>
+      <w:bookmarkStart w:id="46" w:name="_Toc107315168"/>
       <w:bookmarkStart w:id="47" w:name="_Toc107316285"/>
-      <w:bookmarkStart w:id="48" w:name="_Toc107315168"/>
-      <w:bookmarkStart w:id="49" w:name="a-boxplot"/>
-      <w:bookmarkEnd w:id="49"/>
+      <w:bookmarkStart w:id="48" w:name="a-boxplot"/>
+      <w:bookmarkEnd w:id="48"/>
       <w:r>
         <w:rPr>
           <w:lang w:val="es-ES"/>
         </w:rPr>
         <w:t>A barplot</w:t>
       </w:r>
+      <w:bookmarkEnd w:id="46"/>
       <w:bookmarkEnd w:id="47"/>
-      <w:bookmarkEnd w:id="48"/>
     </w:p>
     <w:p>
       <w:pPr>
@@ -7982,7 +7956,7 @@
     </w:p>
     <w:p>
       <w:pPr>
-        <w:pStyle w:val="Figura"/>
+        <w:pStyle w:val="Figurauser"/>
         <w:rPr>
           <w:lang w:val="es-ES"/>
         </w:rPr>
@@ -7993,7 +7967,7 @@
           <wp:inline distT="0" distB="0" distL="0" distR="0">
             <wp:extent cx="4572000" cy="3657600"/>
             <wp:effectExtent l="0" t="0" r="0" b="0"/>
-            <wp:docPr id="8" name="Imagen 5" descr=""/>
+            <wp:docPr id="8" name="Imagen 5"/>
             <wp:cNvGraphicFramePr>
               <a:graphicFrameLocks xmlns:a="http://schemas.openxmlformats.org/drawingml/2006/main" noChangeAspect="1"/>
             </wp:cNvGraphicFramePr>
@@ -8001,7 +7975,7 @@
               <a:graphicData uri="http://schemas.openxmlformats.org/drawingml/2006/picture">
                 <pic:pic xmlns:pic="http://schemas.openxmlformats.org/drawingml/2006/picture">
                   <pic:nvPicPr>
-                    <pic:cNvPr id="8" name="Imagen 5" descr=""/>
+                    <pic:cNvPr id="8" name="Imagen 5"/>
                     <pic:cNvPicPr>
                       <a:picLocks noChangeAspect="1" noChangeArrowheads="1"/>
                     </pic:cNvPicPr>
@@ -8020,6 +7994,7 @@
                     <a:prstGeom prst="rect">
                       <a:avLst/>
                     </a:prstGeom>
+                    <a:noFill/>
                   </pic:spPr>
                 </pic:pic>
               </a:graphicData>
@@ -8035,7 +8010,7 @@
           <w:lang w:val="es-ES"/>
         </w:rPr>
       </w:pPr>
-      <w:bookmarkStart w:id="50" w:name="_Toc107315174"/>
+      <w:bookmarkStart w:id="49" w:name="_Toc107315174"/>
       <w:r>
         <w:rPr>
           <w:b/>
@@ -8043,7 +8018,7 @@
         </w:rPr>
         <w:t xml:space="preserve">Figure </w:t>
       </w:r>
-      <w:bookmarkStart w:id="51" w:name="barplot"/>
+      <w:bookmarkStart w:id="50" w:name="barplot"/>
       <w:r>
         <w:rPr>
           <w:b/>
@@ -8079,14 +8054,14 @@
         </w:rPr>
         <w:fldChar w:fldCharType="end"/>
       </w:r>
-      <w:bookmarkEnd w:id="51"/>
+      <w:bookmarkEnd w:id="50"/>
       <w:r>
         <w:rPr>
           <w:lang w:val="es-ES"/>
         </w:rPr>
         <w:t>: What a barplot</w:t>
       </w:r>
-      <w:bookmarkEnd w:id="50"/>
+      <w:bookmarkEnd w:id="49"/>
     </w:p>
     <w:p>
       <w:pPr>
@@ -8096,18 +8071,18 @@
           <w:lang w:val="es-ES"/>
         </w:rPr>
       </w:pPr>
+      <w:bookmarkStart w:id="51" w:name="_Toc107315169"/>
       <w:bookmarkStart w:id="52" w:name="_Toc107316286"/>
-      <w:bookmarkStart w:id="53" w:name="_Toc107315169"/>
-      <w:bookmarkStart w:id="54" w:name="a-barplot"/>
-      <w:bookmarkEnd w:id="54"/>
+      <w:bookmarkStart w:id="53" w:name="a-barplot"/>
+      <w:bookmarkEnd w:id="53"/>
       <w:r>
         <w:rPr>
           <w:lang w:val="es-ES"/>
         </w:rPr>
         <w:t>Lists</w:t>
       </w:r>
+      <w:bookmarkEnd w:id="51"/>
       <w:bookmarkEnd w:id="52"/>
-      <w:bookmarkEnd w:id="53"/>
     </w:p>
     <w:p>
       <w:pPr>
@@ -8142,31 +8117,113 @@
         <w:pStyle w:val="Compact"/>
         <w:numPr>
           <w:ilvl w:val="1"/>
+          <w:numId w:val="2"/>
+        </w:numPr>
+        <w:rPr/>
+      </w:pPr>
+      <w:r>
+        <w:rPr/>
+        <w:t>A adipiscing per ultricies justo tellus lorem.</w:t>
+      </w:r>
+    </w:p>
+    <w:p>
+      <w:pPr>
+        <w:pStyle w:val="Compact"/>
+        <w:numPr>
+          <w:ilvl w:val="2"/>
+          <w:numId w:val="2"/>
+        </w:numPr>
+        <w:rPr>
+          <w:lang w:val="es-ES"/>
+        </w:rPr>
+      </w:pPr>
+      <w:r>
+        <w:rPr>
+          <w:lang w:val="es-ES"/>
+        </w:rPr>
+        <w:t>Imperdiet ut dui primis, sed gravida, at sed nulla.</w:t>
+      </w:r>
+    </w:p>
+    <w:p>
+      <w:pPr>
+        <w:pStyle w:val="Compact"/>
+        <w:numPr>
+          <w:ilvl w:val="2"/>
+          <w:numId w:val="2"/>
+        </w:numPr>
+        <w:rPr>
+          <w:lang w:val="es-ES"/>
+        </w:rPr>
+      </w:pPr>
+      <w:r>
+        <w:rPr>
+          <w:lang w:val="es-ES"/>
+        </w:rPr>
+        <w:t>Sem posuere lacus consequat inceptos dapibus duis malesuada finibus.</w:t>
+      </w:r>
+    </w:p>
+    <w:p>
+      <w:pPr>
+        <w:pStyle w:val="Compact"/>
+        <w:numPr>
+          <w:ilvl w:val="1"/>
+          <w:numId w:val="2"/>
+        </w:numPr>
+        <w:rPr>
+          <w:lang w:val="es-ES"/>
+        </w:rPr>
+      </w:pPr>
+      <w:r>
+        <w:rPr>
+          <w:lang w:val="es-ES"/>
+        </w:rPr>
+        <w:t>Urna sed dui, ornare, eu turpis mus pellentesque amet amet bibendum.</w:t>
+      </w:r>
+    </w:p>
+    <w:p>
+      <w:pPr>
+        <w:pStyle w:val="Compact"/>
+        <w:numPr>
+          <w:ilvl w:val="0"/>
+          <w:numId w:val="2"/>
+        </w:numPr>
+        <w:rPr>
+          <w:lang w:val="es-ES"/>
+        </w:rPr>
+      </w:pPr>
+      <w:r>
+        <w:rPr>
+          <w:lang w:val="es-ES"/>
+        </w:rPr>
+        <w:t>Himenaeos tincidunt, auctor dapibus scelerisque, montes nunc faucibus sodales malesuada ridiculus sed cubilia ligula.</w:t>
+      </w:r>
+    </w:p>
+    <w:p>
+      <w:pPr>
+        <w:pStyle w:val="Compact"/>
+        <w:numPr>
+          <w:ilvl w:val="0"/>
           <w:numId w:val="27"/>
         </w:numPr>
         <w:rPr/>
       </w:pPr>
       <w:r>
         <w:rPr/>
-        <w:t>A adipiscing per ultricies justo tellus lorem.</w:t>
+        <w:t>Erat mauris egestas finibus tincidunt sed in rhoncus a tellus etiam.</w:t>
       </w:r>
     </w:p>
     <w:p>
       <w:pPr>
         <w:pStyle w:val="Compact"/>
         <w:numPr>
-          <w:ilvl w:val="2"/>
+          <w:ilvl w:val="1"/>
           <w:numId w:val="28"/>
         </w:numPr>
-        <w:rPr>
-          <w:lang w:val="es-ES"/>
-        </w:rPr>
-      </w:pPr>
-      <w:r>
-        <w:rPr>
-          <w:lang w:val="es-ES"/>
-        </w:rPr>
-        <w:t>Imperdiet ut dui primis, sed gravida, at sed nulla.</w:t>
+        <w:rPr/>
+      </w:pPr>
+      <w:r>
+        <w:rPr/>
+        <w:t>A adipiscing per ultricies justo tellus lorem.</w:t>
       </w:r>
     </w:p>
     <w:p>
@@ -8184,6 +8241,24 @@
         <w:rPr>
           <w:lang w:val="es-ES"/>
         </w:rPr>
+        <w:t>Imperdiet ut dui primis, sed gravida, at sed nulla.</w:t>
+      </w:r>
+    </w:p>
+    <w:p>
+      <w:pPr>
+        <w:pStyle w:val="Compact"/>
+        <w:numPr>
+          <w:ilvl w:val="2"/>
+          <w:numId w:val="7"/>
+        </w:numPr>
+        <w:rPr>
+          <w:lang w:val="es-ES"/>
+        </w:rPr>
+      </w:pPr>
+      <w:r>
+        <w:rPr>
+          <w:lang w:val="es-ES"/>
+        </w:rPr>
         <w:t>Sem posuere lacus consequat inceptos dapibus duis malesuada finibus.</w:t>
       </w:r>
     </w:p>
@@ -8192,7 +8267,7 @@
         <w:pStyle w:val="Compact"/>
         <w:numPr>
           <w:ilvl w:val="1"/>
-          <w:numId w:val="30"/>
+          <w:numId w:val="7"/>
         </w:numPr>
         <w:rPr>
           <w:lang w:val="es-ES"/>
@@ -8203,6 +8278,38 @@
           <w:lang w:val="es-ES"/>
         </w:rPr>
         <w:t>Urna sed dui, ornare, eu turpis mus pellentesque amet amet bibendum.</w:t>
+      </w:r>
+    </w:p>
+    <w:p>
+      <w:pPr>
+        <w:pStyle w:val="Compact"/>
+        <w:numPr>
+          <w:ilvl w:val="0"/>
+          <w:numId w:val="7"/>
+        </w:numPr>
+        <w:rPr>
+          <w:lang w:val="es-ES"/>
+        </w:rPr>
+      </w:pPr>
+      <w:r>
+        <w:rPr>
+          <w:lang w:val="es-ES"/>
+        </w:rPr>
+        <w:t>Himenaeos tincidunt, auctor dapibus scelerisque, montes nunc faucibus sodales malesuada ridiculus sed cubilia ligula.</w:t>
+      </w:r>
+    </w:p>
+    <w:p>
+      <w:pPr>
+        <w:pStyle w:val="FirstParagraph"/>
+        <w:rPr>
+          <w:lang w:val="es-ES"/>
+        </w:rPr>
+      </w:pPr>
+      <w:r>
+        <w:rPr>
+          <w:lang w:val="es-ES"/>
+        </w:rPr>
+        <w:t>Lorem dolor interdum orci eros pellentesque semper tristique, sodales, et sed ut! Porta mattis natoque et. Ac facilisi ipsum viverra elementum vestibulum ligula amet enim magnis luctus ullamcorper. Rhoncus rhoncus elit in at nisl. Tincidunt habitant sit.</w:t>
       </w:r>
     </w:p>
     <w:p>
@@ -8212,15 +8319,79 @@
           <w:ilvl w:val="0"/>
           <w:numId w:val="2"/>
         </w:numPr>
-        <w:rPr>
-          <w:lang w:val="es-ES"/>
-        </w:rPr>
-      </w:pPr>
-      <w:r>
-        <w:rPr>
-          <w:lang w:val="es-ES"/>
-        </w:rPr>
-        <w:t>Himenaeos tincidunt, auctor dapibus scelerisque, montes nunc faucibus sodales malesuada ridiculus sed cubilia ligula.</w:t>
+        <w:rPr/>
+      </w:pPr>
+      <w:r>
+        <w:rPr/>
+        <w:t>Aptent conubia quam montes id sagittis.</w:t>
+      </w:r>
+    </w:p>
+    <w:p>
+      <w:pPr>
+        <w:pStyle w:val="Compact"/>
+        <w:numPr>
+          <w:ilvl w:val="1"/>
+          <w:numId w:val="2"/>
+        </w:numPr>
+        <w:rPr>
+          <w:lang w:val="es-ES"/>
+        </w:rPr>
+      </w:pPr>
+      <w:r>
+        <w:rPr>
+          <w:lang w:val="es-ES"/>
+        </w:rPr>
+        <w:t>Mattis nisi nascetur, aliquam duis ex, tristique.</w:t>
+      </w:r>
+    </w:p>
+    <w:p>
+      <w:pPr>
+        <w:pStyle w:val="Compact"/>
+        <w:numPr>
+          <w:ilvl w:val="2"/>
+          <w:numId w:val="2"/>
+        </w:numPr>
+        <w:rPr>
+          <w:lang w:val="es-ES"/>
+        </w:rPr>
+      </w:pPr>
+      <w:r>
+        <w:rPr>
+          <w:lang w:val="es-ES"/>
+        </w:rPr>
+        <w:t>Imperdiet ut dui primis, sed gravida, at sed nulla.</w:t>
+      </w:r>
+    </w:p>
+    <w:p>
+      <w:pPr>
+        <w:pStyle w:val="Compact"/>
+        <w:numPr>
+          <w:ilvl w:val="2"/>
+          <w:numId w:val="2"/>
+        </w:numPr>
+        <w:rPr/>
+      </w:pPr>
+      <w:r>
+        <w:rPr/>
+        <w:t>Donec ligula nulla ac. Nisl ac at accumsan sagittis eros felis lobortis amet nec phasellus urna bibendum sapien.</w:t>
+      </w:r>
+    </w:p>
+    <w:p>
+      <w:pPr>
+        <w:pStyle w:val="Compact"/>
+        <w:numPr>
+          <w:ilvl w:val="1"/>
+          <w:numId w:val="2"/>
+        </w:numPr>
+        <w:rPr>
+          <w:lang w:val="es-ES"/>
+        </w:rPr>
+      </w:pPr>
+      <w:r>
+        <w:rPr>
+          <w:lang w:val="es-ES"/>
+        </w:rPr>
+        <w:t>Eu dui ac id, dictum proin consectetur convallis.</w:t>
       </w:r>
     </w:p>
     <w:p>
@@ -8228,81 +8399,17 @@
         <w:pStyle w:val="Compact"/>
         <w:numPr>
           <w:ilvl w:val="0"/>
-          <w:numId w:val="31"/>
+          <w:numId w:val="2"/>
         </w:numPr>
-        <w:rPr/>
-      </w:pPr>
-      <w:r>
-        <w:rPr/>
-        <w:t>Erat mauris egestas finibus tincidunt sed in rhoncus a tellus etiam.</w:t>
-      </w:r>
-    </w:p>
-    <w:p>
-      <w:pPr>
-        <w:pStyle w:val="Compact"/>
-        <w:numPr>
-          <w:ilvl w:val="1"/>
-          <w:numId w:val="32"/>
-        </w:numPr>
-        <w:rPr/>
-      </w:pPr>
-      <w:r>
-        <w:rPr/>
-        <w:t>A adipiscing per ultricies justo tellus lorem.</w:t>
-      </w:r>
-    </w:p>
-    <w:p>
-      <w:pPr>
-        <w:pStyle w:val="Compact"/>
-        <w:numPr>
-          <w:ilvl w:val="2"/>
-          <w:numId w:val="33"/>
-        </w:numPr>
-        <w:rPr>
-          <w:lang w:val="es-ES"/>
-        </w:rPr>
-      </w:pPr>
-      <w:r>
-        <w:rPr>
-          <w:lang w:val="es-ES"/>
-        </w:rPr>
-        <w:t>Imperdiet ut dui primis, sed gravida, at sed nulla.</w:t>
-      </w:r>
-    </w:p>
-    <w:p>
-      <w:pPr>
-        <w:pStyle w:val="Compact"/>
-        <w:numPr>
-          <w:ilvl w:val="2"/>
-          <w:numId w:val="34"/>
-        </w:numPr>
-        <w:rPr>
-          <w:lang w:val="es-ES"/>
-        </w:rPr>
-      </w:pPr>
-      <w:r>
-        <w:rPr>
-          <w:lang w:val="es-ES"/>
-        </w:rPr>
-        <w:t>Sem posuere lacus consequat inceptos dapibus duis malesuada finibus.</w:t>
-      </w:r>
-    </w:p>
-    <w:p>
-      <w:pPr>
-        <w:pStyle w:val="Compact"/>
-        <w:numPr>
-          <w:ilvl w:val="1"/>
-          <w:numId w:val="35"/>
-        </w:numPr>
-        <w:rPr>
-          <w:lang w:val="es-ES"/>
-        </w:rPr>
-      </w:pPr>
-      <w:r>
-        <w:rPr>
-          <w:lang w:val="es-ES"/>
-        </w:rPr>
-        <w:t>Urna sed dui, ornare, eu turpis mus pellentesque amet amet bibendum.</w:t>
+        <w:rPr>
+          <w:lang w:val="es-ES"/>
+        </w:rPr>
+      </w:pPr>
+      <w:r>
+        <w:rPr>
+          <w:lang w:val="es-ES"/>
+        </w:rPr>
+        <w:t>Facilisi eu lectus mauris lorem. Et sed sapien pellentesque sed etiam vehicula.</w:t>
       </w:r>
     </w:p>
     <w:p>
@@ -8310,167 +8417,35 @@
         <w:pStyle w:val="Compact"/>
         <w:numPr>
           <w:ilvl w:val="0"/>
-          <w:numId w:val="36"/>
+          <w:numId w:val="2"/>
         </w:numPr>
-        <w:rPr>
-          <w:lang w:val="es-ES"/>
-        </w:rPr>
-      </w:pPr>
-      <w:r>
-        <w:rPr>
-          <w:lang w:val="es-ES"/>
-        </w:rPr>
-        <w:t>Himenaeos tincidunt, auctor dapibus scelerisque, montes nunc faucibus sodales malesuada ridiculus sed cubilia ligula.</w:t>
+        <w:rPr/>
+      </w:pPr>
+      <w:r>
+        <w:rPr/>
+        <w:t>In porttitor id lorem eu efficitur, nisl dis!</w:t>
       </w:r>
     </w:p>
     <w:p>
       <w:pPr>
-        <w:pStyle w:val="FirstParagraph"/>
-        <w:rPr>
-          <w:lang w:val="es-ES"/>
-        </w:rPr>
-      </w:pPr>
-      <w:r>
-        <w:rPr>
-          <w:lang w:val="es-ES"/>
-        </w:rPr>
-        <w:t>Lorem dolor interdum orci eros pellentesque semper tristique, sodales, et sed ut! Porta mattis natoque et. Ac facilisi ipsum viverra elementum vestibulum ligula amet enim magnis luctus ullamcorper. Rhoncus rhoncus elit in at nisl. Tincidunt habitant sit.</w:t>
-      </w:r>
-    </w:p>
-    <w:p>
-      <w:pPr>
-        <w:pStyle w:val="Compact"/>
-        <w:numPr>
-          <w:ilvl w:val="0"/>
-          <w:numId w:val="37"/>
-        </w:numPr>
-        <w:rPr/>
-      </w:pPr>
-      <w:r>
-        <w:rPr/>
-        <w:t>Aptent conubia quam montes id sagittis.</w:t>
-      </w:r>
-    </w:p>
-    <w:p>
-      <w:pPr>
-        <w:pStyle w:val="Compact"/>
-        <w:numPr>
-          <w:ilvl w:val="1"/>
-          <w:numId w:val="38"/>
-        </w:numPr>
-        <w:rPr>
-          <w:lang w:val="es-ES"/>
-        </w:rPr>
-      </w:pPr>
-      <w:r>
-        <w:rPr>
-          <w:lang w:val="es-ES"/>
-        </w:rPr>
-        <w:t>Mattis nisi nascetur, aliquam duis ex, tristique.</w:t>
-      </w:r>
-    </w:p>
-    <w:p>
-      <w:pPr>
-        <w:pStyle w:val="Compact"/>
-        <w:numPr>
-          <w:ilvl w:val="2"/>
-          <w:numId w:val="39"/>
-        </w:numPr>
-        <w:rPr>
-          <w:lang w:val="es-ES"/>
-        </w:rPr>
-      </w:pPr>
-      <w:r>
-        <w:rPr>
-          <w:lang w:val="es-ES"/>
-        </w:rPr>
-        <w:t>Imperdiet ut dui primis, sed gravida, at sed nulla.</w:t>
-      </w:r>
-    </w:p>
-    <w:p>
-      <w:pPr>
-        <w:pStyle w:val="Compact"/>
-        <w:numPr>
-          <w:ilvl w:val="2"/>
-          <w:numId w:val="40"/>
-        </w:numPr>
-        <w:rPr/>
-      </w:pPr>
-      <w:r>
-        <w:rPr/>
-        <w:t>Donec ligula nulla ac. Nisl ac at accumsan sagittis eros felis lobortis amet nec phasellus urna bibendum sapien.</w:t>
-      </w:r>
-    </w:p>
-    <w:p>
-      <w:pPr>
-        <w:pStyle w:val="Compact"/>
-        <w:numPr>
-          <w:ilvl w:val="1"/>
-          <w:numId w:val="41"/>
-        </w:numPr>
-        <w:rPr>
-          <w:lang w:val="es-ES"/>
-        </w:rPr>
-      </w:pPr>
-      <w:r>
-        <w:rPr>
-          <w:lang w:val="es-ES"/>
-        </w:rPr>
-        <w:t>Eu dui ac id, dictum proin consectetur convallis.</w:t>
-      </w:r>
-    </w:p>
-    <w:p>
-      <w:pPr>
-        <w:pStyle w:val="Compact"/>
-        <w:numPr>
-          <w:ilvl w:val="0"/>
-          <w:numId w:val="42"/>
-        </w:numPr>
-        <w:rPr>
-          <w:lang w:val="es-ES"/>
-        </w:rPr>
-      </w:pPr>
-      <w:r>
-        <w:rPr>
-          <w:lang w:val="es-ES"/>
-        </w:rPr>
-        <w:t>Facilisi eu lectus mauris lorem. Et sed sapien pellentesque sed etiam vehicula.</w:t>
-      </w:r>
-    </w:p>
-    <w:p>
-      <w:pPr>
-        <w:pStyle w:val="Compact"/>
-        <w:numPr>
-          <w:ilvl w:val="0"/>
-          <w:numId w:val="43"/>
-        </w:numPr>
-        <w:rPr/>
-      </w:pPr>
-      <w:r>
-        <w:rPr/>
-        <w:t>In porttitor id lorem eu efficitur, nisl dis!</w:t>
-      </w:r>
-    </w:p>
-    <w:p>
-      <w:pPr>
         <w:pStyle w:val="Heading2"/>
         <w:ind w:hanging="0" w:left="0"/>
         <w:rPr>
           <w:lang w:val="es-ES"/>
         </w:rPr>
       </w:pPr>
+      <w:bookmarkStart w:id="54" w:name="_Toc107315170"/>
       <w:bookmarkStart w:id="55" w:name="_Toc107316287"/>
-      <w:bookmarkStart w:id="56" w:name="_Toc107315170"/>
-      <w:bookmarkStart w:id="57" w:name="lists"/>
-      <w:bookmarkEnd w:id="57"/>
+      <w:bookmarkStart w:id="56" w:name="lists"/>
+      <w:bookmarkEnd w:id="56"/>
       <w:r>
         <w:rPr>
           <w:lang w:val="es-ES"/>
         </w:rPr>
         <w:t>Reference</w:t>
       </w:r>
+      <w:bookmarkEnd w:id="54"/>
       <w:bookmarkEnd w:id="55"/>
-      <w:bookmarkEnd w:id="56"/>
     </w:p>
     <w:p>
       <w:pPr>
@@ -8572,18 +8547,18 @@
           <w:lang w:val="es-ES"/>
         </w:rPr>
       </w:pPr>
+      <w:bookmarkStart w:id="57" w:name="_Toc107315171"/>
       <w:bookmarkStart w:id="58" w:name="_Toc107316288"/>
-      <w:bookmarkStart w:id="59" w:name="_Toc107315171"/>
-      <w:bookmarkStart w:id="60" w:name="reference"/>
-      <w:bookmarkEnd w:id="60"/>
+      <w:bookmarkStart w:id="59" w:name="reference"/>
+      <w:bookmarkEnd w:id="59"/>
       <w:r>
         <w:rPr>
           <w:lang w:val="es-ES"/>
         </w:rPr>
         <w:t>Citas y referencias bibliográficas</w:t>
       </w:r>
+      <w:bookmarkEnd w:id="57"/>
       <w:bookmarkEnd w:id="58"/>
-      <w:bookmarkEnd w:id="59"/>
     </w:p>
     <w:p>
       <w:pPr>
@@ -8617,7 +8592,7 @@
         <w:pStyle w:val="Compact"/>
         <w:numPr>
           <w:ilvl w:val="0"/>
-          <w:numId w:val="44"/>
+          <w:numId w:val="2"/>
         </w:numPr>
         <w:rPr>
           <w:lang w:val="es-ES"/>
@@ -8635,7 +8610,7 @@
         <w:pStyle w:val="Compact"/>
         <w:numPr>
           <w:ilvl w:val="0"/>
-          <w:numId w:val="45"/>
+          <w:numId w:val="2"/>
         </w:numPr>
         <w:rPr>
           <w:lang w:val="es-ES"/>
@@ -8653,7 +8628,7 @@
         <w:pStyle w:val="Compact"/>
         <w:numPr>
           <w:ilvl w:val="0"/>
-          <w:numId w:val="46"/>
+          <w:numId w:val="2"/>
         </w:numPr>
         <w:rPr>
           <w:lang w:val="es-ES"/>
@@ -8671,7 +8646,7 @@
         <w:pStyle w:val="Compact"/>
         <w:numPr>
           <w:ilvl w:val="0"/>
-          <w:numId w:val="47"/>
+          <w:numId w:val="2"/>
         </w:numPr>
         <w:rPr/>
       </w:pPr>
@@ -8699,7 +8674,7 @@
         <w:pStyle w:val="Compact"/>
         <w:numPr>
           <w:ilvl w:val="0"/>
-          <w:numId w:val="48"/>
+          <w:numId w:val="2"/>
         </w:numPr>
         <w:rPr>
           <w:lang w:val="es-ES"/>
@@ -8724,7 +8699,7 @@
         <w:pStyle w:val="Compact"/>
         <w:numPr>
           <w:ilvl w:val="0"/>
-          <w:numId w:val="49"/>
+          <w:numId w:val="2"/>
         </w:numPr>
         <w:rPr>
           <w:lang w:val="es-ES"/>
@@ -8749,7 +8724,7 @@
         <w:pStyle w:val="Compact"/>
         <w:numPr>
           <w:ilvl w:val="0"/>
-          <w:numId w:val="50"/>
+          <w:numId w:val="2"/>
         </w:numPr>
         <w:rPr>
           <w:lang w:val="es-ES"/>
@@ -8777,26 +8752,26 @@
           <w:lang w:val="es-ES"/>
         </w:rPr>
       </w:pPr>
-      <w:bookmarkStart w:id="61" w:name="referencias-bibliográficas"/>
+      <w:bookmarkStart w:id="60" w:name="referencias-bibliográficas"/>
+      <w:bookmarkStart w:id="61" w:name="_Toc107315172"/>
       <w:bookmarkStart w:id="62" w:name="_Toc107316289"/>
-      <w:bookmarkStart w:id="63" w:name="_Toc107315172"/>
-      <w:bookmarkStart w:id="64" w:name="citas-y-referencias-bibliográficas"/>
-      <w:bookmarkEnd w:id="64"/>
+      <w:bookmarkStart w:id="63" w:name="citas-y-referencias-bibliográficas"/>
+      <w:bookmarkEnd w:id="63"/>
       <w:r>
         <w:rPr>
           <w:lang w:val="es-ES"/>
         </w:rPr>
         <w:t>Referencias bibliográficas</w:t>
       </w:r>
+      <w:bookmarkEnd w:id="61"/>
       <w:bookmarkEnd w:id="62"/>
-      <w:bookmarkEnd w:id="63"/>
     </w:p>
     <w:p>
       <w:pPr>
         <w:pStyle w:val="Bibliography"/>
         <w:rPr/>
       </w:pPr>
-      <w:bookmarkStart w:id="65" w:name="refs"/>
+      <w:bookmarkStart w:id="64" w:name="refs"/>
       <w:r>
         <w:rPr>
           <w:lang w:val="es-ES"/>
@@ -8828,8 +8803,8 @@
         <w:pStyle w:val="Bibliography"/>
         <w:rPr/>
       </w:pPr>
-      <w:bookmarkStart w:id="66" w:name="ref-Bivand2013"/>
-      <w:bookmarkEnd w:id="66"/>
+      <w:bookmarkStart w:id="65" w:name="ref-Bivand2013"/>
+      <w:bookmarkEnd w:id="65"/>
       <w:r>
         <w:rPr/>
         <w:t xml:space="preserve">Blangiardo, M., &amp; Cameletti, M. (2015). </w:t>
@@ -8851,8 +8826,8 @@
         <w:pStyle w:val="Bibliography"/>
         <w:rPr/>
       </w:pPr>
-      <w:bookmarkStart w:id="67" w:name="ref-Blangiardo2015"/>
-      <w:bookmarkEnd w:id="67"/>
+      <w:bookmarkStart w:id="66" w:name="ref-Blangiardo2015"/>
+      <w:bookmarkEnd w:id="66"/>
       <w:r>
         <w:rPr/>
         <w:t xml:space="preserve">Chang, W. (2012). </w:t>
@@ -8874,8 +8849,8 @@
         <w:pStyle w:val="Bibliography"/>
         <w:rPr/>
       </w:pPr>
-      <w:bookmarkStart w:id="68" w:name="ref-Chang2012"/>
-      <w:bookmarkEnd w:id="68"/>
+      <w:bookmarkStart w:id="67" w:name="ref-Chang2012"/>
+      <w:bookmarkEnd w:id="67"/>
       <w:r>
         <w:rPr/>
         <w:t xml:space="preserve">Congdon, P. (2014). </w:t>
@@ -8897,8 +8872,8 @@
         <w:pStyle w:val="Bibliography"/>
         <w:rPr/>
       </w:pPr>
-      <w:bookmarkStart w:id="69" w:name="ref-Congdon2014"/>
-      <w:bookmarkEnd w:id="69"/>
+      <w:bookmarkStart w:id="68" w:name="ref-Congdon2014"/>
+      <w:bookmarkEnd w:id="68"/>
       <w:r>
         <w:rPr/>
         <w:t xml:space="preserve">Daniels, M., &amp; Hogan, J. (2008). </w:t>
@@ -8928,8 +8903,8 @@
         <w:pStyle w:val="Bibliography"/>
         <w:rPr/>
       </w:pPr>
-      <w:bookmarkStart w:id="70" w:name="ref-Daniels2008"/>
-      <w:bookmarkEnd w:id="70"/>
+      <w:bookmarkStart w:id="69" w:name="ref-Daniels2008"/>
+      <w:bookmarkEnd w:id="69"/>
       <w:r>
         <w:rPr/>
         <w:t xml:space="preserve">Duda, R. O., Hart, P. E., &amp; Stork, D. G. (2001). </w:t>
@@ -8951,8 +8926,8 @@
         <w:pStyle w:val="Bibliography"/>
         <w:rPr/>
       </w:pPr>
-      <w:bookmarkStart w:id="71" w:name="ref-Duda2001"/>
-      <w:bookmarkEnd w:id="71"/>
+      <w:bookmarkStart w:id="70" w:name="ref-Duda2001"/>
+      <w:bookmarkEnd w:id="70"/>
       <w:r>
         <w:rPr/>
         <w:t xml:space="preserve">Fawcett, T. (2006). An introduction to ROC analysis. </w:t>
@@ -8993,8 +8968,8 @@
         <w:pStyle w:val="Bibliography"/>
         <w:rPr/>
       </w:pPr>
-      <w:bookmarkStart w:id="72" w:name="ref-Fawcett2006"/>
-      <w:bookmarkEnd w:id="72"/>
+      <w:bookmarkStart w:id="71" w:name="ref-Fawcett2006"/>
+      <w:bookmarkEnd w:id="71"/>
       <w:r>
         <w:rPr/>
         <w:t xml:space="preserve">Gelman, A., Carlin, J. B., Stern, H. S., Dunson, D. B., Vehtari, A., &amp; Rubin, D. B. (2014). </w:t>
@@ -9018,8 +8993,8 @@
           <w:lang w:val="es-ES"/>
         </w:rPr>
       </w:pPr>
-      <w:bookmarkStart w:id="73" w:name="ref-Gelman2014"/>
-      <w:bookmarkEnd w:id="73"/>
+      <w:bookmarkStart w:id="72" w:name="ref-Gelman2014"/>
+      <w:bookmarkEnd w:id="72"/>
       <w:r>
         <w:rPr/>
         <w:t xml:space="preserve">Greenland, S., Lash, T. L., &amp; Rothman, K. J. (2008). Concepts of Interaction. In K. J. Rothman, S. Greenland, &amp; T. L. Lash (Eds.), </w:t>
@@ -9047,8 +9022,8 @@
         <w:pStyle w:val="Bibliography"/>
         <w:rPr/>
       </w:pPr>
-      <w:bookmarkStart w:id="74" w:name="ref-Greenland2008"/>
-      <w:bookmarkEnd w:id="74"/>
+      <w:bookmarkStart w:id="73" w:name="ref-Greenland2008"/>
+      <w:bookmarkEnd w:id="73"/>
       <w:r>
         <w:rPr>
           <w:lang w:val="es-ES"/>
@@ -9080,8 +9055,8 @@
         <w:pStyle w:val="Bibliography"/>
         <w:rPr/>
       </w:pPr>
-      <w:bookmarkStart w:id="75" w:name="ref-Harrell2015"/>
-      <w:bookmarkEnd w:id="75"/>
+      <w:bookmarkStart w:id="74" w:name="ref-Harrell2015"/>
+      <w:bookmarkEnd w:id="74"/>
       <w:r>
         <w:rPr/>
         <w:t xml:space="preserve">Lash, T. L., Fox, M. P., MacLehose, R. F., Maldonado, G., McCandless, L. C., &amp; Greenland, S. (2014). Good practices for quantitative bias analysis. </w:t>
@@ -9122,8 +9097,8 @@
         <w:pStyle w:val="Bibliography"/>
         <w:rPr/>
       </w:pPr>
-      <w:bookmarkStart w:id="76" w:name="ref-Lash2014"/>
-      <w:bookmarkEnd w:id="76"/>
+      <w:bookmarkStart w:id="75" w:name="ref-Lash2014"/>
+      <w:bookmarkEnd w:id="75"/>
       <w:r>
         <w:rPr/>
         <w:t xml:space="preserve">Lunn, D. J., Jackson, C., Best, N., Thomas, A., &amp; Spiegelhalter, D. (2012). </w:t>
@@ -9145,8 +9120,8 @@
         <w:pStyle w:val="Bibliography"/>
         <w:rPr/>
       </w:pPr>
-      <w:bookmarkStart w:id="77" w:name="ref-Lunn2012"/>
-      <w:bookmarkEnd w:id="77"/>
+      <w:bookmarkStart w:id="76" w:name="ref-Lunn2012"/>
+      <w:bookmarkEnd w:id="76"/>
       <w:r>
         <w:rPr/>
         <w:t xml:space="preserve">Matloff, N. (2016). </w:t>
@@ -9168,8 +9143,8 @@
         <w:pStyle w:val="Bibliography"/>
         <w:rPr/>
       </w:pPr>
-      <w:bookmarkStart w:id="78" w:name="ref-Matloff2016"/>
-      <w:bookmarkEnd w:id="78"/>
+      <w:bookmarkStart w:id="77" w:name="ref-Matloff2016"/>
+      <w:bookmarkEnd w:id="77"/>
       <w:r>
         <w:rPr/>
         <w:t xml:space="preserve">Rothman, K. J., Greenland, S., &amp; Lash, T. L. (Eds.). (2008). </w:t>
@@ -9192,9 +9167,9 @@
         <w:spacing w:before="0" w:after="240"/>
         <w:rPr/>
       </w:pPr>
-      <w:bookmarkStart w:id="79" w:name="ref-Wickham2015"/>
-      <w:bookmarkStart w:id="80" w:name="ref-Rothman2008"/>
-      <w:bookmarkEnd w:id="80"/>
+      <w:bookmarkStart w:id="78" w:name="ref-Wickham2015"/>
+      <w:bookmarkStart w:id="79" w:name="ref-Rothman2008"/>
+      <w:bookmarkEnd w:id="79"/>
       <w:r>
         <w:rPr/>
         <w:t xml:space="preserve">Wickham, H. (2015). </w:t>
@@ -9210,15 +9185,17 @@
         <w:rPr/>
         <w:t>. CRC.</w:t>
       </w:r>
-      <w:bookmarkEnd w:id="61"/>
-      <w:bookmarkEnd w:id="65"/>
-      <w:bookmarkEnd w:id="79"/>
+      <w:bookmarkEnd w:id="60"/>
+      <w:bookmarkEnd w:id="64"/>
+      <w:bookmarkEnd w:id="78"/>
     </w:p>
     <w:sectPr>
-      <w:headerReference w:type="default" r:id="rId22"/>
-      <w:headerReference w:type="first" r:id="rId23"/>
-      <w:footerReference w:type="default" r:id="rId24"/>
-      <w:footerReference w:type="first" r:id="rId25"/>
+      <w:headerReference w:type="even" r:id="rId22"/>
+      <w:headerReference w:type="default" r:id="rId23"/>
+      <w:headerReference w:type="first" r:id="rId24"/>
+      <w:footerReference w:type="even" r:id="rId25"/>
+      <w:footerReference w:type="default" r:id="rId26"/>
+      <w:footerReference w:type="first" r:id="rId27"/>
       <w:type w:val="nextPage"/>
       <w:pgSz w:w="11952" w:h="16838"/>
       <w:pgMar w:left="1080" w:right="1080" w:gutter="0" w:header="888" w:top="1851" w:footer="662" w:bottom="1800"/>
@@ -9232,14 +9209,14 @@
 </file>
 
 <file path=word/footer1.xml><?xml version="1.0" encoding="utf-8"?>
-<w:ftr xmlns:o="urn:schemas-microsoft-com:office:office" xmlns:r="http://schemas.openxmlformats.org/officeDocument/2006/relationships" xmlns:v="urn:schemas-microsoft-com:vml" xmlns:w="http://schemas.openxmlformats.org/wordprocessingml/2006/main" xmlns:w10="urn:schemas-microsoft-com:office:word" xmlns:wp="http://schemas.openxmlformats.org/drawingml/2006/wordprocessingDrawing" xmlns:wps="http://schemas.microsoft.com/office/word/2010/wordprocessingShape" xmlns:wpg="http://schemas.microsoft.com/office/word/2010/wordprocessingGroup" xmlns:mc="http://schemas.openxmlformats.org/markup-compatibility/2006" xmlns:wp14="http://schemas.microsoft.com/office/word/2010/wordprocessingDrawing" xmlns:w14="http://schemas.microsoft.com/office/word/2010/wordml" xmlns:w15="http://schemas.microsoft.com/office/word/2012/wordml" mc:Ignorable="w14 wp14 w15">
+<w:ftr xmlns:o="urn:schemas-microsoft-com:office:office" xmlns:r="http://schemas.openxmlformats.org/officeDocument/2006/relationships" xmlns:v="urn:schemas-microsoft-com:vml" xmlns:w="http://schemas.openxmlformats.org/wordprocessingml/2006/main" xmlns:w10="urn:schemas-microsoft-com:office:word" xmlns:wp="http://schemas.openxmlformats.org/drawingml/2006/wordprocessingDrawing" xmlns:pic="http://schemas.openxmlformats.org/drawingml/2006/picture" xmlns:wps="http://schemas.microsoft.com/office/word/2010/wordprocessingShape" xmlns:wpg="http://schemas.microsoft.com/office/word/2010/wordprocessingGroup" xmlns:mc="http://schemas.openxmlformats.org/markup-compatibility/2006" xmlns:wp14="http://schemas.microsoft.com/office/word/2010/wordprocessingDrawing" xmlns:w14="http://schemas.microsoft.com/office/word/2010/wordml" xmlns:w15="http://schemas.microsoft.com/office/word/2012/wordml" mc:Ignorable="w14 wp14 w15">
   <w:sdt>
     <w:sdtPr>
+      <w:id w:val="271650880"/>
       <w:docPartObj>
         <w:docPartGallery w:val="Page Numbers (Bottom of Page)"/>
         <w:docPartUnique w:val="true"/>
       </w:docPartObj>
-      <w:id w:val="271650880"/>
     </w:sdtPr>
     <w:sdtContent>
       <w:p>
@@ -9296,14 +9273,14 @@
 </file>
 
 <file path=word/footer2.xml><?xml version="1.0" encoding="utf-8"?>
-<w:ftr xmlns:o="urn:schemas-microsoft-com:office:office" xmlns:r="http://schemas.openxmlformats.org/officeDocument/2006/relationships" xmlns:v="urn:schemas-microsoft-com:vml" xmlns:w="http://schemas.openxmlformats.org/wordprocessingml/2006/main" xmlns:w10="urn:schemas-microsoft-com:office:word" xmlns:wp="http://schemas.openxmlformats.org/drawingml/2006/wordprocessingDrawing" xmlns:wps="http://schemas.microsoft.com/office/word/2010/wordprocessingShape" xmlns:wpg="http://schemas.microsoft.com/office/word/2010/wordprocessingGroup" xmlns:mc="http://schemas.openxmlformats.org/markup-compatibility/2006" xmlns:wp14="http://schemas.microsoft.com/office/word/2010/wordprocessingDrawing" xmlns:w14="http://schemas.microsoft.com/office/word/2010/wordml" xmlns:w15="http://schemas.microsoft.com/office/word/2012/wordml" mc:Ignorable="w14 wp14 w15">
+<w:ftr xmlns:o="urn:schemas-microsoft-com:office:office" xmlns:r="http://schemas.openxmlformats.org/officeDocument/2006/relationships" xmlns:v="urn:schemas-microsoft-com:vml" xmlns:w="http://schemas.openxmlformats.org/wordprocessingml/2006/main" xmlns:w10="urn:schemas-microsoft-com:office:word" xmlns:wp="http://schemas.openxmlformats.org/drawingml/2006/wordprocessingDrawing" xmlns:pic="http://schemas.openxmlformats.org/drawingml/2006/picture" xmlns:wps="http://schemas.microsoft.com/office/word/2010/wordprocessingShape" xmlns:wpg="http://schemas.microsoft.com/office/word/2010/wordprocessingGroup" xmlns:mc="http://schemas.openxmlformats.org/markup-compatibility/2006" xmlns:wp14="http://schemas.microsoft.com/office/word/2010/wordprocessingDrawing" xmlns:w14="http://schemas.microsoft.com/office/word/2010/wordml" xmlns:w15="http://schemas.microsoft.com/office/word/2012/wordml" mc:Ignorable="w14 wp14 w15">
   <w:sdt>
     <w:sdtPr>
+      <w:id w:val="1350708069"/>
       <w:docPartObj>
         <w:docPartGallery w:val="Page Numbers (Bottom of Page)"/>
         <w:docPartUnique w:val="true"/>
       </w:docPartObj>
-      <w:id w:val="1350708069"/>
     </w:sdtPr>
     <w:sdtContent>
       <w:p>
@@ -9355,17 +9332,13 @@
       <w:spacing w:lineRule="auto" w:line="240" w:before="0" w:after="0"/>
       <w:jc w:val="center"/>
       <w:rPr>
-        <w:rFonts w:ascii="Roboto Light" w:hAnsi="Roboto Light"/>
-        <w:color w:val="FF0000"/>
-        <w:sz w:val="14"/>
-        <w:szCs w:val="22"/>
-        <w:lang w:val="es-ES"/>
+        <w:color w:val="auto"/>
       </w:rPr>
     </w:pPr>
     <w:r>
       <w:rPr>
         <w:rFonts w:ascii="Roboto Light" w:hAnsi="Roboto Light"/>
-        <w:color w:val="FF0000"/>
+        <w:color w:val="auto"/>
         <w:sz w:val="14"/>
         <w:szCs w:val="22"/>
         <w:lang w:val="es-ES"/>
@@ -9384,17 +9357,13 @@
       <w:spacing w:lineRule="auto" w:line="240" w:before="0" w:after="0"/>
       <w:jc w:val="center"/>
       <w:rPr>
-        <w:rFonts w:ascii="Roboto Light" w:hAnsi="Roboto Light"/>
-        <w:color w:val="FF0000"/>
-        <w:sz w:val="14"/>
-        <w:szCs w:val="22"/>
-        <w:lang w:val="es-ES"/>
+        <w:color w:val="auto"/>
       </w:rPr>
     </w:pPr>
     <w:r>
       <w:rPr>
         <w:rFonts w:ascii="Roboto Light" w:hAnsi="Roboto Light"/>
-        <w:color w:val="FF0000"/>
+        <w:color w:val="auto"/>
         <w:sz w:val="14"/>
         <w:szCs w:val="22"/>
         <w:lang w:val="es-ES"/>
@@ -9412,12 +9381,14 @@
       </w:tabs>
       <w:spacing w:lineRule="auto" w:line="240" w:before="0" w:after="0"/>
       <w:jc w:val="center"/>
-      <w:rPr/>
+      <w:rPr>
+        <w:color w:val="auto"/>
+      </w:rPr>
     </w:pPr>
     <w:r>
       <w:rPr>
         <w:rFonts w:ascii="Roboto Light" w:hAnsi="Roboto Light"/>
-        <w:color w:val="FF0000"/>
+        <w:color w:val="auto"/>
         <w:sz w:val="14"/>
         <w:szCs w:val="22"/>
         <w:lang w:val="es-ES"/>
@@ -9429,14 +9400,14 @@
 </file>
 
 <file path=word/footer3.xml><?xml version="1.0" encoding="utf-8"?>
-<w:ftr xmlns:o="urn:schemas-microsoft-com:office:office" xmlns:r="http://schemas.openxmlformats.org/officeDocument/2006/relationships" xmlns:v="urn:schemas-microsoft-com:vml" xmlns:w="http://schemas.openxmlformats.org/wordprocessingml/2006/main" xmlns:w10="urn:schemas-microsoft-com:office:word" xmlns:wp="http://schemas.openxmlformats.org/drawingml/2006/wordprocessingDrawing" xmlns:wps="http://schemas.microsoft.com/office/word/2010/wordprocessingShape" xmlns:wpg="http://schemas.microsoft.com/office/word/2010/wordprocessingGroup" xmlns:mc="http://schemas.openxmlformats.org/markup-compatibility/2006" xmlns:wp14="http://schemas.microsoft.com/office/word/2010/wordprocessingDrawing" xmlns:w14="http://schemas.microsoft.com/office/word/2010/wordml" xmlns:w15="http://schemas.microsoft.com/office/word/2012/wordml" mc:Ignorable="w14 wp14 w15">
+<w:ftr xmlns:o="urn:schemas-microsoft-com:office:office" xmlns:r="http://schemas.openxmlformats.org/officeDocument/2006/relationships" xmlns:v="urn:schemas-microsoft-com:vml" xmlns:w="http://schemas.openxmlformats.org/wordprocessingml/2006/main" xmlns:w10="urn:schemas-microsoft-com:office:word" xmlns:wp="http://schemas.openxmlformats.org/drawingml/2006/wordprocessingDrawing" xmlns:pic="http://schemas.openxmlformats.org/drawingml/2006/picture" xmlns:wps="http://schemas.microsoft.com/office/word/2010/wordprocessingShape" xmlns:wpg="http://schemas.microsoft.com/office/word/2010/wordprocessingGroup" xmlns:mc="http://schemas.openxmlformats.org/markup-compatibility/2006" xmlns:wp14="http://schemas.microsoft.com/office/word/2010/wordprocessingDrawing" xmlns:w14="http://schemas.microsoft.com/office/word/2010/wordml" xmlns:w15="http://schemas.microsoft.com/office/word/2012/wordml" mc:Ignorable="w14 wp14 w15">
   <w:sdt>
     <w:sdtPr>
+      <w:id w:val="1350708069"/>
       <w:docPartObj>
         <w:docPartGallery w:val="Page Numbers (Bottom of Page)"/>
         <w:docPartUnique w:val="true"/>
       </w:docPartObj>
-      <w:id w:val="1350708069"/>
     </w:sdtPr>
     <w:sdtContent>
       <w:p>
@@ -9488,17 +9459,13 @@
       <w:spacing w:lineRule="auto" w:line="240" w:before="0" w:after="0"/>
       <w:jc w:val="center"/>
       <w:rPr>
-        <w:rFonts w:ascii="Roboto Light" w:hAnsi="Roboto Light"/>
-        <w:color w:val="FF0000"/>
-        <w:sz w:val="14"/>
-        <w:szCs w:val="22"/>
-        <w:lang w:val="es-ES"/>
+        <w:color w:val="auto"/>
       </w:rPr>
     </w:pPr>
     <w:r>
       <w:rPr>
         <w:rFonts w:ascii="Roboto Light" w:hAnsi="Roboto Light"/>
-        <w:color w:val="FF0000"/>
+        <w:color w:val="auto"/>
         <w:sz w:val="14"/>
         <w:szCs w:val="22"/>
         <w:lang w:val="es-ES"/>
@@ -9517,17 +9484,13 @@
       <w:spacing w:lineRule="auto" w:line="240" w:before="0" w:after="0"/>
       <w:jc w:val="center"/>
       <w:rPr>
-        <w:rFonts w:ascii="Roboto Light" w:hAnsi="Roboto Light"/>
-        <w:color w:val="FF0000"/>
-        <w:sz w:val="14"/>
-        <w:szCs w:val="22"/>
-        <w:lang w:val="es-ES"/>
+        <w:color w:val="auto"/>
       </w:rPr>
     </w:pPr>
     <w:r>
       <w:rPr>
         <w:rFonts w:ascii="Roboto Light" w:hAnsi="Roboto Light"/>
-        <w:color w:val="FF0000"/>
+        <w:color w:val="auto"/>
         <w:sz w:val="14"/>
         <w:szCs w:val="22"/>
         <w:lang w:val="es-ES"/>
@@ -9545,12 +9508,14 @@
       </w:tabs>
       <w:spacing w:lineRule="auto" w:line="240" w:before="0" w:after="0"/>
       <w:jc w:val="center"/>
-      <w:rPr/>
+      <w:rPr>
+        <w:color w:val="auto"/>
+      </w:rPr>
     </w:pPr>
     <w:r>
       <w:rPr>
         <w:rFonts w:ascii="Roboto Light" w:hAnsi="Roboto Light"/>
-        <w:color w:val="FF0000"/>
+        <w:color w:val="auto"/>
         <w:sz w:val="14"/>
         <w:szCs w:val="22"/>
         <w:lang w:val="es-ES"/>
@@ -9562,14 +9527,14 @@
 </file>
 
 <file path=word/footer4.xml><?xml version="1.0" encoding="utf-8"?>
-<w:ftr xmlns:o="urn:schemas-microsoft-com:office:office" xmlns:r="http://schemas.openxmlformats.org/officeDocument/2006/relationships" xmlns:v="urn:schemas-microsoft-com:vml" xmlns:w="http://schemas.openxmlformats.org/wordprocessingml/2006/main" xmlns:w10="urn:schemas-microsoft-com:office:word" xmlns:wp="http://schemas.openxmlformats.org/drawingml/2006/wordprocessingDrawing" xmlns:wps="http://schemas.microsoft.com/office/word/2010/wordprocessingShape" xmlns:wpg="http://schemas.microsoft.com/office/word/2010/wordprocessingGroup" xmlns:mc="http://schemas.openxmlformats.org/markup-compatibility/2006" xmlns:wp14="http://schemas.microsoft.com/office/word/2010/wordprocessingDrawing" xmlns:w14="http://schemas.microsoft.com/office/word/2010/wordml" xmlns:w15="http://schemas.microsoft.com/office/word/2012/wordml" mc:Ignorable="w14 wp14 w15">
+<w:ftr xmlns:o="urn:schemas-microsoft-com:office:office" xmlns:r="http://schemas.openxmlformats.org/officeDocument/2006/relationships" xmlns:v="urn:schemas-microsoft-com:vml" xmlns:w="http://schemas.openxmlformats.org/wordprocessingml/2006/main" xmlns:w10="urn:schemas-microsoft-com:office:word" xmlns:wp="http://schemas.openxmlformats.org/drawingml/2006/wordprocessingDrawing" xmlns:pic="http://schemas.openxmlformats.org/drawingml/2006/picture" xmlns:wps="http://schemas.microsoft.com/office/word/2010/wordprocessingShape" xmlns:wpg="http://schemas.microsoft.com/office/word/2010/wordprocessingGroup" xmlns:mc="http://schemas.openxmlformats.org/markup-compatibility/2006" xmlns:wp14="http://schemas.microsoft.com/office/word/2010/wordprocessingDrawing" xmlns:w14="http://schemas.microsoft.com/office/word/2010/wordml" xmlns:w15="http://schemas.microsoft.com/office/word/2012/wordml" mc:Ignorable="w14 wp14 w15">
   <w:sdt>
     <w:sdtPr>
+      <w:id w:val="214815074"/>
       <w:docPartObj>
         <w:docPartGallery w:val="Page Numbers (Bottom of Page)"/>
         <w:docPartUnique w:val="true"/>
       </w:docPartObj>
-      <w:id w:val="214815074"/>
     </w:sdtPr>
     <w:sdtContent>
       <w:p>
@@ -9621,17 +9586,13 @@
       <w:spacing w:lineRule="auto" w:line="240" w:before="0" w:after="0"/>
       <w:jc w:val="center"/>
       <w:rPr>
-        <w:rFonts w:ascii="Roboto Light" w:hAnsi="Roboto Light"/>
-        <w:color w:val="FF0000"/>
-        <w:sz w:val="14"/>
-        <w:szCs w:val="22"/>
-        <w:lang w:val="es-ES"/>
+        <w:color w:val="auto"/>
       </w:rPr>
     </w:pPr>
     <w:r>
       <w:rPr>
         <w:rFonts w:ascii="Roboto Light" w:hAnsi="Roboto Light"/>
-        <w:color w:val="FF0000"/>
+        <w:color w:val="auto"/>
         <w:sz w:val="14"/>
         <w:szCs w:val="22"/>
         <w:lang w:val="es-ES"/>
@@ -9650,17 +9611,13 @@
       <w:spacing w:lineRule="auto" w:line="240" w:before="0" w:after="0"/>
       <w:jc w:val="center"/>
       <w:rPr>
-        <w:rFonts w:ascii="Roboto Light" w:hAnsi="Roboto Light"/>
-        <w:color w:val="FF0000"/>
-        <w:sz w:val="14"/>
-        <w:szCs w:val="22"/>
-        <w:lang w:val="es-ES"/>
+        <w:color w:val="auto"/>
       </w:rPr>
     </w:pPr>
     <w:r>
       <w:rPr>
         <w:rFonts w:ascii="Roboto Light" w:hAnsi="Roboto Light"/>
-        <w:color w:val="FF0000"/>
+        <w:color w:val="auto"/>
         <w:sz w:val="14"/>
         <w:szCs w:val="22"/>
         <w:lang w:val="es-ES"/>
@@ -9678,12 +9635,14 @@
       </w:tabs>
       <w:spacing w:lineRule="auto" w:line="240" w:before="0" w:after="0"/>
       <w:jc w:val="center"/>
-      <w:rPr/>
+      <w:rPr>
+        <w:color w:val="auto"/>
+      </w:rPr>
     </w:pPr>
     <w:r>
       <w:rPr>
         <w:rFonts w:ascii="Roboto Light" w:hAnsi="Roboto Light"/>
-        <w:color w:val="FF0000"/>
+        <w:color w:val="auto"/>
         <w:sz w:val="14"/>
         <w:szCs w:val="22"/>
         <w:lang w:val="es-ES"/>
@@ -9695,14 +9654,14 @@
 </file>
 
 <file path=word/footer5.xml><?xml version="1.0" encoding="utf-8"?>
-<w:ftr xmlns:o="urn:schemas-microsoft-com:office:office" xmlns:r="http://schemas.openxmlformats.org/officeDocument/2006/relationships" xmlns:v="urn:schemas-microsoft-com:vml" xmlns:w="http://schemas.openxmlformats.org/wordprocessingml/2006/main" xmlns:w10="urn:schemas-microsoft-com:office:word" xmlns:wp="http://schemas.openxmlformats.org/drawingml/2006/wordprocessingDrawing" xmlns:wps="http://schemas.microsoft.com/office/word/2010/wordprocessingShape" xmlns:wpg="http://schemas.microsoft.com/office/word/2010/wordprocessingGroup" xmlns:mc="http://schemas.openxmlformats.org/markup-compatibility/2006" xmlns:wp14="http://schemas.microsoft.com/office/word/2010/wordprocessingDrawing" xmlns:w14="http://schemas.microsoft.com/office/word/2010/wordml" xmlns:w15="http://schemas.microsoft.com/office/word/2012/wordml" mc:Ignorable="w14 wp14 w15">
+<w:ftr xmlns:o="urn:schemas-microsoft-com:office:office" xmlns:r="http://schemas.openxmlformats.org/officeDocument/2006/relationships" xmlns:v="urn:schemas-microsoft-com:vml" xmlns:w="http://schemas.openxmlformats.org/wordprocessingml/2006/main" xmlns:w10="urn:schemas-microsoft-com:office:word" xmlns:wp="http://schemas.openxmlformats.org/drawingml/2006/wordprocessingDrawing" xmlns:pic="http://schemas.openxmlformats.org/drawingml/2006/picture" xmlns:wps="http://schemas.microsoft.com/office/word/2010/wordprocessingShape" xmlns:wpg="http://schemas.microsoft.com/office/word/2010/wordprocessingGroup" xmlns:mc="http://schemas.openxmlformats.org/markup-compatibility/2006" xmlns:wp14="http://schemas.microsoft.com/office/word/2010/wordprocessingDrawing" xmlns:w14="http://schemas.microsoft.com/office/word/2010/wordml" xmlns:w15="http://schemas.microsoft.com/office/word/2012/wordml" mc:Ignorable="w14 wp14 w15">
   <w:sdt>
     <w:sdtPr>
+      <w:id w:val="214815074"/>
       <w:docPartObj>
         <w:docPartGallery w:val="Page Numbers (Bottom of Page)"/>
         <w:docPartUnique w:val="true"/>
       </w:docPartObj>
-      <w:id w:val="214815074"/>
     </w:sdtPr>
     <w:sdtContent>
       <w:p>
@@ -9754,17 +9713,13 @@
       <w:spacing w:lineRule="auto" w:line="240" w:before="0" w:after="0"/>
       <w:jc w:val="center"/>
       <w:rPr>
-        <w:rFonts w:ascii="Roboto Light" w:hAnsi="Roboto Light"/>
-        <w:color w:val="FF0000"/>
-        <w:sz w:val="14"/>
-        <w:szCs w:val="22"/>
-        <w:lang w:val="es-ES"/>
+        <w:color w:val="auto"/>
       </w:rPr>
     </w:pPr>
     <w:r>
       <w:rPr>
         <w:rFonts w:ascii="Roboto Light" w:hAnsi="Roboto Light"/>
-        <w:color w:val="FF0000"/>
+        <w:color w:val="auto"/>
         <w:sz w:val="14"/>
         <w:szCs w:val="22"/>
         <w:lang w:val="es-ES"/>
@@ -9783,17 +9738,13 @@
       <w:spacing w:lineRule="auto" w:line="240" w:before="0" w:after="0"/>
       <w:jc w:val="center"/>
       <w:rPr>
-        <w:rFonts w:ascii="Roboto Light" w:hAnsi="Roboto Light"/>
-        <w:color w:val="FF0000"/>
-        <w:sz w:val="14"/>
-        <w:szCs w:val="22"/>
-        <w:lang w:val="es-ES"/>
+        <w:color w:val="auto"/>
       </w:rPr>
     </w:pPr>
     <w:r>
       <w:rPr>
         <w:rFonts w:ascii="Roboto Light" w:hAnsi="Roboto Light"/>
-        <w:color w:val="FF0000"/>
+        <w:color w:val="auto"/>
         <w:sz w:val="14"/>
         <w:szCs w:val="22"/>
         <w:lang w:val="es-ES"/>
@@ -9811,12 +9762,14 @@
       </w:tabs>
       <w:spacing w:lineRule="auto" w:line="240" w:before="0" w:after="0"/>
       <w:jc w:val="center"/>
-      <w:rPr/>
+      <w:rPr>
+        <w:color w:val="auto"/>
+      </w:rPr>
     </w:pPr>
     <w:r>
       <w:rPr>
         <w:rFonts w:ascii="Roboto Light" w:hAnsi="Roboto Light"/>
-        <w:color w:val="FF0000"/>
+        <w:color w:val="auto"/>
         <w:sz w:val="14"/>
         <w:szCs w:val="22"/>
         <w:lang w:val="es-ES"/>
@@ -9828,14 +9781,14 @@
 </file>
 
 <file path=word/footer6.xml><?xml version="1.0" encoding="utf-8"?>
-<w:ftr xmlns:o="urn:schemas-microsoft-com:office:office" xmlns:r="http://schemas.openxmlformats.org/officeDocument/2006/relationships" xmlns:v="urn:schemas-microsoft-com:vml" xmlns:w="http://schemas.openxmlformats.org/wordprocessingml/2006/main" xmlns:w10="urn:schemas-microsoft-com:office:word" xmlns:wp="http://schemas.openxmlformats.org/drawingml/2006/wordprocessingDrawing" xmlns:wps="http://schemas.microsoft.com/office/word/2010/wordprocessingShape" xmlns:wpg="http://schemas.microsoft.com/office/word/2010/wordprocessingGroup" xmlns:mc="http://schemas.openxmlformats.org/markup-compatibility/2006" xmlns:wp14="http://schemas.microsoft.com/office/word/2010/wordprocessingDrawing" xmlns:w14="http://schemas.microsoft.com/office/word/2010/wordml" xmlns:w15="http://schemas.microsoft.com/office/word/2012/wordml" mc:Ignorable="w14 wp14 w15">
+<w:ftr xmlns:o="urn:schemas-microsoft-com:office:office" xmlns:r="http://schemas.openxmlformats.org/officeDocument/2006/relationships" xmlns:v="urn:schemas-microsoft-com:vml" xmlns:w="http://schemas.openxmlformats.org/wordprocessingml/2006/main" xmlns:w10="urn:schemas-microsoft-com:office:word" xmlns:wp="http://schemas.openxmlformats.org/drawingml/2006/wordprocessingDrawing" xmlns:pic="http://schemas.openxmlformats.org/drawingml/2006/picture" xmlns:wps="http://schemas.microsoft.com/office/word/2010/wordprocessingShape" xmlns:wpg="http://schemas.microsoft.com/office/word/2010/wordprocessingGroup" xmlns:mc="http://schemas.openxmlformats.org/markup-compatibility/2006" xmlns:wp14="http://schemas.microsoft.com/office/word/2010/wordprocessingDrawing" xmlns:w14="http://schemas.microsoft.com/office/word/2010/wordml" xmlns:w15="http://schemas.microsoft.com/office/word/2012/wordml" mc:Ignorable="w14 wp14 w15">
   <w:sdt>
     <w:sdtPr>
+      <w:id w:val="214815074"/>
       <w:docPartObj>
         <w:docPartGallery w:val="Page Numbers (Bottom of Page)"/>
         <w:docPartUnique w:val="true"/>
       </w:docPartObj>
-      <w:id w:val="214815074"/>
     </w:sdtPr>
     <w:sdtContent>
       <w:p>
@@ -9887,17 +9840,13 @@
       <w:spacing w:lineRule="auto" w:line="240" w:before="0" w:after="0"/>
       <w:jc w:val="center"/>
       <w:rPr>
-        <w:rFonts w:ascii="Roboto Light" w:hAnsi="Roboto Light"/>
-        <w:color w:val="FF0000"/>
-        <w:sz w:val="14"/>
-        <w:szCs w:val="22"/>
-        <w:lang w:val="es-ES"/>
+        <w:color w:val="auto"/>
       </w:rPr>
     </w:pPr>
     <w:r>
       <w:rPr>
         <w:rFonts w:ascii="Roboto Light" w:hAnsi="Roboto Light"/>
-        <w:color w:val="FF0000"/>
+        <w:color w:val="auto"/>
         <w:sz w:val="14"/>
         <w:szCs w:val="22"/>
         <w:lang w:val="es-ES"/>
@@ -9916,17 +9865,13 @@
       <w:spacing w:lineRule="auto" w:line="240" w:before="0" w:after="0"/>
       <w:jc w:val="center"/>
       <w:rPr>
-        <w:rFonts w:ascii="Roboto Light" w:hAnsi="Roboto Light"/>
-        <w:color w:val="FF0000"/>
-        <w:sz w:val="14"/>
-        <w:szCs w:val="22"/>
-        <w:lang w:val="es-ES"/>
+        <w:color w:val="auto"/>
       </w:rPr>
     </w:pPr>
     <w:r>
       <w:rPr>
         <w:rFonts w:ascii="Roboto Light" w:hAnsi="Roboto Light"/>
-        <w:color w:val="FF0000"/>
+        <w:color w:val="auto"/>
         <w:sz w:val="14"/>
         <w:szCs w:val="22"/>
         <w:lang w:val="es-ES"/>
@@ -9944,12 +9889,14 @@
       </w:tabs>
       <w:spacing w:lineRule="auto" w:line="240" w:before="0" w:after="0"/>
       <w:jc w:val="center"/>
-      <w:rPr/>
+      <w:rPr>
+        <w:color w:val="auto"/>
+      </w:rPr>
     </w:pPr>
     <w:r>
       <w:rPr>
         <w:rFonts w:ascii="Roboto Light" w:hAnsi="Roboto Light"/>
-        <w:color w:val="FF0000"/>
+        <w:color w:val="auto"/>
         <w:sz w:val="14"/>
         <w:szCs w:val="22"/>
         <w:lang w:val="es-ES"/>
@@ -9961,14 +9908,28 @@
 </file>
 
 <file path=word/footer7.xml><?xml version="1.0" encoding="utf-8"?>
-<w:ftr xmlns:o="urn:schemas-microsoft-com:office:office" xmlns:r="http://schemas.openxmlformats.org/officeDocument/2006/relationships" xmlns:v="urn:schemas-microsoft-com:vml" xmlns:w="http://schemas.openxmlformats.org/wordprocessingml/2006/main" xmlns:w10="urn:schemas-microsoft-com:office:word" xmlns:wp="http://schemas.openxmlformats.org/drawingml/2006/wordprocessingDrawing" xmlns:wps="http://schemas.microsoft.com/office/word/2010/wordprocessingShape" xmlns:wpg="http://schemas.microsoft.com/office/word/2010/wordprocessingGroup" xmlns:mc="http://schemas.openxmlformats.org/markup-compatibility/2006" xmlns:wp14="http://schemas.microsoft.com/office/word/2010/wordprocessingDrawing" xmlns:w14="http://schemas.microsoft.com/office/word/2010/wordml" xmlns:w15="http://schemas.microsoft.com/office/word/2012/wordml" mc:Ignorable="w14 wp14 w15">
+<w:ftr xmlns:o="urn:schemas-microsoft-com:office:office" xmlns:r="http://schemas.openxmlformats.org/officeDocument/2006/relationships" xmlns:v="urn:schemas-microsoft-com:vml" xmlns:w="http://schemas.openxmlformats.org/wordprocessingml/2006/main" xmlns:w10="urn:schemas-microsoft-com:office:word" xmlns:wp="http://schemas.openxmlformats.org/drawingml/2006/wordprocessingDrawing" xmlns:pic="http://schemas.openxmlformats.org/drawingml/2006/picture" xmlns:wps="http://schemas.microsoft.com/office/word/2010/wordprocessingShape" xmlns:wpg="http://schemas.microsoft.com/office/word/2010/wordprocessingGroup" xmlns:mc="http://schemas.openxmlformats.org/markup-compatibility/2006" xmlns:wp14="http://schemas.microsoft.com/office/word/2010/wordprocessingDrawing" xmlns:w14="http://schemas.microsoft.com/office/word/2010/wordml" xmlns:w15="http://schemas.microsoft.com/office/word/2012/wordml" mc:Ignorable="w14 wp14 w15">
+  <w:p>
+    <w:pPr>
+      <w:pStyle w:val="Footer"/>
+      <w:rPr/>
+    </w:pPr>
+    <w:r>
+      <w:rPr/>
+    </w:r>
+  </w:p>
+</w:ftr>
+</file>
+
+<file path=word/footer8.xml><?xml version="1.0" encoding="utf-8"?>
+<w:ftr xmlns:o="urn:schemas-microsoft-com:office:office" xmlns:r="http://schemas.openxmlformats.org/officeDocument/2006/relationships" xmlns:v="urn:schemas-microsoft-com:vml" xmlns:w="http://schemas.openxmlformats.org/wordprocessingml/2006/main" xmlns:w10="urn:schemas-microsoft-com:office:word" xmlns:wp="http://schemas.openxmlformats.org/drawingml/2006/wordprocessingDrawing" xmlns:pic="http://schemas.openxmlformats.org/drawingml/2006/picture" xmlns:wps="http://schemas.microsoft.com/office/word/2010/wordprocessingShape" xmlns:wpg="http://schemas.microsoft.com/office/word/2010/wordprocessingGroup" xmlns:mc="http://schemas.openxmlformats.org/markup-compatibility/2006" xmlns:wp14="http://schemas.microsoft.com/office/word/2010/wordprocessingDrawing" xmlns:w14="http://schemas.microsoft.com/office/word/2010/wordml" xmlns:w15="http://schemas.microsoft.com/office/word/2012/wordml" mc:Ignorable="w14 wp14 w15">
   <w:sdt>
     <w:sdtPr>
+      <w:id w:val="2128996577"/>
       <w:docPartObj>
         <w:docPartGallery w:val="Page Numbers (Bottom of Page)"/>
         <w:docPartUnique w:val="true"/>
       </w:docPartObj>
-      <w:id w:val="2128996577"/>
     </w:sdtPr>
     <w:sdtContent>
       <w:p>
@@ -10020,17 +9981,13 @@
       <w:spacing w:lineRule="auto" w:line="240" w:before="0" w:after="0"/>
       <w:jc w:val="center"/>
       <w:rPr>
-        <w:rFonts w:ascii="Roboto Light" w:hAnsi="Roboto Light"/>
-        <w:color w:val="FF0000"/>
-        <w:sz w:val="14"/>
-        <w:szCs w:val="22"/>
-        <w:lang w:val="es-ES"/>
+        <w:color w:val="auto"/>
       </w:rPr>
     </w:pPr>
     <w:r>
       <w:rPr>
         <w:rFonts w:ascii="Roboto Light" w:hAnsi="Roboto Light"/>
-        <w:color w:val="FF0000"/>
+        <w:color w:val="auto"/>
         <w:sz w:val="14"/>
         <w:szCs w:val="22"/>
         <w:lang w:val="es-ES"/>
@@ -10049,17 +10006,13 @@
       <w:spacing w:lineRule="auto" w:line="240" w:before="0" w:after="0"/>
       <w:jc w:val="center"/>
       <w:rPr>
-        <w:rFonts w:ascii="Roboto Light" w:hAnsi="Roboto Light"/>
-        <w:color w:val="FF0000"/>
-        <w:sz w:val="14"/>
-        <w:szCs w:val="22"/>
-        <w:lang w:val="es-ES"/>
+        <w:color w:val="auto"/>
       </w:rPr>
     </w:pPr>
     <w:r>
       <w:rPr>
         <w:rFonts w:ascii="Roboto Light" w:hAnsi="Roboto Light"/>
-        <w:color w:val="FF0000"/>
+        <w:color w:val="auto"/>
         <w:sz w:val="14"/>
         <w:szCs w:val="22"/>
         <w:lang w:val="es-ES"/>
@@ -10077,12 +10030,14 @@
       </w:tabs>
       <w:spacing w:lineRule="auto" w:line="240" w:before="0" w:after="0"/>
       <w:jc w:val="center"/>
-      <w:rPr/>
+      <w:rPr>
+        <w:color w:val="auto"/>
+      </w:rPr>
     </w:pPr>
     <w:r>
       <w:rPr>
         <w:rFonts w:ascii="Roboto Light" w:hAnsi="Roboto Light"/>
-        <w:color w:val="FF0000"/>
+        <w:color w:val="auto"/>
         <w:sz w:val="14"/>
         <w:szCs w:val="22"/>
         <w:lang w:val="es-ES"/>
@@ -10093,14 +10048,135 @@
 </w:ftr>
 </file>
 
-<file path=word/footer8.xml><?xml version="1.0" encoding="utf-8"?>
-<w:ftr xmlns:o="urn:schemas-microsoft-com:office:office" xmlns:r="http://schemas.openxmlformats.org/officeDocument/2006/relationships" xmlns:v="urn:schemas-microsoft-com:vml" xmlns:w="http://schemas.openxmlformats.org/wordprocessingml/2006/main" xmlns:w10="urn:schemas-microsoft-com:office:word" xmlns:wp="http://schemas.openxmlformats.org/drawingml/2006/wordprocessingDrawing" xmlns:wps="http://schemas.microsoft.com/office/word/2010/wordprocessingShape" xmlns:wpg="http://schemas.microsoft.com/office/word/2010/wordprocessingGroup" xmlns:mc="http://schemas.openxmlformats.org/markup-compatibility/2006" xmlns:wp14="http://schemas.microsoft.com/office/word/2010/wordprocessingDrawing" xmlns:w14="http://schemas.microsoft.com/office/word/2010/wordml" xmlns:w15="http://schemas.microsoft.com/office/word/2012/wordml" mc:Ignorable="w14 wp14 w15">
-  <w:p/>
+<file path=word/footer9.xml><?xml version="1.0" encoding="utf-8"?>
+<w:ftr xmlns:o="urn:schemas-microsoft-com:office:office" xmlns:r="http://schemas.openxmlformats.org/officeDocument/2006/relationships" xmlns:v="urn:schemas-microsoft-com:vml" xmlns:w="http://schemas.openxmlformats.org/wordprocessingml/2006/main" xmlns:w10="urn:schemas-microsoft-com:office:word" xmlns:wp="http://schemas.openxmlformats.org/drawingml/2006/wordprocessingDrawing" xmlns:pic="http://schemas.openxmlformats.org/drawingml/2006/picture" xmlns:wps="http://schemas.microsoft.com/office/word/2010/wordprocessingShape" xmlns:wpg="http://schemas.microsoft.com/office/word/2010/wordprocessingGroup" xmlns:mc="http://schemas.openxmlformats.org/markup-compatibility/2006" xmlns:wp14="http://schemas.microsoft.com/office/word/2010/wordprocessingDrawing" xmlns:w14="http://schemas.microsoft.com/office/word/2010/wordml" xmlns:w15="http://schemas.microsoft.com/office/word/2012/wordml" mc:Ignorable="w14 wp14 w15">
+  <w:sdt>
+    <w:sdtPr>
+      <w:id w:val="2128996577"/>
+      <w:docPartObj>
+        <w:docPartGallery w:val="Page Numbers (Bottom of Page)"/>
+        <w:docPartUnique w:val="true"/>
+      </w:docPartObj>
+    </w:sdtPr>
+    <w:sdtContent>
+      <w:p>
+        <w:pPr>
+          <w:pStyle w:val="Footer"/>
+          <w:rPr/>
+        </w:pPr>
+        <w:r>
+          <w:rPr>
+            <w:rStyle w:val="PageNumber"/>
+          </w:rPr>
+          <w:fldChar w:fldCharType="begin"/>
+        </w:r>
+        <w:r>
+          <w:rPr>
+            <w:rStyle w:val="PageNumber"/>
+          </w:rPr>
+          <w:instrText xml:space="preserve"> PAGE </w:instrText>
+        </w:r>
+        <w:r>
+          <w:rPr>
+            <w:rStyle w:val="PageNumber"/>
+          </w:rPr>
+          <w:fldChar w:fldCharType="separate"/>
+        </w:r>
+        <w:r>
+          <w:rPr>
+            <w:rStyle w:val="PageNumber"/>
+          </w:rPr>
+          <w:t>17</w:t>
+        </w:r>
+        <w:r>
+          <w:rPr>
+            <w:rStyle w:val="PageNumber"/>
+          </w:rPr>
+          <w:fldChar w:fldCharType="end"/>
+        </w:r>
+      </w:p>
+    </w:sdtContent>
+  </w:sdt>
+  <w:p>
+    <w:pPr>
+      <w:pStyle w:val="Normal"/>
+      <w:tabs>
+        <w:tab w:val="clear" w:pos="720"/>
+        <w:tab w:val="center" w:pos="4419" w:leader="none"/>
+        <w:tab w:val="right" w:pos="8838" w:leader="none"/>
+      </w:tabs>
+      <w:spacing w:lineRule="auto" w:line="240" w:before="0" w:after="0"/>
+      <w:jc w:val="center"/>
+      <w:rPr>
+        <w:color w:val="auto"/>
+      </w:rPr>
+    </w:pPr>
+    <w:r>
+      <w:rPr>
+        <w:rFonts w:ascii="Roboto Light" w:hAnsi="Roboto Light"/>
+        <w:color w:val="auto"/>
+        <w:sz w:val="14"/>
+        <w:szCs w:val="22"/>
+        <w:lang w:val="es-ES"/>
+      </w:rPr>
+      <w:t>FUNDACIÓ PER AL FOMENT DE LA INVESTIGACIÓ SANITÀRIA I BIOMÈDICA DE LA COMUNITAT VALENCIANA (FISABIO).</w:t>
+    </w:r>
+  </w:p>
+  <w:p>
+    <w:pPr>
+      <w:pStyle w:val="Normal"/>
+      <w:tabs>
+        <w:tab w:val="clear" w:pos="720"/>
+        <w:tab w:val="center" w:pos="4419" w:leader="none"/>
+        <w:tab w:val="right" w:pos="8838" w:leader="none"/>
+      </w:tabs>
+      <w:spacing w:lineRule="auto" w:line="240" w:before="0" w:after="0"/>
+      <w:jc w:val="center"/>
+      <w:rPr>
+        <w:color w:val="auto"/>
+      </w:rPr>
+    </w:pPr>
+    <w:r>
+      <w:rPr>
+        <w:rFonts w:ascii="Roboto Light" w:hAnsi="Roboto Light"/>
+        <w:color w:val="auto"/>
+        <w:sz w:val="14"/>
+        <w:szCs w:val="22"/>
+        <w:lang w:val="es-ES"/>
+      </w:rPr>
+      <w:t>C/ Misser Mascó nº 31. 46010 València. CIF.: G98073760 Inscrita Registre fundacions: 501 V</w:t>
+    </w:r>
+  </w:p>
+  <w:p>
+    <w:pPr>
+      <w:pStyle w:val="Normal"/>
+      <w:tabs>
+        <w:tab w:val="clear" w:pos="720"/>
+        <w:tab w:val="center" w:pos="4419" w:leader="none"/>
+        <w:tab w:val="right" w:pos="8838" w:leader="none"/>
+      </w:tabs>
+      <w:spacing w:lineRule="auto" w:line="240" w:before="0" w:after="0"/>
+      <w:jc w:val="center"/>
+      <w:rPr>
+        <w:color w:val="auto"/>
+      </w:rPr>
+    </w:pPr>
+    <w:r>
+      <w:rPr>
+        <w:rFonts w:ascii="Roboto Light" w:hAnsi="Roboto Light"/>
+        <w:color w:val="auto"/>
+        <w:sz w:val="14"/>
+        <w:szCs w:val="22"/>
+        <w:lang w:val="es-ES"/>
+      </w:rPr>
+      <w:t>www.fisabio.san.gva.es</w:t>
+    </w:r>
+  </w:p>
 </w:ftr>
 </file>
 
 <file path=word/header1.xml><?xml version="1.0" encoding="utf-8"?>
-<w:hdr xmlns:o="urn:schemas-microsoft-com:office:office" xmlns:r="http://schemas.openxmlformats.org/officeDocument/2006/relationships" xmlns:v="urn:schemas-microsoft-com:vml" xmlns:w="http://schemas.openxmlformats.org/wordprocessingml/2006/main" xmlns:w10="urn:schemas-microsoft-com:office:word" xmlns:wp="http://schemas.openxmlformats.org/drawingml/2006/wordprocessingDrawing" xmlns:wps="http://schemas.microsoft.com/office/word/2010/wordprocessingShape" xmlns:wpg="http://schemas.microsoft.com/office/word/2010/wordprocessingGroup" xmlns:mc="http://schemas.openxmlformats.org/markup-compatibility/2006" xmlns:wp14="http://schemas.microsoft.com/office/word/2010/wordprocessingDrawing" xmlns:w14="http://schemas.microsoft.com/office/word/2010/wordml" xmlns:w15="http://schemas.microsoft.com/office/word/2012/wordml" mc:Ignorable="w14 wp14 w15">
+<w:hdr xmlns:o="urn:schemas-microsoft-com:office:office" xmlns:r="http://schemas.openxmlformats.org/officeDocument/2006/relationships" xmlns:v="urn:schemas-microsoft-com:vml" xmlns:w="http://schemas.openxmlformats.org/wordprocessingml/2006/main" xmlns:w10="urn:schemas-microsoft-com:office:word" xmlns:wp="http://schemas.openxmlformats.org/drawingml/2006/wordprocessingDrawing" xmlns:pic="http://schemas.openxmlformats.org/drawingml/2006/picture" xmlns:wps="http://schemas.microsoft.com/office/word/2010/wordprocessingShape" xmlns:wpg="http://schemas.microsoft.com/office/word/2010/wordprocessingGroup" xmlns:mc="http://schemas.openxmlformats.org/markup-compatibility/2006" xmlns:wp14="http://schemas.microsoft.com/office/word/2010/wordprocessingDrawing" xmlns:w14="http://schemas.microsoft.com/office/word/2010/wordml" xmlns:w15="http://schemas.microsoft.com/office/word/2012/wordml" mc:Ignorable="w14 wp14 w15">
   <w:p>
     <w:pPr>
       <w:pStyle w:val="Header"/>
@@ -10114,7 +10190,7 @@
 </file>
 
 <file path=word/header2.xml><?xml version="1.0" encoding="utf-8"?>
-<w:hdr xmlns:o="urn:schemas-microsoft-com:office:office" xmlns:r="http://schemas.openxmlformats.org/officeDocument/2006/relationships" xmlns:v="urn:schemas-microsoft-com:vml" xmlns:w="http://schemas.openxmlformats.org/wordprocessingml/2006/main" xmlns:w10="urn:schemas-microsoft-com:office:word" xmlns:wp="http://schemas.openxmlformats.org/drawingml/2006/wordprocessingDrawing" xmlns:wps="http://schemas.microsoft.com/office/word/2010/wordprocessingShape" xmlns:wpg="http://schemas.microsoft.com/office/word/2010/wordprocessingGroup" xmlns:mc="http://schemas.openxmlformats.org/markup-compatibility/2006" xmlns:wp14="http://schemas.microsoft.com/office/word/2010/wordprocessingDrawing" xmlns:w14="http://schemas.microsoft.com/office/word/2010/wordml" xmlns:w15="http://schemas.microsoft.com/office/word/2012/wordml" mc:Ignorable="w14 wp14 w15">
+<w:hdr xmlns:o="urn:schemas-microsoft-com:office:office" xmlns:r="http://schemas.openxmlformats.org/officeDocument/2006/relationships" xmlns:v="urn:schemas-microsoft-com:vml" xmlns:w="http://schemas.openxmlformats.org/wordprocessingml/2006/main" xmlns:w10="urn:schemas-microsoft-com:office:word" xmlns:wp="http://schemas.openxmlformats.org/drawingml/2006/wordprocessingDrawing" xmlns:pic="http://schemas.openxmlformats.org/drawingml/2006/picture" xmlns:wps="http://schemas.microsoft.com/office/word/2010/wordprocessingShape" xmlns:wpg="http://schemas.microsoft.com/office/word/2010/wordprocessingGroup" xmlns:mc="http://schemas.openxmlformats.org/markup-compatibility/2006" xmlns:wp14="http://schemas.microsoft.com/office/word/2010/wordprocessingDrawing" xmlns:w14="http://schemas.microsoft.com/office/word/2010/wordml" xmlns:w15="http://schemas.microsoft.com/office/word/2012/wordml" mc:Ignorable="w14 wp14 w15">
   <w:p>
     <w:pPr>
       <w:pStyle w:val="Header"/>
@@ -10123,27 +10199,18 @@
     <w:r>
       <w:rPr/>
       <w:drawing>
-        <wp:anchor behindDoc="0" distT="0" distB="0" distL="114300" distR="114300" simplePos="0" locked="0" layoutInCell="0" allowOverlap="1" relativeHeight="19">
+        <wp:anchor distT="0" distB="0" distL="0" distR="0" simplePos="0" relativeHeight="9" behindDoc="0" locked="0" layoutInCell="0" allowOverlap="1">
           <wp:simplePos x="0" y="0"/>
-          <wp:positionH relativeFrom="margin">
-            <wp:posOffset>1699260</wp:posOffset>
+          <wp:positionH relativeFrom="column">
+            <wp:align>center</wp:align>
           </wp:positionH>
           <wp:positionV relativeFrom="paragraph">
-            <wp:posOffset>-400685</wp:posOffset>
+            <wp:posOffset>-690880</wp:posOffset>
           </wp:positionV>
-          <wp:extent cx="2814955" cy="482600"/>
+          <wp:extent cx="4001770" cy="655955"/>
           <wp:effectExtent l="0" t="0" r="0" b="0"/>
-          <wp:wrapThrough wrapText="bothSides">
-            <wp:wrapPolygon edited="0">
-              <wp:start x="-10" y="0"/>
-              <wp:lineTo x="-10" y="18728"/>
-              <wp:lineTo x="281" y="20445"/>
-              <wp:lineTo x="21482" y="20445"/>
-              <wp:lineTo x="21482" y="0"/>
-              <wp:lineTo x="-10" y="0"/>
-            </wp:wrapPolygon>
-          </wp:wrapThrough>
-          <wp:docPr id="1" name="Imagen 4" descr=""/>
+          <wp:wrapSquare wrapText="largest"/>
+          <wp:docPr id="1" name="Imagen6"/>
           <wp:cNvGraphicFramePr>
             <a:graphicFrameLocks xmlns:a="http://schemas.openxmlformats.org/drawingml/2006/main" noChangeAspect="1"/>
           </wp:cNvGraphicFramePr>
@@ -10151,7 +10218,7 @@
             <a:graphicData uri="http://schemas.openxmlformats.org/drawingml/2006/picture">
               <pic:pic xmlns:pic="http://schemas.openxmlformats.org/drawingml/2006/picture">
                 <pic:nvPicPr>
-                  <pic:cNvPr id="1" name="Imagen 4" descr=""/>
+                  <pic:cNvPr id="1" name="Imagen6"/>
                   <pic:cNvPicPr>
                     <a:picLocks noChangeAspect="1" noChangeArrowheads="1"/>
                   </pic:cNvPicPr>
@@ -10165,11 +10232,12 @@
                 <pic:spPr bwMode="auto">
                   <a:xfrm>
                     <a:off x="0" y="0"/>
-                    <a:ext cx="2814955" cy="482600"/>
+                    <a:ext cx="4001770" cy="655955"/>
                   </a:xfrm>
                   <a:prstGeom prst="rect">
                     <a:avLst/>
                   </a:prstGeom>
+                  <a:noFill/>
                 </pic:spPr>
               </pic:pic>
             </a:graphicData>
@@ -10182,7 +10250,7 @@
 </file>
 
 <file path=word/header3.xml><?xml version="1.0" encoding="utf-8"?>
-<w:hdr xmlns:o="urn:schemas-microsoft-com:office:office" xmlns:r="http://schemas.openxmlformats.org/officeDocument/2006/relationships" xmlns:v="urn:schemas-microsoft-com:vml" xmlns:w="http://schemas.openxmlformats.org/wordprocessingml/2006/main" xmlns:w10="urn:schemas-microsoft-com:office:word" xmlns:wp="http://schemas.openxmlformats.org/drawingml/2006/wordprocessingDrawing" xmlns:wps="http://schemas.microsoft.com/office/word/2010/wordprocessingShape" xmlns:wpg="http://schemas.microsoft.com/office/word/2010/wordprocessingGroup" xmlns:mc="http://schemas.openxmlformats.org/markup-compatibility/2006" xmlns:wp14="http://schemas.microsoft.com/office/word/2010/wordprocessingDrawing" xmlns:w14="http://schemas.microsoft.com/office/word/2010/wordml" xmlns:w15="http://schemas.microsoft.com/office/word/2012/wordml" mc:Ignorable="w14 wp14 w15">
+<w:hdr xmlns:o="urn:schemas-microsoft-com:office:office" xmlns:r="http://schemas.openxmlformats.org/officeDocument/2006/relationships" xmlns:v="urn:schemas-microsoft-com:vml" xmlns:w="http://schemas.openxmlformats.org/wordprocessingml/2006/main" xmlns:w10="urn:schemas-microsoft-com:office:word" xmlns:wp="http://schemas.openxmlformats.org/drawingml/2006/wordprocessingDrawing" xmlns:pic="http://schemas.openxmlformats.org/drawingml/2006/picture" xmlns:wps="http://schemas.microsoft.com/office/word/2010/wordprocessingShape" xmlns:wpg="http://schemas.microsoft.com/office/word/2010/wordprocessingGroup" xmlns:mc="http://schemas.openxmlformats.org/markup-compatibility/2006" xmlns:wp14="http://schemas.microsoft.com/office/word/2010/wordprocessingDrawing" xmlns:w14="http://schemas.microsoft.com/office/word/2010/wordml" xmlns:w15="http://schemas.microsoft.com/office/word/2012/wordml" mc:Ignorable="w14 wp14 w15">
   <w:p>
     <w:pPr>
       <w:pStyle w:val="Header"/>
@@ -10191,27 +10259,18 @@
     <w:r>
       <w:rPr/>
       <w:drawing>
-        <wp:anchor behindDoc="0" distT="0" distB="0" distL="114300" distR="114300" simplePos="0" locked="0" layoutInCell="0" allowOverlap="1" relativeHeight="19">
+        <wp:anchor distT="0" distB="0" distL="0" distR="0" simplePos="0" relativeHeight="9" behindDoc="0" locked="0" layoutInCell="0" allowOverlap="1">
           <wp:simplePos x="0" y="0"/>
-          <wp:positionH relativeFrom="margin">
-            <wp:posOffset>1699260</wp:posOffset>
+          <wp:positionH relativeFrom="column">
+            <wp:align>center</wp:align>
           </wp:positionH>
           <wp:positionV relativeFrom="paragraph">
-            <wp:posOffset>-400685</wp:posOffset>
+            <wp:posOffset>-690880</wp:posOffset>
           </wp:positionV>
-          <wp:extent cx="2814955" cy="482600"/>
+          <wp:extent cx="4001770" cy="655955"/>
           <wp:effectExtent l="0" t="0" r="0" b="0"/>
-          <wp:wrapThrough wrapText="bothSides">
-            <wp:wrapPolygon edited="0">
-              <wp:start x="-10" y="0"/>
-              <wp:lineTo x="-10" y="18728"/>
-              <wp:lineTo x="281" y="20445"/>
-              <wp:lineTo x="21482" y="20445"/>
-              <wp:lineTo x="21482" y="0"/>
-              <wp:lineTo x="-10" y="0"/>
-            </wp:wrapPolygon>
-          </wp:wrapThrough>
-          <wp:docPr id="2" name="Imagen 4" descr=""/>
+          <wp:wrapSquare wrapText="largest"/>
+          <wp:docPr id="2" name="Imagen6"/>
           <wp:cNvGraphicFramePr>
             <a:graphicFrameLocks xmlns:a="http://schemas.openxmlformats.org/drawingml/2006/main" noChangeAspect="1"/>
           </wp:cNvGraphicFramePr>
@@ -10219,7 +10278,7 @@
             <a:graphicData uri="http://schemas.openxmlformats.org/drawingml/2006/picture">
               <pic:pic xmlns:pic="http://schemas.openxmlformats.org/drawingml/2006/picture">
                 <pic:nvPicPr>
-                  <pic:cNvPr id="2" name="Imagen 4" descr=""/>
+                  <pic:cNvPr id="2" name="Imagen6"/>
                   <pic:cNvPicPr>
                     <a:picLocks noChangeAspect="1" noChangeArrowheads="1"/>
                   </pic:cNvPicPr>
@@ -10233,11 +10292,12 @@
                 <pic:spPr bwMode="auto">
                   <a:xfrm>
                     <a:off x="0" y="0"/>
-                    <a:ext cx="2814955" cy="482600"/>
+                    <a:ext cx="4001770" cy="655955"/>
                   </a:xfrm>
                   <a:prstGeom prst="rect">
                     <a:avLst/>
                   </a:prstGeom>
+                  <a:noFill/>
                 </pic:spPr>
               </pic:pic>
             </a:graphicData>
@@ -10250,7 +10310,7 @@
 </file>
 
 <file path=word/header4.xml><?xml version="1.0" encoding="utf-8"?>
-<w:hdr xmlns:o="urn:schemas-microsoft-com:office:office" xmlns:r="http://schemas.openxmlformats.org/officeDocument/2006/relationships" xmlns:v="urn:schemas-microsoft-com:vml" xmlns:w="http://schemas.openxmlformats.org/wordprocessingml/2006/main" xmlns:w10="urn:schemas-microsoft-com:office:word" xmlns:wp="http://schemas.openxmlformats.org/drawingml/2006/wordprocessingDrawing" xmlns:wps="http://schemas.microsoft.com/office/word/2010/wordprocessingShape" xmlns:wpg="http://schemas.microsoft.com/office/word/2010/wordprocessingGroup" xmlns:mc="http://schemas.openxmlformats.org/markup-compatibility/2006" xmlns:wp14="http://schemas.microsoft.com/office/word/2010/wordprocessingDrawing" xmlns:w14="http://schemas.microsoft.com/office/word/2010/wordml" xmlns:w15="http://schemas.microsoft.com/office/word/2012/wordml" mc:Ignorable="w14 wp14 w15">
+<w:hdr xmlns:o="urn:schemas-microsoft-com:office:office" xmlns:r="http://schemas.openxmlformats.org/officeDocument/2006/relationships" xmlns:v="urn:schemas-microsoft-com:vml" xmlns:w="http://schemas.openxmlformats.org/wordprocessingml/2006/main" xmlns:w10="urn:schemas-microsoft-com:office:word" xmlns:wp="http://schemas.openxmlformats.org/drawingml/2006/wordprocessingDrawing" xmlns:pic="http://schemas.openxmlformats.org/drawingml/2006/picture" xmlns:wps="http://schemas.microsoft.com/office/word/2010/wordprocessingShape" xmlns:wpg="http://schemas.microsoft.com/office/word/2010/wordprocessingGroup" xmlns:mc="http://schemas.openxmlformats.org/markup-compatibility/2006" xmlns:wp14="http://schemas.microsoft.com/office/word/2010/wordprocessingDrawing" xmlns:w14="http://schemas.microsoft.com/office/word/2010/wordml" xmlns:w15="http://schemas.microsoft.com/office/word/2012/wordml" mc:Ignorable="w14 wp14 w15">
   <w:p>
     <w:pPr>
       <w:pStyle w:val="Header"/>
@@ -10259,26 +10319,18 @@
     <w:r>
       <w:rPr/>
       <w:drawing>
-        <wp:anchor behindDoc="0" distT="0" distB="0" distL="114300" distR="114300" simplePos="0" locked="0" layoutInCell="0" allowOverlap="1" relativeHeight="20">
+        <wp:anchor distT="0" distB="0" distL="0" distR="0" simplePos="0" relativeHeight="10" behindDoc="0" locked="0" layoutInCell="0" allowOverlap="1">
           <wp:simplePos x="0" y="0"/>
-          <wp:positionH relativeFrom="margin">
-            <wp:posOffset>3503930</wp:posOffset>
+          <wp:positionH relativeFrom="column">
+            <wp:align>center</wp:align>
           </wp:positionH>
           <wp:positionV relativeFrom="paragraph">
-            <wp:posOffset>-273050</wp:posOffset>
+            <wp:posOffset>-690880</wp:posOffset>
           </wp:positionV>
-          <wp:extent cx="2814955" cy="525780"/>
+          <wp:extent cx="4001770" cy="655955"/>
           <wp:effectExtent l="0" t="0" r="0" b="0"/>
-          <wp:wrapThrough wrapText="bothSides">
-            <wp:wrapPolygon edited="0">
-              <wp:start x="-15" y="0"/>
-              <wp:lineTo x="-15" y="21097"/>
-              <wp:lineTo x="21477" y="21097"/>
-              <wp:lineTo x="21477" y="0"/>
-              <wp:lineTo x="-15" y="0"/>
-            </wp:wrapPolygon>
-          </wp:wrapThrough>
-          <wp:docPr id="4" name="Image3 Copy 1" descr=""/>
+          <wp:wrapSquare wrapText="largest"/>
+          <wp:docPr id="4" name="Imagen6 Copia 1"/>
           <wp:cNvGraphicFramePr>
             <a:graphicFrameLocks xmlns:a="http://schemas.openxmlformats.org/drawingml/2006/main" noChangeAspect="1"/>
           </wp:cNvGraphicFramePr>
@@ -10286,7 +10338,7 @@
             <a:graphicData uri="http://schemas.openxmlformats.org/drawingml/2006/picture">
               <pic:pic xmlns:pic="http://schemas.openxmlformats.org/drawingml/2006/picture">
                 <pic:nvPicPr>
-                  <pic:cNvPr id="4" name="Image3 Copy 1" descr=""/>
+                  <pic:cNvPr id="4" name="Imagen6 Copia 1"/>
                   <pic:cNvPicPr>
                     <a:picLocks noChangeAspect="1" noChangeArrowheads="1"/>
                   </pic:cNvPicPr>
@@ -10300,11 +10352,12 @@
                 <pic:spPr bwMode="auto">
                   <a:xfrm>
                     <a:off x="0" y="0"/>
-                    <a:ext cx="2814955" cy="525780"/>
+                    <a:ext cx="4001770" cy="655955"/>
                   </a:xfrm>
                   <a:prstGeom prst="rect">
                     <a:avLst/>
                   </a:prstGeom>
+                  <a:noFill/>
                 </pic:spPr>
               </pic:pic>
             </a:graphicData>
@@ -10317,7 +10370,7 @@
 </file>
 
 <file path=word/header5.xml><?xml version="1.0" encoding="utf-8"?>
-<w:hdr xmlns:o="urn:schemas-microsoft-com:office:office" xmlns:r="http://schemas.openxmlformats.org/officeDocument/2006/relationships" xmlns:v="urn:schemas-microsoft-com:vml" xmlns:w="http://schemas.openxmlformats.org/wordprocessingml/2006/main" xmlns:w10="urn:schemas-microsoft-com:office:word" xmlns:wp="http://schemas.openxmlformats.org/drawingml/2006/wordprocessingDrawing" xmlns:wps="http://schemas.microsoft.com/office/word/2010/wordprocessingShape" xmlns:wpg="http://schemas.microsoft.com/office/word/2010/wordprocessingGroup" xmlns:mc="http://schemas.openxmlformats.org/markup-compatibility/2006" xmlns:wp14="http://schemas.microsoft.com/office/word/2010/wordprocessingDrawing" xmlns:w14="http://schemas.microsoft.com/office/word/2010/wordml" xmlns:w15="http://schemas.microsoft.com/office/word/2012/wordml" mc:Ignorable="w14 wp14 w15">
+<w:hdr xmlns:o="urn:schemas-microsoft-com:office:office" xmlns:r="http://schemas.openxmlformats.org/officeDocument/2006/relationships" xmlns:v="urn:schemas-microsoft-com:vml" xmlns:w="http://schemas.openxmlformats.org/wordprocessingml/2006/main" xmlns:w10="urn:schemas-microsoft-com:office:word" xmlns:wp="http://schemas.openxmlformats.org/drawingml/2006/wordprocessingDrawing" xmlns:pic="http://schemas.openxmlformats.org/drawingml/2006/picture" xmlns:wps="http://schemas.microsoft.com/office/word/2010/wordprocessingShape" xmlns:wpg="http://schemas.microsoft.com/office/word/2010/wordprocessingGroup" xmlns:mc="http://schemas.openxmlformats.org/markup-compatibility/2006" xmlns:wp14="http://schemas.microsoft.com/office/word/2010/wordprocessingDrawing" xmlns:w14="http://schemas.microsoft.com/office/word/2010/wordml" xmlns:w15="http://schemas.microsoft.com/office/word/2012/wordml" mc:Ignorable="w14 wp14 w15">
   <w:p>
     <w:pPr>
       <w:pStyle w:val="Header"/>
@@ -10326,26 +10379,18 @@
     <w:r>
       <w:rPr/>
       <w:drawing>
-        <wp:anchor behindDoc="0" distT="0" distB="0" distL="114300" distR="114300" simplePos="0" locked="0" layoutInCell="0" allowOverlap="1" relativeHeight="20">
+        <wp:anchor distT="0" distB="0" distL="0" distR="0" simplePos="0" relativeHeight="10" behindDoc="0" locked="0" layoutInCell="0" allowOverlap="1">
           <wp:simplePos x="0" y="0"/>
-          <wp:positionH relativeFrom="margin">
-            <wp:posOffset>3503930</wp:posOffset>
+          <wp:positionH relativeFrom="column">
+            <wp:align>center</wp:align>
           </wp:positionH>
           <wp:positionV relativeFrom="paragraph">
-            <wp:posOffset>-273050</wp:posOffset>
+            <wp:posOffset>-690880</wp:posOffset>
           </wp:positionV>
-          <wp:extent cx="2814955" cy="525780"/>
+          <wp:extent cx="4001770" cy="655955"/>
           <wp:effectExtent l="0" t="0" r="0" b="0"/>
-          <wp:wrapThrough wrapText="bothSides">
-            <wp:wrapPolygon edited="0">
-              <wp:start x="-15" y="0"/>
-              <wp:lineTo x="-15" y="21097"/>
-              <wp:lineTo x="21477" y="21097"/>
-              <wp:lineTo x="21477" y="0"/>
-              <wp:lineTo x="-15" y="0"/>
-            </wp:wrapPolygon>
-          </wp:wrapThrough>
-          <wp:docPr id="5" name="Image3 Copy 1" descr=""/>
+          <wp:wrapSquare wrapText="largest"/>
+          <wp:docPr id="5" name="Imagen6 Copia 1"/>
           <wp:cNvGraphicFramePr>
             <a:graphicFrameLocks xmlns:a="http://schemas.openxmlformats.org/drawingml/2006/main" noChangeAspect="1"/>
           </wp:cNvGraphicFramePr>
@@ -10353,7 +10398,7 @@
             <a:graphicData uri="http://schemas.openxmlformats.org/drawingml/2006/picture">
               <pic:pic xmlns:pic="http://schemas.openxmlformats.org/drawingml/2006/picture">
                 <pic:nvPicPr>
-                  <pic:cNvPr id="5" name="Image3 Copy 1" descr=""/>
+                  <pic:cNvPr id="5" name="Imagen6 Copia 1"/>
                   <pic:cNvPicPr>
                     <a:picLocks noChangeAspect="1" noChangeArrowheads="1"/>
                   </pic:cNvPicPr>
@@ -10367,11 +10412,12 @@
                 <pic:spPr bwMode="auto">
                   <a:xfrm>
                     <a:off x="0" y="0"/>
-                    <a:ext cx="2814955" cy="525780"/>
+                    <a:ext cx="4001770" cy="655955"/>
                   </a:xfrm>
                   <a:prstGeom prst="rect">
                     <a:avLst/>
                   </a:prstGeom>
+                  <a:noFill/>
                 </pic:spPr>
               </pic:pic>
             </a:graphicData>
@@ -10384,7 +10430,7 @@
 </file>
 
 <file path=word/header6.xml><?xml version="1.0" encoding="utf-8"?>
-<w:hdr xmlns:o="urn:schemas-microsoft-com:office:office" xmlns:r="http://schemas.openxmlformats.org/officeDocument/2006/relationships" xmlns:v="urn:schemas-microsoft-com:vml" xmlns:w="http://schemas.openxmlformats.org/wordprocessingml/2006/main" xmlns:w10="urn:schemas-microsoft-com:office:word" xmlns:wp="http://schemas.openxmlformats.org/drawingml/2006/wordprocessingDrawing" xmlns:wps="http://schemas.microsoft.com/office/word/2010/wordprocessingShape" xmlns:wpg="http://schemas.microsoft.com/office/word/2010/wordprocessingGroup" xmlns:mc="http://schemas.openxmlformats.org/markup-compatibility/2006" xmlns:wp14="http://schemas.microsoft.com/office/word/2010/wordprocessingDrawing" xmlns:w14="http://schemas.microsoft.com/office/word/2010/wordml" xmlns:w15="http://schemas.microsoft.com/office/word/2012/wordml" mc:Ignorable="w14 wp14 w15">
+<w:hdr xmlns:o="urn:schemas-microsoft-com:office:office" xmlns:r="http://schemas.openxmlformats.org/officeDocument/2006/relationships" xmlns:v="urn:schemas-microsoft-com:vml" xmlns:w="http://schemas.openxmlformats.org/wordprocessingml/2006/main" xmlns:w10="urn:schemas-microsoft-com:office:word" xmlns:wp="http://schemas.openxmlformats.org/drawingml/2006/wordprocessingDrawing" xmlns:pic="http://schemas.openxmlformats.org/drawingml/2006/picture" xmlns:wps="http://schemas.microsoft.com/office/word/2010/wordprocessingShape" xmlns:wpg="http://schemas.microsoft.com/office/word/2010/wordprocessingGroup" xmlns:mc="http://schemas.openxmlformats.org/markup-compatibility/2006" xmlns:wp14="http://schemas.microsoft.com/office/word/2010/wordprocessingDrawing" xmlns:w14="http://schemas.microsoft.com/office/word/2010/wordml" xmlns:w15="http://schemas.microsoft.com/office/word/2012/wordml" mc:Ignorable="w14 wp14 w15">
   <w:p>
     <w:pPr>
       <w:pStyle w:val="Header"/>
@@ -10393,26 +10439,18 @@
     <w:r>
       <w:rPr/>
       <w:drawing>
-        <wp:anchor behindDoc="0" distT="0" distB="0" distL="114300" distR="114300" simplePos="0" locked="0" layoutInCell="0" allowOverlap="1" relativeHeight="20">
+        <wp:anchor distT="0" distB="0" distL="0" distR="0" simplePos="0" relativeHeight="10" behindDoc="0" locked="0" layoutInCell="0" allowOverlap="1">
           <wp:simplePos x="0" y="0"/>
-          <wp:positionH relativeFrom="margin">
-            <wp:posOffset>3503930</wp:posOffset>
+          <wp:positionH relativeFrom="column">
+            <wp:align>center</wp:align>
           </wp:positionH>
           <wp:positionV relativeFrom="paragraph">
-            <wp:posOffset>-273050</wp:posOffset>
+            <wp:posOffset>-690880</wp:posOffset>
           </wp:positionV>
-          <wp:extent cx="2814955" cy="525780"/>
+          <wp:extent cx="4001770" cy="655955"/>
           <wp:effectExtent l="0" t="0" r="0" b="0"/>
-          <wp:wrapThrough wrapText="bothSides">
-            <wp:wrapPolygon edited="0">
-              <wp:start x="-15" y="0"/>
-              <wp:lineTo x="-15" y="21097"/>
-              <wp:lineTo x="21477" y="21097"/>
-              <wp:lineTo x="21477" y="0"/>
-              <wp:lineTo x="-15" y="0"/>
-            </wp:wrapPolygon>
-          </wp:wrapThrough>
-          <wp:docPr id="6" name="Image3 Copy 1" descr=""/>
+          <wp:wrapSquare wrapText="largest"/>
+          <wp:docPr id="6" name="Imagen6 Copia 1"/>
           <wp:cNvGraphicFramePr>
             <a:graphicFrameLocks xmlns:a="http://schemas.openxmlformats.org/drawingml/2006/main" noChangeAspect="1"/>
           </wp:cNvGraphicFramePr>
@@ -10420,7 +10458,7 @@
             <a:graphicData uri="http://schemas.openxmlformats.org/drawingml/2006/picture">
               <pic:pic xmlns:pic="http://schemas.openxmlformats.org/drawingml/2006/picture">
                 <pic:nvPicPr>
-                  <pic:cNvPr id="6" name="Image3 Copy 1" descr=""/>
+                  <pic:cNvPr id="6" name="Imagen6 Copia 1"/>
                   <pic:cNvPicPr>
                     <a:picLocks noChangeAspect="1" noChangeArrowheads="1"/>
                   </pic:cNvPicPr>
@@ -10434,11 +10472,12 @@
                 <pic:spPr bwMode="auto">
                   <a:xfrm>
                     <a:off x="0" y="0"/>
-                    <a:ext cx="2814955" cy="525780"/>
+                    <a:ext cx="4001770" cy="655955"/>
                   </a:xfrm>
                   <a:prstGeom prst="rect">
                     <a:avLst/>
                   </a:prstGeom>
+                  <a:noFill/>
                 </pic:spPr>
               </pic:pic>
             </a:graphicData>
@@ -10451,7 +10490,21 @@
 </file>
 
 <file path=word/header7.xml><?xml version="1.0" encoding="utf-8"?>
-<w:hdr xmlns:o="urn:schemas-microsoft-com:office:office" xmlns:r="http://schemas.openxmlformats.org/officeDocument/2006/relationships" xmlns:v="urn:schemas-microsoft-com:vml" xmlns:w="http://schemas.openxmlformats.org/wordprocessingml/2006/main" xmlns:w10="urn:schemas-microsoft-com:office:word" xmlns:wp="http://schemas.openxmlformats.org/drawingml/2006/wordprocessingDrawing" xmlns:wps="http://schemas.microsoft.com/office/word/2010/wordprocessingShape" xmlns:wpg="http://schemas.microsoft.com/office/word/2010/wordprocessingGroup" xmlns:mc="http://schemas.openxmlformats.org/markup-compatibility/2006" xmlns:wp14="http://schemas.microsoft.com/office/word/2010/wordprocessingDrawing" xmlns:w14="http://schemas.microsoft.com/office/word/2010/wordml" xmlns:w15="http://schemas.microsoft.com/office/word/2012/wordml" mc:Ignorable="w14 wp14 w15">
+<w:hdr xmlns:o="urn:schemas-microsoft-com:office:office" xmlns:r="http://schemas.openxmlformats.org/officeDocument/2006/relationships" xmlns:v="urn:schemas-microsoft-com:vml" xmlns:w="http://schemas.openxmlformats.org/wordprocessingml/2006/main" xmlns:w10="urn:schemas-microsoft-com:office:word" xmlns:wp="http://schemas.openxmlformats.org/drawingml/2006/wordprocessingDrawing" xmlns:pic="http://schemas.openxmlformats.org/drawingml/2006/picture" xmlns:wps="http://schemas.microsoft.com/office/word/2010/wordprocessingShape" xmlns:wpg="http://schemas.microsoft.com/office/word/2010/wordprocessingGroup" xmlns:mc="http://schemas.openxmlformats.org/markup-compatibility/2006" xmlns:wp14="http://schemas.microsoft.com/office/word/2010/wordprocessingDrawing" xmlns:w14="http://schemas.microsoft.com/office/word/2010/wordml" xmlns:w15="http://schemas.microsoft.com/office/word/2012/wordml" mc:Ignorable="w14 wp14 w15">
+  <w:p>
+    <w:pPr>
+      <w:pStyle w:val="Header"/>
+      <w:rPr/>
+    </w:pPr>
+    <w:r>
+      <w:rPr/>
+    </w:r>
+  </w:p>
+</w:hdr>
+</file>
+
+<file path=word/header8.xml><?xml version="1.0" encoding="utf-8"?>
+<w:hdr xmlns:o="urn:schemas-microsoft-com:office:office" xmlns:r="http://schemas.openxmlformats.org/officeDocument/2006/relationships" xmlns:v="urn:schemas-microsoft-com:vml" xmlns:w="http://schemas.openxmlformats.org/wordprocessingml/2006/main" xmlns:w10="urn:schemas-microsoft-com:office:word" xmlns:wp="http://schemas.openxmlformats.org/drawingml/2006/wordprocessingDrawing" xmlns:pic="http://schemas.openxmlformats.org/drawingml/2006/picture" xmlns:wps="http://schemas.microsoft.com/office/word/2010/wordprocessingShape" xmlns:wpg="http://schemas.microsoft.com/office/word/2010/wordprocessingGroup" xmlns:mc="http://schemas.openxmlformats.org/markup-compatibility/2006" xmlns:wp14="http://schemas.microsoft.com/office/word/2010/wordprocessingDrawing" xmlns:w14="http://schemas.microsoft.com/office/word/2010/wordml" xmlns:w15="http://schemas.microsoft.com/office/word/2012/wordml" mc:Ignorable="w14 wp14 w15">
   <w:p>
     <w:pPr>
       <w:pStyle w:val="Header"/>
@@ -10460,26 +10513,18 @@
     <w:r>
       <w:rPr/>
       <w:drawing>
-        <wp:anchor behindDoc="0" distT="0" distB="0" distL="114300" distR="114300" simplePos="0" locked="0" layoutInCell="0" allowOverlap="1" relativeHeight="14">
+        <wp:anchor distT="0" distB="0" distL="0" distR="0" simplePos="0" relativeHeight="20" behindDoc="0" locked="0" layoutInCell="0" allowOverlap="1">
           <wp:simplePos x="0" y="0"/>
           <wp:positionH relativeFrom="column">
-            <wp:posOffset>1654175</wp:posOffset>
+            <wp:align>center</wp:align>
           </wp:positionH>
           <wp:positionV relativeFrom="paragraph">
-            <wp:posOffset>-38735</wp:posOffset>
+            <wp:posOffset>-349250</wp:posOffset>
           </wp:positionV>
-          <wp:extent cx="2814955" cy="525780"/>
+          <wp:extent cx="4001770" cy="655955"/>
           <wp:effectExtent l="0" t="0" r="0" b="0"/>
-          <wp:wrapThrough wrapText="bothSides">
-            <wp:wrapPolygon edited="0">
-              <wp:start x="-27" y="0"/>
-              <wp:lineTo x="-27" y="21082"/>
-              <wp:lineTo x="21471" y="21082"/>
-              <wp:lineTo x="21471" y="0"/>
-              <wp:lineTo x="-27" y="0"/>
-            </wp:wrapPolygon>
-          </wp:wrapThrough>
-          <wp:docPr id="9" name="Imagen 4 Copy 1 Copy 1 Copy 1 Copy 2" descr=""/>
+          <wp:wrapSquare wrapText="largest"/>
+          <wp:docPr id="9" name="Imagen6 Copia 2"/>
           <wp:cNvGraphicFramePr>
             <a:graphicFrameLocks xmlns:a="http://schemas.openxmlformats.org/drawingml/2006/main" noChangeAspect="1"/>
           </wp:cNvGraphicFramePr>
@@ -10487,7 +10532,7 @@
             <a:graphicData uri="http://schemas.openxmlformats.org/drawingml/2006/picture">
               <pic:pic xmlns:pic="http://schemas.openxmlformats.org/drawingml/2006/picture">
                 <pic:nvPicPr>
-                  <pic:cNvPr id="9" name="Imagen 4 Copy 1 Copy 1 Copy 1 Copy 2" descr=""/>
+                  <pic:cNvPr id="9" name="Imagen6 Copia 2"/>
                   <pic:cNvPicPr>
                     <a:picLocks noChangeAspect="1" noChangeArrowheads="1"/>
                   </pic:cNvPicPr>
@@ -10501,11 +10546,12 @@
                 <pic:spPr bwMode="auto">
                   <a:xfrm>
                     <a:off x="0" y="0"/>
-                    <a:ext cx="2814955" cy="525780"/>
+                    <a:ext cx="4001770" cy="655955"/>
                   </a:xfrm>
                   <a:prstGeom prst="rect">
                     <a:avLst/>
                   </a:prstGeom>
+                  <a:noFill/>
                 </pic:spPr>
               </pic:pic>
             </a:graphicData>
@@ -10517,9 +10563,63 @@
 </w:hdr>
 </file>
 
-<file path=word/header8.xml><?xml version="1.0" encoding="utf-8"?>
-<w:hdr xmlns:o="urn:schemas-microsoft-com:office:office" xmlns:r="http://schemas.openxmlformats.org/officeDocument/2006/relationships" xmlns:v="urn:schemas-microsoft-com:vml" xmlns:w="http://schemas.openxmlformats.org/wordprocessingml/2006/main" xmlns:w10="urn:schemas-microsoft-com:office:word" xmlns:wp="http://schemas.openxmlformats.org/drawingml/2006/wordprocessingDrawing" xmlns:wps="http://schemas.microsoft.com/office/word/2010/wordprocessingShape" xmlns:wpg="http://schemas.microsoft.com/office/word/2010/wordprocessingGroup" xmlns:mc="http://schemas.openxmlformats.org/markup-compatibility/2006" xmlns:wp14="http://schemas.microsoft.com/office/word/2010/wordprocessingDrawing" xmlns:w14="http://schemas.microsoft.com/office/word/2010/wordml" xmlns:w15="http://schemas.microsoft.com/office/word/2012/wordml" mc:Ignorable="w14 wp14 w15">
-  <w:p/>
+<file path=word/header9.xml><?xml version="1.0" encoding="utf-8"?>
+<w:hdr xmlns:o="urn:schemas-microsoft-com:office:office" xmlns:r="http://schemas.openxmlformats.org/officeDocument/2006/relationships" xmlns:v="urn:schemas-microsoft-com:vml" xmlns:w="http://schemas.openxmlformats.org/wordprocessingml/2006/main" xmlns:w10="urn:schemas-microsoft-com:office:word" xmlns:wp="http://schemas.openxmlformats.org/drawingml/2006/wordprocessingDrawing" xmlns:pic="http://schemas.openxmlformats.org/drawingml/2006/picture" xmlns:wps="http://schemas.microsoft.com/office/word/2010/wordprocessingShape" xmlns:wpg="http://schemas.microsoft.com/office/word/2010/wordprocessingGroup" xmlns:mc="http://schemas.openxmlformats.org/markup-compatibility/2006" xmlns:wp14="http://schemas.microsoft.com/office/word/2010/wordprocessingDrawing" xmlns:w14="http://schemas.microsoft.com/office/word/2010/wordml" xmlns:w15="http://schemas.microsoft.com/office/word/2012/wordml" mc:Ignorable="w14 wp14 w15">
+  <w:p>
+    <w:pPr>
+      <w:pStyle w:val="Header"/>
+      <w:rPr/>
+    </w:pPr>
+    <w:r>
+      <w:rPr/>
+      <w:drawing>
+        <wp:anchor distT="0" distB="0" distL="0" distR="0" simplePos="0" relativeHeight="20" behindDoc="0" locked="0" layoutInCell="0" allowOverlap="1">
+          <wp:simplePos x="0" y="0"/>
+          <wp:positionH relativeFrom="column">
+            <wp:align>center</wp:align>
+          </wp:positionH>
+          <wp:positionV relativeFrom="paragraph">
+            <wp:posOffset>-349250</wp:posOffset>
+          </wp:positionV>
+          <wp:extent cx="4001770" cy="655955"/>
+          <wp:effectExtent l="0" t="0" r="0" b="0"/>
+          <wp:wrapSquare wrapText="largest"/>
+          <wp:docPr id="10" name="Imagen6 Copia 2"/>
+          <wp:cNvGraphicFramePr>
+            <a:graphicFrameLocks xmlns:a="http://schemas.openxmlformats.org/drawingml/2006/main" noChangeAspect="1"/>
+          </wp:cNvGraphicFramePr>
+          <a:graphic xmlns:a="http://schemas.openxmlformats.org/drawingml/2006/main">
+            <a:graphicData uri="http://schemas.openxmlformats.org/drawingml/2006/picture">
+              <pic:pic xmlns:pic="http://schemas.openxmlformats.org/drawingml/2006/picture">
+                <pic:nvPicPr>
+                  <pic:cNvPr id="10" name="Imagen6 Copia 2"/>
+                  <pic:cNvPicPr>
+                    <a:picLocks noChangeAspect="1" noChangeArrowheads="1"/>
+                  </pic:cNvPicPr>
+                </pic:nvPicPr>
+                <pic:blipFill>
+                  <a:blip r:embed="rId1"/>
+                  <a:stretch>
+                    <a:fillRect/>
+                  </a:stretch>
+                </pic:blipFill>
+                <pic:spPr bwMode="auto">
+                  <a:xfrm>
+                    <a:off x="0" y="0"/>
+                    <a:ext cx="4001770" cy="655955"/>
+                  </a:xfrm>
+                  <a:prstGeom prst="rect">
+                    <a:avLst/>
+                  </a:prstGeom>
+                  <a:noFill/>
+                </pic:spPr>
+              </pic:pic>
+            </a:graphicData>
+          </a:graphic>
+        </wp:anchor>
+      </w:drawing>
+    </w:r>
+  </w:p>
 </w:hdr>
 </file>
 
@@ -10528,8 +10628,8 @@
   <w:abstractNum w:abstractNumId="1">
     <w:lvl w:ilvl="0">
       <w:start w:val="1"/>
+      <w:numFmt w:val="decimal"/>
       <w:pStyle w:val="Heading1"/>
-      <w:numFmt w:val="decimal"/>
       <w:lvlText w:val="%1."/>
       <w:lvlJc w:val="left"/>
       <w:pPr>
@@ -10542,8 +10642,8 @@
     </w:lvl>
     <w:lvl w:ilvl="1">
       <w:start w:val="1"/>
+      <w:numFmt w:val="decimal"/>
       <w:pStyle w:val="Heading2"/>
-      <w:numFmt w:val="decimal"/>
       <w:lvlText w:val="%1.%2."/>
       <w:lvlJc w:val="left"/>
       <w:pPr>
@@ -10556,8 +10656,8 @@
     </w:lvl>
     <w:lvl w:ilvl="2">
       <w:start w:val="1"/>
+      <w:numFmt w:val="decimal"/>
       <w:pStyle w:val="Heading3"/>
-      <w:numFmt w:val="decimal"/>
       <w:lvlText w:val="%1.%2.%3."/>
       <w:lvlJc w:val="left"/>
       <w:pPr>
@@ -10570,8 +10670,8 @@
     </w:lvl>
     <w:lvl w:ilvl="3">
       <w:start w:val="1"/>
+      <w:numFmt w:val="decimal"/>
       <w:pStyle w:val="Heading4"/>
-      <w:numFmt w:val="decimal"/>
       <w:lvlText w:val="%1.%2.%3.%4."/>
       <w:lvlJc w:val="left"/>
       <w:pPr>
@@ -10584,8 +10684,8 @@
     </w:lvl>
     <w:lvl w:ilvl="4">
       <w:start w:val="1"/>
+      <w:numFmt w:val="decimal"/>
       <w:pStyle w:val="Heading5"/>
-      <w:numFmt w:val="decimal"/>
       <w:lvlText w:val="%1.%2.%3.%4.%5."/>
       <w:lvlJc w:val="left"/>
       <w:pPr>
@@ -10598,8 +10698,8 @@
     </w:lvl>
     <w:lvl w:ilvl="5">
       <w:start w:val="1"/>
+      <w:numFmt w:val="decimal"/>
       <w:pStyle w:val="Heading6"/>
-      <w:numFmt w:val="decimal"/>
       <w:lvlText w:val="%1.%2.%3.%4.%5.%6."/>
       <w:lvlJc w:val="left"/>
       <w:pPr>
@@ -10612,8 +10712,8 @@
     </w:lvl>
     <w:lvl w:ilvl="6">
       <w:start w:val="1"/>
+      <w:numFmt w:val="decimal"/>
       <w:pStyle w:val="Heading7"/>
-      <w:numFmt w:val="decimal"/>
       <w:lvlText w:val="%1.%2.%3.%4.%5.%6.%7."/>
       <w:lvlJc w:val="left"/>
       <w:pPr>
@@ -10626,8 +10726,8 @@
     </w:lvl>
     <w:lvl w:ilvl="7">
       <w:start w:val="1"/>
+      <w:numFmt w:val="decimal"/>
       <w:pStyle w:val="Heading8"/>
-      <w:numFmt w:val="decimal"/>
       <w:lvlText w:val="%1.%2.%3.%4.%5.%6.%7.%8."/>
       <w:lvlJc w:val="left"/>
       <w:pPr>
@@ -10640,8 +10740,8 @@
     </w:lvl>
     <w:lvl w:ilvl="8">
       <w:start w:val="1"/>
+      <w:numFmt w:val="decimal"/>
       <w:pStyle w:val="Heading9"/>
-      <w:numFmt w:val="decimal"/>
       <w:lvlText w:val="%1.%2.%3.%4.%5.%6.%7.%8.%9."/>
       <w:lvlJc w:val="left"/>
       <w:pPr>
@@ -14030,24 +14130,12 @@
     <w:abstractNumId w:val="26"/>
   </w:num>
   <w:num w:numId="27">
-    <w:abstractNumId w:val="2"/>
-  </w:num>
-  <w:num w:numId="28">
-    <w:abstractNumId w:val="2"/>
-  </w:num>
-  <w:num w:numId="29">
-    <w:abstractNumId w:val="2"/>
-  </w:num>
-  <w:num w:numId="30">
-    <w:abstractNumId w:val="2"/>
-  </w:num>
-  <w:num w:numId="31">
     <w:abstractNumId w:val="7"/>
     <w:lvlOverride w:ilvl="0">
       <w:startOverride w:val="1"/>
     </w:lvlOverride>
   </w:num>
-  <w:num w:numId="32">
+  <w:num w:numId="28">
     <w:abstractNumId w:val="7"/>
     <w:lvlOverride w:ilvl="0">
       <w:startOverride w:val="1"/>
@@ -14056,7 +14144,7 @@
       <w:startOverride w:val="1"/>
     </w:lvlOverride>
   </w:num>
-  <w:num w:numId="33">
+  <w:num w:numId="29">
     <w:abstractNumId w:val="7"/>
     <w:lvlOverride w:ilvl="0">
       <w:startOverride w:val="1"/>
@@ -14067,57 +14155,6 @@
     <w:lvlOverride w:ilvl="2">
       <w:startOverride w:val="1"/>
     </w:lvlOverride>
-  </w:num>
-  <w:num w:numId="34">
-    <w:abstractNumId w:val="7"/>
-  </w:num>
-  <w:num w:numId="35">
-    <w:abstractNumId w:val="7"/>
-  </w:num>
-  <w:num w:numId="36">
-    <w:abstractNumId w:val="7"/>
-  </w:num>
-  <w:num w:numId="37">
-    <w:abstractNumId w:val="2"/>
-  </w:num>
-  <w:num w:numId="38">
-    <w:abstractNumId w:val="2"/>
-  </w:num>
-  <w:num w:numId="39">
-    <w:abstractNumId w:val="2"/>
-  </w:num>
-  <w:num w:numId="40">
-    <w:abstractNumId w:val="2"/>
-  </w:num>
-  <w:num w:numId="41">
-    <w:abstractNumId w:val="2"/>
-  </w:num>
-  <w:num w:numId="42">
-    <w:abstractNumId w:val="2"/>
-  </w:num>
-  <w:num w:numId="43">
-    <w:abstractNumId w:val="2"/>
-  </w:num>
-  <w:num w:numId="44">
-    <w:abstractNumId w:val="2"/>
-  </w:num>
-  <w:num w:numId="45">
-    <w:abstractNumId w:val="2"/>
-  </w:num>
-  <w:num w:numId="46">
-    <w:abstractNumId w:val="2"/>
-  </w:num>
-  <w:num w:numId="47">
-    <w:abstractNumId w:val="2"/>
-  </w:num>
-  <w:num w:numId="48">
-    <w:abstractNumId w:val="2"/>
-  </w:num>
-  <w:num w:numId="49">
-    <w:abstractNumId w:val="2"/>
-  </w:num>
-  <w:num w:numId="50">
-    <w:abstractNumId w:val="2"/>
   </w:num>
 </w:numbering>
 </file>
@@ -14299,7 +14336,7 @@
     </w:rPr>
   </w:style>
   <w:style w:type="paragraph" w:styleId="Heading1">
-    <w:name w:val="Heading 1"/>
+    <w:name w:val="heading 1"/>
     <w:basedOn w:val="Normal"/>
     <w:next w:val="BodyText"/>
     <w:uiPriority w:val="9"/>
@@ -14326,7 +14363,7 @@
     </w:rPr>
   </w:style>
   <w:style w:type="paragraph" w:styleId="Heading2">
-    <w:name w:val="Heading 2"/>
+    <w:name w:val="heading 2"/>
     <w:basedOn w:val="Normal"/>
     <w:next w:val="BodyText"/>
     <w:uiPriority w:val="9"/>
@@ -14354,7 +14391,7 @@
     </w:rPr>
   </w:style>
   <w:style w:type="paragraph" w:styleId="Heading3">
-    <w:name w:val="Heading 3"/>
+    <w:name w:val="heading 3"/>
     <w:basedOn w:val="Normal"/>
     <w:next w:val="BodyText"/>
     <w:uiPriority w:val="9"/>
@@ -14382,7 +14419,7 @@
     </w:rPr>
   </w:style>
   <w:style w:type="paragraph" w:styleId="Heading4">
-    <w:name w:val="Heading 4"/>
+    <w:name w:val="heading 4"/>
     <w:basedOn w:val="Normal"/>
     <w:next w:val="BodyText"/>
     <w:uiPriority w:val="9"/>
@@ -14407,7 +14444,7 @@
     </w:rPr>
   </w:style>
   <w:style w:type="paragraph" w:styleId="Heading5">
-    <w:name w:val="Heading 5"/>
+    <w:name w:val="heading 5"/>
     <w:basedOn w:val="Normal"/>
     <w:next w:val="BodyText"/>
     <w:uiPriority w:val="9"/>
@@ -14432,7 +14469,7 @@
     </w:rPr>
   </w:style>
   <w:style w:type="paragraph" w:styleId="Heading6">
-    <w:name w:val="Heading 6"/>
+    <w:name w:val="heading 6"/>
     <w:basedOn w:val="Normal"/>
     <w:next w:val="BodyText"/>
     <w:uiPriority w:val="9"/>
@@ -14455,7 +14492,7 @@
     </w:rPr>
   </w:style>
   <w:style w:type="paragraph" w:styleId="Heading7">
-    <w:name w:val="Heading 7"/>
+    <w:name w:val="heading 7"/>
     <w:basedOn w:val="Normal"/>
     <w:next w:val="BodyText"/>
     <w:uiPriority w:val="9"/>
@@ -14478,7 +14515,7 @@
     </w:rPr>
   </w:style>
   <w:style w:type="paragraph" w:styleId="Heading8">
-    <w:name w:val="Heading 8"/>
+    <w:name w:val="heading 8"/>
     <w:basedOn w:val="Normal"/>
     <w:next w:val="BodyText"/>
     <w:uiPriority w:val="9"/>
@@ -14501,7 +14538,7 @@
     </w:rPr>
   </w:style>
   <w:style w:type="paragraph" w:styleId="Heading9">
-    <w:name w:val="Heading 9"/>
+    <w:name w:val="heading 9"/>
     <w:basedOn w:val="Normal"/>
     <w:next w:val="BodyText"/>
     <w:uiPriority w:val="9"/>
@@ -14534,7 +14571,6 @@
   <w:style w:type="character" w:styleId="EpgrafeCar" w:customStyle="1">
     <w:name w:val="Epígrafe Car"/>
     <w:basedOn w:val="DefaultParagraphFont"/>
-    <w:link w:val="Caption"/>
     <w:qFormat/>
     <w:rPr/>
   </w:style>
@@ -14550,8 +14586,8 @@
       <w:shd w:fill="F8F8F8" w:val="clear"/>
     </w:rPr>
   </w:style>
-  <w:style w:type="character" w:styleId="Caracteresdenotaalpie" w:customStyle="1">
-    <w:name w:val="Caracteres de nota al pie"/>
+  <w:style w:type="character" w:styleId="Caracteresdenotaalpieuser" w:customStyle="1">
+    <w:name w:val="Caracteres de nota al pie (user)"/>
     <w:qFormat/>
     <w:rPr>
       <w:vertAlign w:val="superscript"/>
@@ -14564,8 +14600,15 @@
       <w:vertAlign w:val="superscript"/>
     </w:rPr>
   </w:style>
+  <w:style w:type="character" w:styleId="Caracteresdenotaalpie">
+    <w:name w:val="Caracteres de nota al pie"/>
+    <w:qFormat/>
+    <w:rPr>
+      <w:vertAlign w:val="superscript"/>
+    </w:rPr>
+  </w:style>
   <w:style w:type="character" w:styleId="FootnoteReference">
-    <w:name w:val="Footnote Reference"/>
+    <w:name w:val="footnote reference"/>
     <w:rPr>
       <w:vertAlign w:val="superscript"/>
     </w:rPr>
@@ -14592,7 +14635,6 @@
   <w:style w:type="character" w:styleId="PiedepginaCar" w:customStyle="1">
     <w:name w:val="Pie de página Car"/>
     <w:basedOn w:val="DefaultParagraphFont"/>
-    <w:link w:val="Footer"/>
     <w:qFormat/>
     <w:rsid w:val="00845848"/>
     <w:rPr>
@@ -14601,7 +14643,7 @@
     </w:rPr>
   </w:style>
   <w:style w:type="character" w:styleId="PageNumber">
-    <w:name w:val="Page Number"/>
+    <w:name w:val="page number"/>
     <w:basedOn w:val="DefaultParagraphFont"/>
     <w:semiHidden/>
     <w:unhideWhenUsed/>
@@ -14615,7 +14657,6 @@
   <w:style w:type="character" w:styleId="EncabezadoCar" w:customStyle="1">
     <w:name w:val="Encabezado Car"/>
     <w:basedOn w:val="DefaultParagraphFont"/>
-    <w:link w:val="Header"/>
     <w:qFormat/>
     <w:rsid w:val="003f65b2"/>
     <w:rPr/>
@@ -15120,7 +15161,7 @@
   <w:style w:type="character" w:styleId="TextomacroCar" w:customStyle="1">
     <w:name w:val="Texto macro Car"/>
     <w:basedOn w:val="DefaultParagraphFont"/>
-    <w:link w:val="macro"/>
+    <w:link w:val="MacroText"/>
     <w:semiHidden/>
     <w:qFormat/>
     <w:rsid w:val="00c976b0"/>
@@ -15153,18 +15194,18 @@
       <w:color w:val="808080"/>
     </w:rPr>
   </w:style>
-  <w:style w:type="character" w:styleId="Enlacedelndice" w:customStyle="1">
+  <w:style w:type="character" w:styleId="Enlacedelndiceuser" w:customStyle="1">
+    <w:name w:val="Enlace del índice (user)"/>
+    <w:qFormat/>
+    <w:rPr/>
+  </w:style>
+  <w:style w:type="character" w:styleId="Enlacedelndice">
     <w:name w:val="Enlace del índice"/>
     <w:qFormat/>
     <w:rPr/>
   </w:style>
-  <w:style w:type="character" w:styleId="IndexLink">
-    <w:name w:val="Index Link"/>
-    <w:qFormat/>
-    <w:rPr/>
-  </w:style>
-  <w:style w:type="paragraph" w:styleId="Heading">
-    <w:name w:val="Heading"/>
+  <w:style w:type="paragraph" w:styleId="Ttulo">
+    <w:name w:val="Título"/>
     <w:basedOn w:val="Normal"/>
     <w:next w:val="BodyText"/>
     <w:qFormat/>
@@ -15198,7 +15239,7 @@
     </w:rPr>
   </w:style>
   <w:style w:type="paragraph" w:styleId="Caption">
-    <w:name w:val="Caption"/>
+    <w:name w:val="caption"/>
     <w:basedOn w:val="Normal"/>
     <w:link w:val="EpgrafeCar"/>
     <w:qFormat/>
@@ -15209,8 +15250,8 @@
       <w:i/>
     </w:rPr>
   </w:style>
-  <w:style w:type="paragraph" w:styleId="Index">
-    <w:name w:val="Index"/>
+  <w:style w:type="paragraph" w:styleId="ndice">
+    <w:name w:val="Índice"/>
     <w:basedOn w:val="Normal"/>
     <w:qFormat/>
     <w:pPr>
@@ -15243,8 +15284,8 @@
       <w:szCs w:val="36"/>
     </w:rPr>
   </w:style>
-  <w:style w:type="paragraph" w:styleId="ndice" w:customStyle="1">
-    <w:name w:val="Índice"/>
+  <w:style w:type="paragraph" w:styleId="ndiceuser" w:customStyle="1">
+    <w:name w:val="Índice (user)"/>
     <w:basedOn w:val="Normal"/>
     <w:qFormat/>
     <w:pPr>
@@ -15383,7 +15424,7 @@
     </w:rPr>
   </w:style>
   <w:style w:type="paragraph" w:styleId="FootnoteText">
-    <w:name w:val="Footnote Text"/>
+    <w:name w:val="footnote text"/>
     <w:basedOn w:val="Normal"/>
     <w:uiPriority w:val="9"/>
     <w:unhideWhenUsed/>
@@ -15439,8 +15480,8 @@
       <w:sz w:val="20"/>
     </w:rPr>
   </w:style>
-  <w:style w:type="paragraph" w:styleId="Figura" w:customStyle="1">
-    <w:name w:val="Figura"/>
+  <w:style w:type="paragraph" w:styleId="Figurauser" w:customStyle="1">
+    <w:name w:val="Figura (user)"/>
     <w:basedOn w:val="Normal"/>
     <w:qFormat/>
     <w:rsid w:val="009b2d46"/>
@@ -15454,13 +15495,13 @@
   </w:style>
   <w:style w:type="paragraph" w:styleId="CaptionedFigure" w:customStyle="1">
     <w:name w:val="Captioned Figure"/>
-    <w:basedOn w:val="Figura"/>
+    <w:basedOn w:val="Figurauser"/>
     <w:qFormat/>
     <w:pPr/>
     <w:rPr/>
   </w:style>
   <w:style w:type="paragraph" w:styleId="IndexHeading">
-    <w:name w:val="Index Heading"/>
+    <w:name w:val="index heading"/>
     <w:basedOn w:val="Title"/>
     <w:pPr/>
     <w:rPr/>
@@ -15500,22 +15541,22 @@
     </w:pPr>
     <w:rPr/>
   </w:style>
-  <w:style w:type="paragraph" w:styleId="Cabeceraypie" w:customStyle="1">
+  <w:style w:type="paragraph" w:styleId="Cabeceraypieuser" w:customStyle="1">
+    <w:name w:val="Cabecera y pie (user)"/>
+    <w:basedOn w:val="Normal"/>
+    <w:qFormat/>
+    <w:pPr/>
+    <w:rPr/>
+  </w:style>
+  <w:style w:type="paragraph" w:styleId="Cabeceraypie">
     <w:name w:val="Cabecera y pie"/>
     <w:basedOn w:val="Normal"/>
     <w:qFormat/>
     <w:pPr/>
     <w:rPr/>
   </w:style>
-  <w:style w:type="paragraph" w:styleId="HeaderandFooter">
-    <w:name w:val="Header and Footer"/>
-    <w:basedOn w:val="Normal"/>
-    <w:qFormat/>
-    <w:pPr/>
-    <w:rPr/>
-  </w:style>
   <w:style w:type="paragraph" w:styleId="Footer">
-    <w:name w:val="Footer"/>
+    <w:name w:val="footer"/>
     <w:basedOn w:val="Normal"/>
     <w:link w:val="PiedepginaCar"/>
     <w:unhideWhenUsed/>
@@ -15534,7 +15575,7 @@
     </w:rPr>
   </w:style>
   <w:style w:type="paragraph" w:styleId="Header">
-    <w:name w:val="Header"/>
+    <w:name w:val="header"/>
     <w:basedOn w:val="Normal"/>
     <w:link w:val="EncabezadoCar"/>
     <w:unhideWhenUsed/>
@@ -15564,7 +15605,7 @@
     </w:rPr>
   </w:style>
   <w:style w:type="paragraph" w:styleId="TOC2">
-    <w:name w:val="TOC 2"/>
+    <w:name w:val="toc 2"/>
     <w:basedOn w:val="Normal"/>
     <w:next w:val="Normal"/>
     <w:autoRedefine/>
@@ -15578,7 +15619,7 @@
     <w:rPr/>
   </w:style>
   <w:style w:type="paragraph" w:styleId="TOC3">
-    <w:name w:val="TOC 3"/>
+    <w:name w:val="toc 3"/>
     <w:basedOn w:val="Normal"/>
     <w:next w:val="Normal"/>
     <w:autoRedefine/>
@@ -15597,7 +15638,7 @@
     <w:rPr/>
   </w:style>
   <w:style w:type="paragraph" w:styleId="TOC1">
-    <w:name w:val="TOC 1"/>
+    <w:name w:val="toc 1"/>
     <w:basedOn w:val="Normal"/>
     <w:next w:val="Normal"/>
     <w:autoRedefine/>
@@ -15610,7 +15651,7 @@
     <w:rPr/>
   </w:style>
   <w:style w:type="paragraph" w:styleId="TableofFigures">
-    <w:name w:val="Table of Figures"/>
+    <w:name w:val="table of figures"/>
     <w:basedOn w:val="Normal"/>
     <w:next w:val="Normal"/>
     <w:uiPriority w:val="99"/>
@@ -15687,7 +15728,7 @@
       <w:szCs w:val="18"/>
     </w:rPr>
   </w:style>
-  <w:style w:type="paragraph" w:styleId="macro">
+  <w:style w:type="paragraph" w:styleId="MacroText">
     <w:name w:val="macro"/>
     <w:link w:val="TextomacroCar"/>
     <w:semiHidden/>
@@ -15740,43 +15781,43 @@
     </w:rPr>
   </w:style>
   <w:style w:type="paragraph" w:styleId="TOC4">
-    <w:name w:val="TOC 4"/>
-    <w:basedOn w:val="Index"/>
+    <w:name w:val="toc 4"/>
+    <w:basedOn w:val="ndice"/>
     <w:pPr/>
     <w:rPr/>
   </w:style>
   <w:style w:type="paragraph" w:styleId="TOC5">
-    <w:name w:val="TOC 5"/>
-    <w:basedOn w:val="Index"/>
+    <w:name w:val="toc 5"/>
+    <w:basedOn w:val="ndice"/>
     <w:pPr/>
     <w:rPr/>
   </w:style>
   <w:style w:type="paragraph" w:styleId="TOC6">
-    <w:name w:val="TOC 6"/>
-    <w:basedOn w:val="Index"/>
+    <w:name w:val="toc 6"/>
+    <w:basedOn w:val="ndice"/>
     <w:pPr/>
     <w:rPr/>
   </w:style>
   <w:style w:type="paragraph" w:styleId="TOC7">
-    <w:name w:val="TOC 7"/>
-    <w:basedOn w:val="Index"/>
+    <w:name w:val="toc 7"/>
+    <w:basedOn w:val="ndice"/>
     <w:pPr/>
     <w:rPr/>
   </w:style>
   <w:style w:type="paragraph" w:styleId="TOC8">
-    <w:name w:val="TOC 8"/>
-    <w:basedOn w:val="Index"/>
+    <w:name w:val="toc 8"/>
+    <w:basedOn w:val="ndice"/>
     <w:pPr/>
     <w:rPr/>
   </w:style>
   <w:style w:type="paragraph" w:styleId="TOC9">
-    <w:name w:val="TOC 9"/>
-    <w:basedOn w:val="Index"/>
+    <w:name w:val="toc 9"/>
+    <w:basedOn w:val="ndice"/>
     <w:pPr/>
     <w:rPr/>
   </w:style>
-  <w:style w:type="numbering" w:styleId="NoList" w:default="1">
-    <w:name w:val="No List"/>
+  <w:style w:type="numbering" w:styleId="Ningunalista" w:default="1">
+    <w:name w:val="Ninguna lista"/>
     <w:uiPriority w:val="99"/>
     <w:semiHidden/>
     <w:unhideWhenUsed/>
@@ -15867,34 +15908,34 @@
         <a:srgbClr val="000000"/>
       </a:dk1>
       <a:lt1>
-        <a:srgbClr val="ffffff"/>
+        <a:srgbClr val="FFFFFF"/>
       </a:lt1>
       <a:dk2>
-        <a:srgbClr val="1f497d"/>
+        <a:srgbClr val="1F497D"/>
       </a:dk2>
       <a:lt2>
-        <a:srgbClr val="eeece1"/>
+        <a:srgbClr val="EEECE1"/>
       </a:lt2>
       <a:accent1>
-        <a:srgbClr val="4f81bd"/>
+        <a:srgbClr val="4F81BD"/>
       </a:accent1>
       <a:accent2>
-        <a:srgbClr val="c0504d"/>
+        <a:srgbClr val="C0504D"/>
       </a:accent2>
       <a:accent3>
-        <a:srgbClr val="9bbb59"/>
+        <a:srgbClr val="9BBB59"/>
       </a:accent3>
       <a:accent4>
-        <a:srgbClr val="8064a2"/>
+        <a:srgbClr val="8064A2"/>
       </a:accent4>
       <a:accent5>
-        <a:srgbClr val="4bacc6"/>
+        <a:srgbClr val="4BACC6"/>
       </a:accent5>
       <a:accent6>
-        <a:srgbClr val="f79646"/>
+        <a:srgbClr val="F79646"/>
       </a:accent6>
       <a:hlink>
-        <a:srgbClr val="0000ff"/>
+        <a:srgbClr val="0000FF"/>
       </a:hlink>
       <a:folHlink>
         <a:srgbClr val="800080"/>

</xml_diff>